<commit_message>
added section for design principles
</commit_message>
<xml_diff>
--- a/OpenCDC-UserStories.docx
+++ b/OpenCDC-UserStories.docx
@@ -61,7 +61,40 @@
           <w:iCs/>
           <w:color w:val="595959"/>
         </w:rPr>
-        <w:t>Fourth Draft · May 3, 2026</w:t>
+        <w:t>Fifth</w:t>
+      </w:r>
+      <w:r>
+        <w:rPr>
+          <w:i/>
+          <w:iCs/>
+          <w:color w:val="595959"/>
+        </w:rPr>
+        <w:t xml:space="preserve"> Draft · </w:t>
+      </w:r>
+      <w:r>
+        <w:rPr>
+          <w:i/>
+          <w:iCs/>
+          <w:color w:val="595959"/>
+        </w:rPr>
+        <w:t>June 4</w:t>
+      </w:r>
+      <w:r>
+        <w:rPr>
+          <w:i/>
+          <w:iCs/>
+          <w:color w:val="595959"/>
+          <w:vertAlign w:val="superscript"/>
+        </w:rPr>
+        <w:t>th</w:t>
+      </w:r>
+      <w:r>
+        <w:rPr>
+          <w:i/>
+          <w:iCs/>
+          <w:color w:val="595959"/>
+        </w:rPr>
+        <w:t>, 2026</w:t>
       </w:r>
     </w:p>
     <w:p>
@@ -88,7 +121,81 @@
           <w:iCs/>
           <w:color w:val="333333"/>
         </w:rPr>
-        <w:t xml:space="preserve"> is a proposed standard for the structure and semantics of database change events. Any compliant producer — CDC tool or database — can interoperate with any compliant consumer — tool, pipeline, or application — without custom translation, regardless of transport.</w:t>
+        <w:t xml:space="preserve"> is a proposed standard for the structure and semantics of database change events. Any compliant producer — CDC tool or database — can interoperate with any compliant consumer — </w:t>
+      </w:r>
+      <w:r>
+        <w:rPr>
+          <w:i/>
+          <w:iCs/>
+          <w:color w:val="333333"/>
+        </w:rPr>
+        <w:t xml:space="preserve">CDC </w:t>
+      </w:r>
+      <w:r>
+        <w:rPr>
+          <w:i/>
+          <w:iCs/>
+          <w:color w:val="333333"/>
+        </w:rPr>
+        <w:t xml:space="preserve">tool, pipeline, </w:t>
+      </w:r>
+      <w:proofErr w:type="spellStart"/>
+      <w:r>
+        <w:rPr>
+          <w:i/>
+          <w:iCs/>
+          <w:color w:val="333333"/>
+        </w:rPr>
+        <w:t>lakehouse</w:t>
+      </w:r>
+      <w:proofErr w:type="spellEnd"/>
+      <w:r>
+        <w:rPr>
+          <w:i/>
+          <w:iCs/>
+          <w:color w:val="333333"/>
+        </w:rPr>
+        <w:t xml:space="preserve"> </w:t>
+      </w:r>
+      <w:r>
+        <w:rPr>
+          <w:i/>
+          <w:iCs/>
+          <w:color w:val="333333"/>
+        </w:rPr>
+        <w:t xml:space="preserve">or </w:t>
+      </w:r>
+      <w:r>
+        <w:rPr>
+          <w:i/>
+          <w:iCs/>
+          <w:color w:val="333333"/>
+        </w:rPr>
+        <w:t xml:space="preserve">AI </w:t>
+      </w:r>
+      <w:r>
+        <w:rPr>
+          <w:i/>
+          <w:iCs/>
+          <w:color w:val="333333"/>
+        </w:rPr>
+        <w:t>application — without custom translation</w:t>
+      </w:r>
+      <w:r>
+        <w:rPr>
+          <w:i/>
+          <w:iCs/>
+          <w:color w:val="333333"/>
+        </w:rPr>
+        <w:t>s or complex processing</w:t>
+      </w:r>
+      <w:r>
+        <w:rPr>
+          <w:i/>
+          <w:iCs/>
+          <w:color w:val="333333"/>
+        </w:rPr>
+        <w:t>.</w:t>
       </w:r>
     </w:p>
     <w:p>
@@ -282,14 +389,7 @@
                 <w:sz w:val="20"/>
                 <w:szCs w:val="20"/>
               </w:rPr>
-              <w:t>Interoperability of mixed-vendor CDC tools</w:t>
-            </w:r>
-            <w:r>
-              <w:rPr>
-                <w:sz w:val="20"/>
-                <w:szCs w:val="20"/>
-              </w:rPr>
-              <w:t>, same DB type</w:t>
+              <w:t>Interoperability of mixed-vendor CDC tools, same DB type</w:t>
             </w:r>
           </w:p>
         </w:tc>
@@ -391,14 +491,7 @@
                 <w:sz w:val="20"/>
                 <w:szCs w:val="20"/>
               </w:rPr>
-              <w:t>Interoperability of mixed-vendor CDC tools</w:t>
-            </w:r>
-            <w:r>
-              <w:rPr>
-                <w:sz w:val="20"/>
-                <w:szCs w:val="20"/>
-              </w:rPr>
-              <w:t>, different DBs</w:t>
+              <w:t>Interoperability of mixed-vendor CDC tools, different DBs</w:t>
             </w:r>
           </w:p>
         </w:tc>
@@ -613,35 +706,7 @@
                 <w:sz w:val="20"/>
                 <w:szCs w:val="20"/>
               </w:rPr>
-              <w:t xml:space="preserve">AI agent </w:t>
-            </w:r>
-            <w:r>
-              <w:rPr>
-                <w:sz w:val="20"/>
-                <w:szCs w:val="20"/>
-              </w:rPr>
-              <w:t>(</w:t>
-            </w:r>
-            <w:r>
-              <w:rPr>
-                <w:sz w:val="20"/>
-                <w:szCs w:val="20"/>
-              </w:rPr>
-              <w:t>reactive</w:t>
-            </w:r>
-            <w:r>
-              <w:rPr>
-                <w:sz w:val="20"/>
-                <w:szCs w:val="20"/>
-              </w:rPr>
-              <w:t>) listens to</w:t>
-            </w:r>
-            <w:r>
-              <w:rPr>
-                <w:sz w:val="20"/>
-                <w:szCs w:val="20"/>
-              </w:rPr>
-              <w:t xml:space="preserve"> CDC event stream</w:t>
+              <w:t>AI agent (reactive) listens to CDC event stream</w:t>
             </w:r>
           </w:p>
         </w:tc>
@@ -908,41 +973,103 @@
         <w:t xml:space="preserve"> represent conceptually important use cases for mid- and long-term consideration.</w:t>
       </w:r>
       <w:r>
-        <w:t xml:space="preserve"> Non-goals: we explicitly intend for this specification to remain focused on payload, not the transport. Therefore, all mentions of databases, CDC tools and transports in this document are intended as examples only.</w:t>
-      </w:r>
-      <w:r>
-        <w:br/>
+        <w:t xml:space="preserve"> </w:t>
       </w:r>
     </w:p>
     <w:p>
       <w:pPr>
         <w:spacing w:after="160"/>
+      </w:pPr>
+      <w:r>
         <w:rPr>
           <w:b/>
           <w:bCs/>
         </w:rPr>
-      </w:pPr>
+        <w:t xml:space="preserve">Design Goals and </w:t>
+      </w:r>
       <w:r>
         <w:rPr>
           <w:b/>
           <w:bCs/>
         </w:rPr>
-        <w:t xml:space="preserve">Why now, for </w:t>
-      </w:r>
-      <w:proofErr w:type="spellStart"/>
-      <w:r>
+        <w:t>Non-goals:</w:t>
+      </w:r>
+      <w:r>
+        <w:t xml:space="preserve"> </w:t>
+      </w:r>
+      <w:proofErr w:type="spellStart"/>
+      <w:r>
+        <w:t>OpenCDC</w:t>
+      </w:r>
+      <w:proofErr w:type="spellEnd"/>
+      <w:r>
+        <w:t xml:space="preserve"> </w:t>
+      </w:r>
+      <w:r>
+        <w:t>is</w:t>
+      </w:r>
+      <w:r>
+        <w:t xml:space="preserve"> focused on payload</w:t>
+      </w:r>
+      <w:r>
+        <w:t xml:space="preserve"> structure and semantics</w:t>
+      </w:r>
+      <w:r>
+        <w:t>, not the transport</w:t>
+      </w:r>
+      <w:r>
+        <w:t xml:space="preserve">, </w:t>
+      </w:r>
+      <w:proofErr w:type="gramStart"/>
+      <w:r>
+        <w:t>serialization</w:t>
+      </w:r>
+      <w:proofErr w:type="gramEnd"/>
+      <w:r>
+        <w:t xml:space="preserve"> or infrastructure details</w:t>
+      </w:r>
+      <w:r>
+        <w:t>. Therefore, all mentions of databases, CDC tools</w:t>
+      </w:r>
+      <w:r>
+        <w:t xml:space="preserve">, file formats </w:t>
+      </w:r>
+      <w:r>
+        <w:t>and transports in this document are intended as examples only.</w:t>
+      </w:r>
+      <w:r>
+        <w:br/>
+      </w:r>
+    </w:p>
+    <w:p>
+      <w:pPr>
+        <w:spacing w:after="160"/>
         <w:rPr>
           <w:b/>
           <w:bCs/>
         </w:rPr>
-        <w:t>OpenCDC</w:t>
-      </w:r>
-      <w:proofErr w:type="spellEnd"/>
+      </w:pPr>
       <w:r>
         <w:rPr>
           <w:b/>
           <w:bCs/>
         </w:rPr>
+        <w:t xml:space="preserve">Why now, for </w:t>
+      </w:r>
+      <w:proofErr w:type="spellStart"/>
+      <w:r>
+        <w:rPr>
+          <w:b/>
+          <w:bCs/>
+        </w:rPr>
+        <w:t>OpenCDC</w:t>
+      </w:r>
+      <w:proofErr w:type="spellEnd"/>
+      <w:r>
+        <w:rPr>
+          <w:b/>
+          <w:bCs/>
+        </w:rPr>
         <w:t>?</w:t>
       </w:r>
     </w:p>
@@ -956,7 +1083,39 @@
     </w:p>
     <w:p>
       <w:r>
-        <w:t xml:space="preserve">CDC tools solved how to detect and capture change. </w:t>
+        <w:t xml:space="preserve">Databases and </w:t>
+      </w:r>
+      <w:r>
+        <w:t xml:space="preserve">CDC tools </w:t>
+      </w:r>
+      <w:r>
+        <w:t xml:space="preserve">have already </w:t>
+      </w:r>
+      <w:r>
+        <w:t xml:space="preserve">solved how to </w:t>
+      </w:r>
+      <w:r>
+        <w:t xml:space="preserve">log, </w:t>
+      </w:r>
+      <w:proofErr w:type="gramStart"/>
+      <w:r>
+        <w:t>detect</w:t>
+      </w:r>
+      <w:proofErr w:type="gramEnd"/>
+      <w:r>
+        <w:t xml:space="preserve"> and capture</w:t>
+      </w:r>
+      <w:r>
+        <w:t xml:space="preserve"> transaction</w:t>
+      </w:r>
+      <w:r>
+        <w:t xml:space="preserve"> change</w:t>
+      </w:r>
+      <w:r>
+        <w:t>s</w:t>
+      </w:r>
+      <w:r>
+        <w:t xml:space="preserve">. </w:t>
       </w:r>
       <w:proofErr w:type="spellStart"/>
       <w:r>
@@ -964,8 +1123,672 @@
       </w:r>
       <w:proofErr w:type="spellEnd"/>
       <w:r>
-        <w:t xml:space="preserve"> standardizes the remaining layer: the structure and semantics of the change event itself, enabling any producer to interoperate with any consumer regardless of vendor, database, or transport.</w:t>
-      </w:r>
+        <w:t xml:space="preserve"> standardizes the remaining layer: the structure and semantics of the change event itself, enabling any producer to interoperate with any consumer regardless of vendor, database, </w:t>
+      </w:r>
+      <w:r>
+        <w:t xml:space="preserve">CDC tool </w:t>
+      </w:r>
+      <w:r>
+        <w:t>or transport.</w:t>
+      </w:r>
+    </w:p>
+    <w:p/>
+    <w:p>
+      <w:pPr>
+        <w:pStyle w:val="Heading1"/>
+      </w:pPr>
+      <w:proofErr w:type="spellStart"/>
+      <w:r>
+        <w:lastRenderedPageBreak/>
+        <w:t>OpenCDC</w:t>
+      </w:r>
+      <w:proofErr w:type="spellEnd"/>
+      <w:r>
+        <w:t xml:space="preserve"> </w:t>
+      </w:r>
+      <w:r>
+        <w:t>Design Goal</w:t>
+      </w:r>
+      <w:r>
+        <w:t>s</w:t>
+      </w:r>
+      <w:r>
+        <w:t>:</w:t>
+      </w:r>
+    </w:p>
+    <w:p>
+      <w:pPr>
+        <w:pStyle w:val="Heading2"/>
+      </w:pPr>
+      <w:r>
+        <w:t xml:space="preserve">A: </w:t>
+      </w:r>
+      <w:r>
+        <w:t>Serialization, Transport, and Infrastructure Independence</w:t>
+      </w:r>
+    </w:p>
+    <w:p>
+      <w:r>
+        <w:t>The central</w:t>
+      </w:r>
+      <w:r>
+        <w:t xml:space="preserve"> guiding idea behind </w:t>
+      </w:r>
+      <w:proofErr w:type="spellStart"/>
+      <w:r>
+        <w:t>OpenCDC</w:t>
+      </w:r>
+      <w:proofErr w:type="spellEnd"/>
+      <w:r>
+        <w:t xml:space="preserve"> is that a change event should be meaningful on its own — readable and trustworthy without depending on the tools, formats, or plumbing that happen to carry it. </w:t>
+      </w:r>
+      <w:r>
+        <w:t>Logical c</w:t>
+      </w:r>
+      <w:r>
+        <w:t>hange events should be able to stand independently from their file serialization, transport protocols and infrastructure systems/tooling that process them</w:t>
+      </w:r>
+      <w:r>
+        <w:t>.</w:t>
+      </w:r>
+      <w:r>
+        <w:br/>
+      </w:r>
+    </w:p>
+    <w:p>
+      <w:pPr>
+        <w:pStyle w:val="ListParagraph"/>
+        <w:numPr>
+          <w:ilvl w:val="0"/>
+          <w:numId w:val="5"/>
+        </w:numPr>
+      </w:pPr>
+      <w:r>
+        <w:rPr>
+          <w:b/>
+          <w:bCs/>
+        </w:rPr>
+        <w:t>Serialization independence</w:t>
+      </w:r>
+      <w:r>
+        <w:t xml:space="preserve"> — </w:t>
+      </w:r>
+      <w:proofErr w:type="spellStart"/>
+      <w:r>
+        <w:t>OpenCDC</w:t>
+      </w:r>
+      <w:proofErr w:type="spellEnd"/>
+      <w:r>
+        <w:t xml:space="preserve"> describes the </w:t>
+      </w:r>
+      <w:r>
+        <w:t>transactions</w:t>
+      </w:r>
+      <w:r>
+        <w:t xml:space="preserve">, </w:t>
+      </w:r>
+      <w:r>
+        <w:t>without a mandate</w:t>
+      </w:r>
+      <w:r>
+        <w:t xml:space="preserve"> file format. The specification defines what an event means: its logical structure, its field names, and how each value is typed and encoded. It does not dictate how those events are written on the wire. JSON is used throughout </w:t>
+      </w:r>
+      <w:r>
+        <w:t xml:space="preserve">the specification </w:t>
+      </w:r>
+      <w:r>
+        <w:t xml:space="preserve">as the working example because nearly any platform can read it without special libraries — but JSON is </w:t>
+      </w:r>
+      <w:r>
+        <w:t>mandated</w:t>
+      </w:r>
+      <w:r>
+        <w:t xml:space="preserve">. </w:t>
+      </w:r>
+      <w:r>
+        <w:t>Producers could emit the</w:t>
+      </w:r>
+      <w:r>
+        <w:t xml:space="preserve"> same events as Avro, Protocol Buffers, Parquet, or Arrow, and remain fully conformant. Every schema also travels with the stream in a standard, </w:t>
+      </w:r>
+      <w:proofErr w:type="spellStart"/>
+      <w:r>
+        <w:t>validatable</w:t>
+      </w:r>
+      <w:proofErr w:type="spellEnd"/>
+      <w:r>
+        <w:t xml:space="preserve"> form, so a conformant stream can always be checked for correctness on its own terms</w:t>
+      </w:r>
+      <w:r>
+        <w:t>,</w:t>
+      </w:r>
+      <w:r>
+        <w:t xml:space="preserve"> no proprietary decoder</w:t>
+      </w:r>
+      <w:r>
+        <w:t>s are</w:t>
+      </w:r>
+      <w:r>
+        <w:t xml:space="preserve"> </w:t>
+      </w:r>
+      <w:r>
+        <w:t>required</w:t>
+      </w:r>
+      <w:r>
+        <w:t>.</w:t>
+      </w:r>
+    </w:p>
+    <w:p/>
+    <w:p>
+      <w:pPr>
+        <w:pStyle w:val="ListParagraph"/>
+        <w:numPr>
+          <w:ilvl w:val="0"/>
+          <w:numId w:val="5"/>
+        </w:numPr>
+      </w:pPr>
+      <w:r>
+        <w:rPr>
+          <w:b/>
+          <w:bCs/>
+        </w:rPr>
+        <w:t>Transport and infrastructure independence</w:t>
+      </w:r>
+      <w:r>
+        <w:t xml:space="preserve"> — the stream stands alone. </w:t>
+      </w:r>
+      <w:proofErr w:type="spellStart"/>
+      <w:r>
+        <w:t>OpenCDC</w:t>
+      </w:r>
+      <w:proofErr w:type="spellEnd"/>
+      <w:r>
+        <w:t xml:space="preserve"> assumes no </w:t>
+      </w:r>
+      <w:proofErr w:type="gramStart"/>
+      <w:r>
+        <w:t>particular</w:t>
+      </w:r>
+      <w:r>
+        <w:t xml:space="preserve"> wire</w:t>
+      </w:r>
+      <w:proofErr w:type="gramEnd"/>
+      <w:r>
+        <w:t xml:space="preserve"> protocol,</w:t>
+      </w:r>
+      <w:r>
+        <w:t xml:space="preserve"> message broker, schema registry, SDK, or vendor runtime. A conformant stream can be parsed, validated, and applied with nothing more than a standard parser and this specification. </w:t>
+      </w:r>
+      <w:r>
+        <w:t xml:space="preserve">A given set of transaction </w:t>
+      </w:r>
+      <w:r>
+        <w:t xml:space="preserve">events </w:t>
+      </w:r>
+      <w:r>
+        <w:t>can be</w:t>
+      </w:r>
+      <w:r>
+        <w:t xml:space="preserve"> valid whether they flow through a </w:t>
+      </w:r>
+      <w:r>
+        <w:t xml:space="preserve">CDC wire protocol, </w:t>
+      </w:r>
+      <w:r>
+        <w:t xml:space="preserve">streaming platform, a message queue, or simply sit at rest in object storage. Because each event carries its own schema and ordering information, no party needs out-of-band coordination or shared tooling to make sense of the data. </w:t>
+      </w:r>
+    </w:p>
+    <w:p/>
+    <w:p>
+      <w:pPr>
+        <w:pStyle w:val="Heading2"/>
+      </w:pPr>
+      <w:r>
+        <w:t xml:space="preserve">B: </w:t>
+      </w:r>
+      <w:r>
+        <w:t xml:space="preserve">Support for </w:t>
+      </w:r>
+      <w:proofErr w:type="gramStart"/>
+      <w:r>
+        <w:t>Tightly-Coupled</w:t>
+      </w:r>
+      <w:proofErr w:type="gramEnd"/>
+      <w:r>
+        <w:t xml:space="preserve"> and Loosely-Coupled Transports</w:t>
+      </w:r>
+    </w:p>
+    <w:p>
+      <w:r>
+        <w:t xml:space="preserve">Real-world change </w:t>
+      </w:r>
+      <w:r>
+        <w:t xml:space="preserve">data </w:t>
+      </w:r>
+      <w:r>
+        <w:t xml:space="preserve">streams </w:t>
+      </w:r>
+      <w:r>
+        <w:t>may</w:t>
+      </w:r>
+      <w:r>
+        <w:t xml:space="preserve"> </w:t>
+      </w:r>
+      <w:proofErr w:type="gramStart"/>
+      <w:r>
+        <w:t>delivered</w:t>
+      </w:r>
+      <w:proofErr w:type="gramEnd"/>
+      <w:r>
+        <w:t xml:space="preserve"> in very different ways. Sometimes a producer hands events straight to a consumer in a single, orderly </w:t>
+      </w:r>
+      <w:r>
+        <w:t>sequence</w:t>
+      </w:r>
+      <w:r>
+        <w:t xml:space="preserve">. Other times the events are scattered across many </w:t>
+      </w:r>
+      <w:r>
+        <w:t>partitions</w:t>
+      </w:r>
+      <w:r>
+        <w:t xml:space="preserve"> or parked in storage to be picked up later. </w:t>
+      </w:r>
+      <w:proofErr w:type="spellStart"/>
+      <w:r>
+        <w:t>OpenCDC</w:t>
+      </w:r>
+      <w:proofErr w:type="spellEnd"/>
+      <w:r>
+        <w:t xml:space="preserve"> is designed to give the consumer the same trustworthy picture of a transaction </w:t>
+      </w:r>
+      <w:r>
+        <w:t>regardless of transport or storage technologies</w:t>
+      </w:r>
+      <w:r>
+        <w:t>.</w:t>
+      </w:r>
+    </w:p>
+    <w:p/>
+    <w:p>
+      <w:pPr>
+        <w:pStyle w:val="ListParagraph"/>
+        <w:numPr>
+          <w:ilvl w:val="0"/>
+          <w:numId w:val="6"/>
+        </w:numPr>
+      </w:pPr>
+      <w:r>
+        <w:rPr>
+          <w:b/>
+          <w:bCs/>
+        </w:rPr>
+        <w:t xml:space="preserve">Tightly-coupled </w:t>
+      </w:r>
+      <w:r>
+        <w:rPr>
+          <w:b/>
+          <w:bCs/>
+        </w:rPr>
+        <w:t xml:space="preserve">streaming </w:t>
+      </w:r>
+      <w:r>
+        <w:rPr>
+          <w:b/>
+          <w:bCs/>
+        </w:rPr>
+        <w:t>transports</w:t>
+      </w:r>
+      <w:r>
+        <w:t xml:space="preserve"> —</w:t>
+      </w:r>
+      <w:r>
+        <w:t xml:space="preserve"> </w:t>
+      </w:r>
+      <w:r>
+        <w:t xml:space="preserve">When a producer and consumer </w:t>
+      </w:r>
+      <w:r>
+        <w:t>are directly aware of each other an</w:t>
+      </w:r>
+      <w:r>
+        <w:t>d</w:t>
+      </w:r>
+      <w:r>
+        <w:t xml:space="preserve"> they </w:t>
+      </w:r>
+      <w:r>
+        <w:t>share one ordered channel</w:t>
+      </w:r>
+      <w:r>
+        <w:t xml:space="preserve"> (such as a Secure WebSocket stream of events)</w:t>
+      </w:r>
+      <w:r>
+        <w:t xml:space="preserve">, </w:t>
+      </w:r>
+      <w:proofErr w:type="spellStart"/>
+      <w:r>
+        <w:t>OpenCDC</w:t>
+      </w:r>
+      <w:proofErr w:type="spellEnd"/>
+      <w:r>
+        <w:t xml:space="preserve"> </w:t>
+      </w:r>
+      <w:r>
+        <w:t>producers</w:t>
+      </w:r>
+      <w:r>
+        <w:t xml:space="preserve"> </w:t>
+      </w:r>
+      <w:r>
+        <w:t>can provide ordering and sequence</w:t>
+      </w:r>
+      <w:r>
+        <w:t xml:space="preserve"> guarantees with almost no extra </w:t>
+      </w:r>
+      <w:r>
+        <w:t xml:space="preserve">processing </w:t>
+      </w:r>
+      <w:r>
+        <w:t>cost. Everything a consumer needs to group a transaction is already in each event: all events of one transaction share a transaction identifier, are numbered in order with no gaps, and are never mixed in with another transaction's events. Ordering, completeness, and liveness all fall out of the stream's natural sequence, with no side channel and no per-transaction record-keeping.</w:t>
+      </w:r>
+    </w:p>
+    <w:p/>
+    <w:p>
+      <w:pPr>
+        <w:pStyle w:val="ListParagraph"/>
+        <w:numPr>
+          <w:ilvl w:val="0"/>
+          <w:numId w:val="6"/>
+        </w:numPr>
+      </w:pPr>
+      <w:r>
+        <w:rPr>
+          <w:b/>
+          <w:bCs/>
+        </w:rPr>
+        <w:t>Loosely-coupled transports</w:t>
+      </w:r>
+      <w:r>
+        <w:t xml:space="preserve"> —</w:t>
+      </w:r>
+      <w:r>
+        <w:t xml:space="preserve"> W</w:t>
+      </w:r>
+      <w:r>
+        <w:t xml:space="preserve">hen the </w:t>
+      </w:r>
+      <w:r>
+        <w:t>c</w:t>
+      </w:r>
+      <w:r>
+        <w:t xml:space="preserve">onsumer is not </w:t>
+      </w:r>
+      <w:r>
+        <w:t>connected</w:t>
+      </w:r>
+      <w:r>
+        <w:t xml:space="preserve"> directly to the </w:t>
+      </w:r>
+      <w:r>
+        <w:t>p</w:t>
+      </w:r>
+      <w:r>
+        <w:t>roducer of transactions</w:t>
+      </w:r>
+      <w:r>
+        <w:t xml:space="preserve"> events </w:t>
+      </w:r>
+      <w:r>
+        <w:t>may</w:t>
+      </w:r>
+      <w:r>
+        <w:t xml:space="preserve"> spread across separate </w:t>
+      </w:r>
+      <w:r>
+        <w:t>partitions</w:t>
+      </w:r>
+      <w:r>
+        <w:t xml:space="preserve"> (</w:t>
+      </w:r>
+      <w:proofErr w:type="spellStart"/>
+      <w:proofErr w:type="gramStart"/>
+      <w:r>
+        <w:t>eg</w:t>
+      </w:r>
+      <w:proofErr w:type="spellEnd"/>
+      <w:r>
+        <w:t>;</w:t>
+      </w:r>
+      <w:proofErr w:type="gramEnd"/>
+      <w:r>
+        <w:t xml:space="preserve"> Kafka</w:t>
+      </w:r>
+      <w:r>
+        <w:t>)</w:t>
+      </w:r>
+      <w:r>
+        <w:t xml:space="preserve"> or retrieved from storage in parallel</w:t>
+      </w:r>
+      <w:r>
+        <w:t xml:space="preserve"> (</w:t>
+      </w:r>
+      <w:proofErr w:type="spellStart"/>
+      <w:r>
+        <w:t>eg</w:t>
+      </w:r>
+      <w:proofErr w:type="spellEnd"/>
+      <w:r>
+        <w:t>;</w:t>
+      </w:r>
+      <w:r>
+        <w:t xml:space="preserve"> </w:t>
+      </w:r>
+      <w:r>
+        <w:t>o</w:t>
+      </w:r>
+      <w:r>
+        <w:t xml:space="preserve">bject </w:t>
+      </w:r>
+      <w:r>
+        <w:t>s</w:t>
+      </w:r>
+      <w:r>
+        <w:t>torage)</w:t>
+      </w:r>
+      <w:r>
+        <w:t>.</w:t>
+      </w:r>
+      <w:r>
+        <w:t xml:space="preserve"> </w:t>
+      </w:r>
+      <w:r>
+        <w:t>A</w:t>
+      </w:r>
+      <w:r>
+        <w:t xml:space="preserve"> single transaction's events may land in different </w:t>
+      </w:r>
+      <w:proofErr w:type="gramStart"/>
+      <w:r>
+        <w:t>places, and</w:t>
+      </w:r>
+      <w:proofErr w:type="gramEnd"/>
+      <w:r>
+        <w:t xml:space="preserve"> seeing "the next transaction" on one channel tells you nothing about pieces sitting elsewhere. </w:t>
+      </w:r>
+      <w:r>
+        <w:t xml:space="preserve">For these situations, </w:t>
+      </w:r>
+      <w:proofErr w:type="spellStart"/>
+      <w:r>
+        <w:t>OpenCDC</w:t>
+      </w:r>
+      <w:proofErr w:type="spellEnd"/>
+      <w:r>
+        <w:t xml:space="preserve"> </w:t>
+      </w:r>
+      <w:r>
+        <w:t xml:space="preserve">provides </w:t>
+      </w:r>
+      <w:r>
+        <w:lastRenderedPageBreak/>
+        <w:t>features that</w:t>
+      </w:r>
+      <w:r>
+        <w:t xml:space="preserve"> let a consumer confirm, with certainty, that it has gathered every event of a transaction before applying it. The result is one logical stream that behaves correctly whether it travels tightly in sequence or </w:t>
+      </w:r>
+      <w:r>
+        <w:t>is physically consumed out of order</w:t>
+      </w:r>
+      <w:r>
+        <w:t>.</w:t>
+      </w:r>
+    </w:p>
+    <w:p/>
+    <w:p>
+      <w:pPr>
+        <w:pStyle w:val="Heading2"/>
+      </w:pPr>
+      <w:r>
+        <w:t xml:space="preserve">C: </w:t>
+      </w:r>
+      <w:r>
+        <w:t>Self-Describing Streams, with Schema Changes as First-Class Events</w:t>
+      </w:r>
+    </w:p>
+    <w:p>
+      <w:r>
+        <w:t xml:space="preserve">In </w:t>
+      </w:r>
+      <w:proofErr w:type="spellStart"/>
+      <w:r>
+        <w:t>OpenCDC</w:t>
+      </w:r>
+      <w:proofErr w:type="spellEnd"/>
+      <w:r>
+        <w:t xml:space="preserve"> a logical</w:t>
+      </w:r>
+      <w:r>
+        <w:t xml:space="preserve"> change stream carries its own instructions for reading it. Before any data event appears, the stream delivers the schema that describes it — the table's columns, their types, and how their values are encoded — as an ordinary event in the same ordered sequence. </w:t>
+      </w:r>
+      <w:r>
+        <w:t>When</w:t>
+      </w:r>
+      <w:r>
+        <w:t xml:space="preserve"> that schema later changes (a column added, a type altered), the change itself arrives as a first-class event in the very same stream, in its proper place in </w:t>
+      </w:r>
+      <w:r>
+        <w:t>the sequence. Optionally</w:t>
+      </w:r>
+      <w:r>
+        <w:t xml:space="preserve">, </w:t>
+      </w:r>
+      <w:r>
+        <w:t>producers may also</w:t>
+      </w:r>
+      <w:r>
+        <w:t xml:space="preserve"> announce</w:t>
+      </w:r>
+      <w:r>
+        <w:t xml:space="preserve"> schema changes on a separate channel</w:t>
+      </w:r>
+      <w:r>
+        <w:t>.</w:t>
+      </w:r>
+      <w:r>
+        <w:br/>
+      </w:r>
+    </w:p>
+    <w:p>
+      <w:r>
+        <w:t>For a consumer, this means everything needed to interpret the data</w:t>
+      </w:r>
+      <w:r>
+        <w:t>,</w:t>
+      </w:r>
+      <w:r>
+        <w:t xml:space="preserve"> and to keep up as the data's shape evolves</w:t>
+      </w:r>
+      <w:r>
+        <w:t>,</w:t>
+      </w:r>
+      <w:r>
+        <w:t xml:space="preserve"> comes from reading the stream itself. There is no </w:t>
+      </w:r>
+      <w:r>
+        <w:t xml:space="preserve">mandate for a </w:t>
+      </w:r>
+      <w:r>
+        <w:t>separate registry to consult, no database to inspect, and nothing to poll. A consumer that has read the stream up to a given event always knows exactly how to decode it.</w:t>
+      </w:r>
+      <w:r>
+        <w:br/>
+      </w:r>
+    </w:p>
+    <w:p>
+      <w:r>
+        <w:t xml:space="preserve">By keeping schema, schema changes, and data together and in order, </w:t>
+      </w:r>
+      <w:proofErr w:type="spellStart"/>
+      <w:r>
+        <w:t>OpenCDC</w:t>
+      </w:r>
+      <w:proofErr w:type="spellEnd"/>
+      <w:r>
+        <w:t xml:space="preserve"> preserves that correlation by </w:t>
+      </w:r>
+      <w:r>
+        <w:t>precise ordering in the sequence of events</w:t>
+      </w:r>
+      <w:r>
+        <w:t xml:space="preserve">. It is the same </w:t>
+      </w:r>
+      <w:r>
+        <w:t xml:space="preserve">core principle for why the </w:t>
+      </w:r>
+      <w:proofErr w:type="spellStart"/>
+      <w:r>
+        <w:t>OpenCDC</w:t>
+      </w:r>
+      <w:proofErr w:type="spellEnd"/>
+      <w:r>
+        <w:t xml:space="preserve"> transaction-commit marker</w:t>
+      </w:r>
+      <w:r>
+        <w:t xml:space="preserve">s are delivered </w:t>
+      </w:r>
+      <w:r>
+        <w:t xml:space="preserve">in the stream rather than </w:t>
+      </w:r>
+      <w:r>
+        <w:t>on</w:t>
+      </w:r>
+      <w:r>
+        <w:t xml:space="preserve"> a side channel: when the order and the relationships between events carry meaning, the events belong together in one </w:t>
+      </w:r>
+      <w:r>
+        <w:t xml:space="preserve">continuous sequence, </w:t>
+      </w:r>
+      <w:r>
+        <w:t xml:space="preserve">not scattered across separate paths </w:t>
+      </w:r>
+      <w:r>
+        <w:t xml:space="preserve">that </w:t>
+      </w:r>
+      <w:r>
+        <w:t>a consumer must stitch back together</w:t>
+      </w:r>
+      <w:r>
+        <w:t xml:space="preserve"> from inference alone</w:t>
+      </w:r>
+      <w:r>
+        <w:t>.</w:t>
+      </w:r>
+    </w:p>
+    <w:p/>
+    <w:p/>
+    <w:p/>
+    <w:p>
       <w:r>
         <w:br w:type="page"/>
       </w:r>
@@ -979,16 +1802,7 @@
       </w:pPr>
       <w:r>
         <w:lastRenderedPageBreak/>
-        <w:t xml:space="preserve">1. </w:t>
-      </w:r>
-      <w:r>
-        <w:t>Interop</w:t>
-      </w:r>
-      <w:r>
-        <w:t xml:space="preserve"> of Mixed-Vendor CDC Tools</w:t>
-      </w:r>
-      <w:r>
-        <w:t>, Same DB Type</w:t>
+        <w:t>1. Interop of Mixed-Vendor CDC Tools, Same DB Type</w:t>
       </w:r>
     </w:p>
     <w:p>
@@ -1008,51 +1822,33 @@
           <w:sz w:val="20"/>
           <w:szCs w:val="20"/>
         </w:rPr>
-        <w:t>Note</w:t>
-      </w:r>
-      <w:r>
-        <w:rPr>
-          <w:i/>
-          <w:iCs/>
+        <w:t>Note.</w:t>
+      </w:r>
+      <w:r>
+        <w:rPr>
           <w:color w:val="595959"/>
           <w:sz w:val="20"/>
           <w:szCs w:val="20"/>
         </w:rPr>
-        <w:t>.</w:t>
-      </w:r>
+        <w:t xml:space="preserve"> </w:t>
+      </w:r>
+      <w:proofErr w:type="gramStart"/>
       <w:r>
         <w:rPr>
           <w:color w:val="595959"/>
           <w:sz w:val="20"/>
           <w:szCs w:val="20"/>
         </w:rPr>
-        <w:t xml:space="preserve"> </w:t>
-      </w:r>
-      <w:proofErr w:type="gramStart"/>
+        <w:t>Story</w:t>
+      </w:r>
+      <w:proofErr w:type="gramEnd"/>
       <w:r>
         <w:rPr>
           <w:color w:val="595959"/>
           <w:sz w:val="20"/>
           <w:szCs w:val="20"/>
         </w:rPr>
-        <w:t>Story</w:t>
-      </w:r>
-      <w:proofErr w:type="gramEnd"/>
-      <w:r>
-        <w:rPr>
-          <w:color w:val="595959"/>
-          <w:sz w:val="20"/>
-          <w:szCs w:val="20"/>
-        </w:rPr>
-        <w:t xml:space="preserve"> 1 &amp; 2 are both about interoperability of CDC tools, the rationale for splitting into two distinct stories is to provide for details that emerge when the databases are homogenous vs heterogeneous</w:t>
-      </w:r>
-      <w:r>
-        <w:rPr>
-          <w:color w:val="595959"/>
-          <w:sz w:val="20"/>
-          <w:szCs w:val="20"/>
-        </w:rPr>
-        <w:t>.</w:t>
+        <w:t xml:space="preserve"> 1 &amp; 2 are both about interoperability of CDC tools, the rationale for splitting into two distinct stories is to provide for details that emerge when the databases are homogenous vs heterogeneous.</w:t>
       </w:r>
     </w:p>
     <w:p>
@@ -1832,310 +2628,6 @@
     </w:p>
     <w:p>
       <w:pPr>
-        <w:pStyle w:val="Heading2"/>
-      </w:pPr>
-      <w:r>
-        <w:t>Acceptance Criteria</w:t>
-      </w:r>
-    </w:p>
-    <w:tbl>
-      <w:tblPr>
-        <w:tblW w:w="9360" w:type="dxa"/>
-        <w:tblBorders>
-          <w:top w:val="single" w:sz="4" w:space="0" w:color="auto"/>
-          <w:left w:val="single" w:sz="4" w:space="0" w:color="auto"/>
-          <w:bottom w:val="single" w:sz="4" w:space="0" w:color="auto"/>
-          <w:right w:val="single" w:sz="4" w:space="0" w:color="auto"/>
-          <w:insideH w:val="single" w:sz="4" w:space="0" w:color="auto"/>
-          <w:insideV w:val="single" w:sz="4" w:space="0" w:color="auto"/>
-        </w:tblBorders>
-        <w:tblCellMar>
-          <w:left w:w="10" w:type="dxa"/>
-          <w:right w:w="10" w:type="dxa"/>
-        </w:tblCellMar>
-        <w:tblLook w:val="04A0" w:firstRow="1" w:lastRow="0" w:firstColumn="1" w:lastColumn="0" w:noHBand="0" w:noVBand="1"/>
-      </w:tblPr>
-      <w:tblGrid>
-        <w:gridCol w:w="9360"/>
-      </w:tblGrid>
-      <w:tr>
-        <w:tc>
-          <w:tcPr>
-            <w:tcW w:w="9360" w:type="dxa"/>
-            <w:tcBorders>
-              <w:top w:val="single" w:sz="1" w:space="0" w:color="CCCCCC"/>
-              <w:left w:val="single" w:sz="2" w:space="0" w:color="2E75B6"/>
-              <w:bottom w:val="single" w:sz="1" w:space="0" w:color="CCCCCC"/>
-              <w:right w:val="single" w:sz="1" w:space="0" w:color="CCCCCC"/>
-            </w:tcBorders>
-            <w:shd w:val="clear" w:color="auto" w:fill="FFFFFF"/>
-            <w:tcMar>
-              <w:top w:w="60" w:type="dxa"/>
-              <w:left w:w="120" w:type="dxa"/>
-              <w:bottom w:w="60" w:type="dxa"/>
-              <w:right w:w="120" w:type="dxa"/>
-            </w:tcMar>
-          </w:tcPr>
-          <w:p>
-            <w:proofErr w:type="spellStart"/>
-            <w:r>
-              <w:rPr>
-                <w:sz w:val="21"/>
-                <w:szCs w:val="21"/>
-              </w:rPr>
-              <w:t>Debezium</w:t>
-            </w:r>
-            <w:proofErr w:type="spellEnd"/>
-            <w:r>
-              <w:rPr>
-                <w:sz w:val="21"/>
-                <w:szCs w:val="21"/>
-              </w:rPr>
-              <w:t xml:space="preserve"> publishes </w:t>
-            </w:r>
-            <w:proofErr w:type="spellStart"/>
-            <w:r>
-              <w:rPr>
-                <w:sz w:val="21"/>
-                <w:szCs w:val="21"/>
-              </w:rPr>
-              <w:t>OpenCDC</w:t>
-            </w:r>
-            <w:proofErr w:type="spellEnd"/>
-            <w:r>
-              <w:rPr>
-                <w:sz w:val="21"/>
-                <w:szCs w:val="21"/>
-              </w:rPr>
-              <w:t>-formatted change events for a configured set of Aurora tables to an AWS Kinesis stream without modifying or disrupting its existing data warehouse feed.</w:t>
-            </w:r>
-          </w:p>
-        </w:tc>
-      </w:tr>
-      <w:tr>
-        <w:tc>
-          <w:tcPr>
-            <w:tcW w:w="9360" w:type="dxa"/>
-            <w:tcBorders>
-              <w:top w:val="single" w:sz="1" w:space="0" w:color="CCCCCC"/>
-              <w:left w:val="single" w:sz="2" w:space="0" w:color="2E75B6"/>
-              <w:bottom w:val="single" w:sz="1" w:space="0" w:color="CCCCCC"/>
-              <w:right w:val="single" w:sz="1" w:space="0" w:color="CCCCCC"/>
-            </w:tcBorders>
-            <w:shd w:val="clear" w:color="auto" w:fill="F2F2F2"/>
-            <w:tcMar>
-              <w:top w:w="60" w:type="dxa"/>
-              <w:left w:w="120" w:type="dxa"/>
-              <w:bottom w:w="60" w:type="dxa"/>
-              <w:right w:w="120" w:type="dxa"/>
-            </w:tcMar>
-          </w:tcPr>
-          <w:p>
-            <w:proofErr w:type="spellStart"/>
-            <w:r>
-              <w:rPr>
-                <w:sz w:val="21"/>
-                <w:szCs w:val="21"/>
-              </w:rPr>
-              <w:t>Fivetran</w:t>
-            </w:r>
-            <w:proofErr w:type="spellEnd"/>
-            <w:r>
-              <w:rPr>
-                <w:sz w:val="21"/>
-                <w:szCs w:val="21"/>
-              </w:rPr>
-              <w:t>/HVR consumes those events from Kinesis and applies them to the on-premises PostgreSQL database using its existing deployment — no new agents or connectors installed.</w:t>
-            </w:r>
-          </w:p>
-        </w:tc>
-      </w:tr>
-      <w:tr>
-        <w:tc>
-          <w:tcPr>
-            <w:tcW w:w="9360" w:type="dxa"/>
-            <w:tcBorders>
-              <w:top w:val="single" w:sz="1" w:space="0" w:color="CCCCCC"/>
-              <w:left w:val="single" w:sz="2" w:space="0" w:color="2E75B6"/>
-              <w:bottom w:val="single" w:sz="1" w:space="0" w:color="CCCCCC"/>
-              <w:right w:val="single" w:sz="1" w:space="0" w:color="CCCCCC"/>
-            </w:tcBorders>
-            <w:shd w:val="clear" w:color="auto" w:fill="FFFFFF"/>
-            <w:tcMar>
-              <w:top w:w="60" w:type="dxa"/>
-              <w:left w:w="120" w:type="dxa"/>
-              <w:bottom w:w="60" w:type="dxa"/>
-              <w:right w:w="120" w:type="dxa"/>
-            </w:tcMar>
-          </w:tcPr>
-          <w:p>
-            <w:r>
-              <w:rPr>
-                <w:sz w:val="21"/>
-                <w:szCs w:val="21"/>
-              </w:rPr>
-              <w:t xml:space="preserve">PostgreSQL data types (including </w:t>
-            </w:r>
-            <w:proofErr w:type="spellStart"/>
-            <w:r>
-              <w:rPr>
-                <w:sz w:val="21"/>
-                <w:szCs w:val="21"/>
-              </w:rPr>
-              <w:t>numerics</w:t>
-            </w:r>
-            <w:proofErr w:type="spellEnd"/>
-            <w:r>
-              <w:rPr>
-                <w:sz w:val="21"/>
-                <w:szCs w:val="21"/>
-              </w:rPr>
-              <w:t>, timestamps, arrays, and JSON) are preserved without loss or coercion between Aurora and on-prem Postgres.</w:t>
-            </w:r>
-          </w:p>
-        </w:tc>
-      </w:tr>
-      <w:tr>
-        <w:tc>
-          <w:tcPr>
-            <w:tcW w:w="9360" w:type="dxa"/>
-            <w:tcBorders>
-              <w:top w:val="single" w:sz="1" w:space="0" w:color="CCCCCC"/>
-              <w:left w:val="single" w:sz="2" w:space="0" w:color="2E75B6"/>
-              <w:bottom w:val="single" w:sz="1" w:space="0" w:color="CCCCCC"/>
-              <w:right w:val="single" w:sz="1" w:space="0" w:color="CCCCCC"/>
-            </w:tcBorders>
-            <w:shd w:val="clear" w:color="auto" w:fill="F2F2F2"/>
-            <w:tcMar>
-              <w:top w:w="60" w:type="dxa"/>
-              <w:left w:w="120" w:type="dxa"/>
-              <w:bottom w:w="60" w:type="dxa"/>
-              <w:right w:w="120" w:type="dxa"/>
-            </w:tcMar>
-          </w:tcPr>
-          <w:p>
-            <w:r>
-              <w:rPr>
-                <w:sz w:val="21"/>
-                <w:szCs w:val="21"/>
-              </w:rPr>
-              <w:lastRenderedPageBreak/>
-              <w:t>Multi-row transactions are applied atomically on the on-premises side.</w:t>
-            </w:r>
-          </w:p>
-        </w:tc>
-      </w:tr>
-      <w:tr>
-        <w:tc>
-          <w:tcPr>
-            <w:tcW w:w="9360" w:type="dxa"/>
-            <w:tcBorders>
-              <w:top w:val="single" w:sz="1" w:space="0" w:color="CCCCCC"/>
-              <w:left w:val="single" w:sz="2" w:space="0" w:color="2E75B6"/>
-              <w:bottom w:val="single" w:sz="1" w:space="0" w:color="CCCCCC"/>
-              <w:right w:val="single" w:sz="1" w:space="0" w:color="CCCCCC"/>
-            </w:tcBorders>
-            <w:shd w:val="clear" w:color="auto" w:fill="FFFFFF"/>
-            <w:tcMar>
-              <w:top w:w="60" w:type="dxa"/>
-              <w:left w:w="120" w:type="dxa"/>
-              <w:bottom w:w="60" w:type="dxa"/>
-              <w:right w:w="120" w:type="dxa"/>
-            </w:tcMar>
-          </w:tcPr>
-          <w:p>
-            <w:r>
-              <w:rPr>
-                <w:sz w:val="21"/>
-                <w:szCs w:val="21"/>
-              </w:rPr>
-              <w:t>A schema change on the Aurora source is reflected in the event stream in a way the on-prem consumer can detect and handle gracefully.</w:t>
-            </w:r>
-          </w:p>
-        </w:tc>
-      </w:tr>
-      <w:tr>
-        <w:tc>
-          <w:tcPr>
-            <w:tcW w:w="9360" w:type="dxa"/>
-            <w:tcBorders>
-              <w:top w:val="single" w:sz="1" w:space="0" w:color="CCCCCC"/>
-              <w:left w:val="single" w:sz="2" w:space="0" w:color="2E75B6"/>
-              <w:bottom w:val="single" w:sz="1" w:space="0" w:color="CCCCCC"/>
-              <w:right w:val="single" w:sz="1" w:space="0" w:color="CCCCCC"/>
-            </w:tcBorders>
-            <w:shd w:val="clear" w:color="auto" w:fill="F2F2F2"/>
-            <w:tcMar>
-              <w:top w:w="60" w:type="dxa"/>
-              <w:left w:w="120" w:type="dxa"/>
-              <w:bottom w:w="60" w:type="dxa"/>
-              <w:right w:w="120" w:type="dxa"/>
-            </w:tcMar>
-          </w:tcPr>
-          <w:p>
-            <w:r>
-              <w:rPr>
-                <w:sz w:val="21"/>
-                <w:szCs w:val="21"/>
-              </w:rPr>
-              <w:t>No new CDC software is installed on either the Aurora environment or the on-premises Postgres host.</w:t>
-            </w:r>
-          </w:p>
-        </w:tc>
-      </w:tr>
-      <w:tr>
-        <w:tc>
-          <w:tcPr>
-            <w:tcW w:w="9360" w:type="dxa"/>
-            <w:tcBorders>
-              <w:top w:val="single" w:sz="1" w:space="0" w:color="CCCCCC"/>
-              <w:left w:val="single" w:sz="2" w:space="0" w:color="2E75B6"/>
-              <w:bottom w:val="single" w:sz="1" w:space="0" w:color="CCCCCC"/>
-              <w:right w:val="single" w:sz="1" w:space="0" w:color="CCCCCC"/>
-            </w:tcBorders>
-            <w:shd w:val="clear" w:color="auto" w:fill="FFFFFF"/>
-            <w:tcMar>
-              <w:top w:w="60" w:type="dxa"/>
-              <w:left w:w="120" w:type="dxa"/>
-              <w:bottom w:w="60" w:type="dxa"/>
-              <w:right w:w="120" w:type="dxa"/>
-            </w:tcMar>
-          </w:tcPr>
-          <w:p>
-            <w:r>
-              <w:rPr>
-                <w:sz w:val="21"/>
-                <w:szCs w:val="21"/>
-              </w:rPr>
-              <w:t xml:space="preserve">The pipeline can be validated end-to-end using the </w:t>
-            </w:r>
-            <w:proofErr w:type="spellStart"/>
-            <w:r>
-              <w:rPr>
-                <w:sz w:val="21"/>
-                <w:szCs w:val="21"/>
-              </w:rPr>
-              <w:t>OpenCDC</w:t>
-            </w:r>
-            <w:proofErr w:type="spellEnd"/>
-            <w:r>
-              <w:rPr>
-                <w:sz w:val="21"/>
-                <w:szCs w:val="21"/>
-              </w:rPr>
-              <w:t xml:space="preserve"> schema specification without vendor-specific tooling.</w:t>
-            </w:r>
-          </w:p>
-        </w:tc>
-      </w:tr>
-    </w:tbl>
-    <w:p>
-      <w:pPr>
-        <w:spacing w:before="160"/>
-      </w:pPr>
-    </w:p>
-    <w:p>
-      <w:pPr>
         <w:rPr>
           <w:b/>
           <w:bCs/>
@@ -2158,16 +2650,7 @@
       </w:pPr>
       <w:r>
         <w:lastRenderedPageBreak/>
-        <w:t>2</w:t>
-      </w:r>
-      <w:r>
-        <w:t xml:space="preserve">. </w:t>
-      </w:r>
-      <w:r>
-        <w:t>Interop</w:t>
-      </w:r>
-      <w:r>
-        <w:t xml:space="preserve"> of Mixed-Vendor CDC Tools</w:t>
+        <w:t>2. Interop of Mixed-Vendor CDC Tools</w:t>
       </w:r>
       <w:bookmarkEnd w:id="0"/>
       <w:r>
@@ -2360,255 +2843,19 @@
     </w:p>
     <w:p>
       <w:pPr>
-        <w:pStyle w:val="Heading2"/>
-      </w:pPr>
-      <w:r>
-        <w:t>Acceptance Criteria</w:t>
-      </w:r>
-    </w:p>
-    <w:tbl>
-      <w:tblPr>
-        <w:tblW w:w="9360" w:type="dxa"/>
-        <w:tblBorders>
-          <w:top w:val="single" w:sz="4" w:space="0" w:color="auto"/>
-          <w:left w:val="single" w:sz="4" w:space="0" w:color="auto"/>
-          <w:bottom w:val="single" w:sz="4" w:space="0" w:color="auto"/>
-          <w:right w:val="single" w:sz="4" w:space="0" w:color="auto"/>
-          <w:insideH w:val="single" w:sz="4" w:space="0" w:color="auto"/>
-          <w:insideV w:val="single" w:sz="4" w:space="0" w:color="auto"/>
-        </w:tblBorders>
-        <w:tblCellMar>
-          <w:left w:w="10" w:type="dxa"/>
-          <w:right w:w="10" w:type="dxa"/>
-        </w:tblCellMar>
-        <w:tblLook w:val="04A0" w:firstRow="1" w:lastRow="0" w:firstColumn="1" w:lastColumn="0" w:noHBand="0" w:noVBand="1"/>
-      </w:tblPr>
-      <w:tblGrid>
-        <w:gridCol w:w="9360"/>
-      </w:tblGrid>
-      <w:tr>
-        <w:tc>
-          <w:tcPr>
-            <w:tcW w:w="9360" w:type="dxa"/>
-            <w:tcBorders>
-              <w:top w:val="single" w:sz="1" w:space="0" w:color="CCCCCC"/>
-              <w:left w:val="single" w:sz="2" w:space="0" w:color="2E75B6"/>
-              <w:bottom w:val="single" w:sz="1" w:space="0" w:color="CCCCCC"/>
-              <w:right w:val="single" w:sz="1" w:space="0" w:color="CCCCCC"/>
-            </w:tcBorders>
-            <w:shd w:val="clear" w:color="auto" w:fill="FFFFFF"/>
-            <w:tcMar>
-              <w:top w:w="60" w:type="dxa"/>
-              <w:left w:w="120" w:type="dxa"/>
-              <w:bottom w:w="60" w:type="dxa"/>
-              <w:right w:w="120" w:type="dxa"/>
-            </w:tcMar>
-          </w:tcPr>
-          <w:p>
-            <w:r>
-              <w:rPr>
-                <w:sz w:val="21"/>
-                <w:szCs w:val="21"/>
-              </w:rPr>
-              <w:t>Change events emitted by IIDR on DB2 can be consumed directly by GoldenGate on Exadata without transformation, and vice versa.</w:t>
-            </w:r>
-          </w:p>
-        </w:tc>
-      </w:tr>
-      <w:tr>
-        <w:tc>
-          <w:tcPr>
-            <w:tcW w:w="9360" w:type="dxa"/>
-            <w:tcBorders>
-              <w:top w:val="single" w:sz="1" w:space="0" w:color="CCCCCC"/>
-              <w:left w:val="single" w:sz="2" w:space="0" w:color="2E75B6"/>
-              <w:bottom w:val="single" w:sz="1" w:space="0" w:color="CCCCCC"/>
-              <w:right w:val="single" w:sz="1" w:space="0" w:color="CCCCCC"/>
-            </w:tcBorders>
-            <w:shd w:val="clear" w:color="auto" w:fill="F2F2F2"/>
-            <w:tcMar>
-              <w:top w:w="60" w:type="dxa"/>
-              <w:left w:w="120" w:type="dxa"/>
-              <w:bottom w:w="60" w:type="dxa"/>
-              <w:right w:w="120" w:type="dxa"/>
-            </w:tcMar>
-          </w:tcPr>
-          <w:p>
-            <w:r>
-              <w:rPr>
-                <w:sz w:val="21"/>
-                <w:szCs w:val="21"/>
-              </w:rPr>
-              <w:t xml:space="preserve">Events conform to the </w:t>
-            </w:r>
-            <w:proofErr w:type="spellStart"/>
-            <w:r>
-              <w:rPr>
-                <w:sz w:val="21"/>
-                <w:szCs w:val="21"/>
-              </w:rPr>
-              <w:t>OpenCDC</w:t>
-            </w:r>
-            <w:proofErr w:type="spellEnd"/>
-            <w:r>
-              <w:rPr>
-                <w:sz w:val="21"/>
-                <w:szCs w:val="21"/>
-              </w:rPr>
-              <w:t xml:space="preserve"> </w:t>
-            </w:r>
-            <w:proofErr w:type="spellStart"/>
-            <w:r>
-              <w:rPr>
-                <w:sz w:val="21"/>
-                <w:szCs w:val="21"/>
-              </w:rPr>
-              <w:t>CloudEvents</w:t>
-            </w:r>
-            <w:proofErr w:type="spellEnd"/>
-            <w:r>
-              <w:rPr>
-                <w:sz w:val="21"/>
-                <w:szCs w:val="21"/>
-              </w:rPr>
-              <w:t xml:space="preserve"> specification: operation type, before/after record state, source metadata, and a monotonic sequence identifier.</w:t>
-            </w:r>
-          </w:p>
-        </w:tc>
-      </w:tr>
-      <w:tr>
-        <w:tc>
-          <w:tcPr>
-            <w:tcW w:w="9360" w:type="dxa"/>
-            <w:tcBorders>
-              <w:top w:val="single" w:sz="1" w:space="0" w:color="CCCCCC"/>
-              <w:left w:val="single" w:sz="2" w:space="0" w:color="2E75B6"/>
-              <w:bottom w:val="single" w:sz="1" w:space="0" w:color="CCCCCC"/>
-              <w:right w:val="single" w:sz="1" w:space="0" w:color="CCCCCC"/>
-            </w:tcBorders>
-            <w:shd w:val="clear" w:color="auto" w:fill="FFFFFF"/>
-            <w:tcMar>
-              <w:top w:w="60" w:type="dxa"/>
-              <w:left w:w="120" w:type="dxa"/>
-              <w:bottom w:w="60" w:type="dxa"/>
-              <w:right w:w="120" w:type="dxa"/>
-            </w:tcMar>
-          </w:tcPr>
-          <w:p>
-            <w:r>
-              <w:rPr>
-                <w:sz w:val="21"/>
-                <w:szCs w:val="21"/>
-              </w:rPr>
-              <w:t>Only the configured subset of tables participates in cross-system replication.</w:t>
-            </w:r>
-          </w:p>
-        </w:tc>
-      </w:tr>
-      <w:tr>
-        <w:tc>
-          <w:tcPr>
-            <w:tcW w:w="9360" w:type="dxa"/>
-            <w:tcBorders>
-              <w:top w:val="single" w:sz="1" w:space="0" w:color="CCCCCC"/>
-              <w:left w:val="single" w:sz="2" w:space="0" w:color="2E75B6"/>
-              <w:bottom w:val="single" w:sz="1" w:space="0" w:color="CCCCCC"/>
-              <w:right w:val="single" w:sz="1" w:space="0" w:color="CCCCCC"/>
-            </w:tcBorders>
-            <w:shd w:val="clear" w:color="auto" w:fill="F2F2F2"/>
-            <w:tcMar>
-              <w:top w:w="60" w:type="dxa"/>
-              <w:left w:w="120" w:type="dxa"/>
-              <w:bottom w:w="60" w:type="dxa"/>
-              <w:right w:w="120" w:type="dxa"/>
-            </w:tcMar>
-          </w:tcPr>
-          <w:p>
-            <w:r>
-              <w:rPr>
-                <w:sz w:val="21"/>
-                <w:szCs w:val="21"/>
-              </w:rPr>
-              <w:t>No new CDC software is installed on either host system.</w:t>
-            </w:r>
-          </w:p>
-        </w:tc>
-      </w:tr>
-      <w:tr>
-        <w:tc>
-          <w:tcPr>
-            <w:tcW w:w="9360" w:type="dxa"/>
-            <w:tcBorders>
-              <w:top w:val="single" w:sz="1" w:space="0" w:color="CCCCCC"/>
-              <w:left w:val="single" w:sz="2" w:space="0" w:color="2E75B6"/>
-              <w:bottom w:val="single" w:sz="1" w:space="0" w:color="CCCCCC"/>
-              <w:right w:val="single" w:sz="1" w:space="0" w:color="CCCCCC"/>
-            </w:tcBorders>
-            <w:shd w:val="clear" w:color="auto" w:fill="FFFFFF"/>
-            <w:tcMar>
-              <w:top w:w="60" w:type="dxa"/>
-              <w:left w:w="120" w:type="dxa"/>
-              <w:bottom w:w="60" w:type="dxa"/>
-              <w:right w:w="120" w:type="dxa"/>
-            </w:tcMar>
-          </w:tcPr>
-          <w:p>
-            <w:r>
-              <w:rPr>
-                <w:sz w:val="21"/>
-                <w:szCs w:val="21"/>
-              </w:rPr>
-              <w:t>The synchronization survives a transient network outage by resuming from the last acknowledged sequence position.</w:t>
-            </w:r>
-          </w:p>
-        </w:tc>
-      </w:tr>
-      <w:tr>
-        <w:tc>
-          <w:tcPr>
-            <w:tcW w:w="9360" w:type="dxa"/>
-            <w:tcBorders>
-              <w:top w:val="single" w:sz="1" w:space="0" w:color="CCCCCC"/>
-              <w:left w:val="single" w:sz="2" w:space="0" w:color="2E75B6"/>
-              <w:bottom w:val="single" w:sz="1" w:space="0" w:color="CCCCCC"/>
-              <w:right w:val="single" w:sz="1" w:space="0" w:color="CCCCCC"/>
-            </w:tcBorders>
-            <w:shd w:val="clear" w:color="auto" w:fill="F2F2F2"/>
-            <w:tcMar>
-              <w:top w:w="60" w:type="dxa"/>
-              <w:left w:w="120" w:type="dxa"/>
-              <w:bottom w:w="60" w:type="dxa"/>
-              <w:right w:w="120" w:type="dxa"/>
-            </w:tcMar>
-          </w:tcPr>
-          <w:p>
-            <w:r>
-              <w:rPr>
-                <w:sz w:val="21"/>
-                <w:szCs w:val="21"/>
-              </w:rPr>
-              <w:t xml:space="preserve">A DBA can validate event conformance against the </w:t>
-            </w:r>
-            <w:proofErr w:type="spellStart"/>
-            <w:r>
-              <w:rPr>
-                <w:sz w:val="21"/>
-                <w:szCs w:val="21"/>
-              </w:rPr>
-              <w:t>OpenCDC</w:t>
-            </w:r>
-            <w:proofErr w:type="spellEnd"/>
-            <w:r>
-              <w:rPr>
-                <w:sz w:val="21"/>
-                <w:szCs w:val="21"/>
-              </w:rPr>
-              <w:t xml:space="preserve"> schema without vendor-specific tooling.</w:t>
-            </w:r>
-          </w:p>
-        </w:tc>
-      </w:tr>
-    </w:tbl>
+        <w:rPr>
+          <w:b/>
+          <w:bCs/>
+          <w:color w:val="1F4E79"/>
+          <w:sz w:val="32"/>
+          <w:szCs w:val="32"/>
+        </w:rPr>
+      </w:pPr>
+      <w:bookmarkStart w:id="1" w:name="_Toc228712293"/>
+      <w:r>
+        <w:br w:type="page"/>
+      </w:r>
+    </w:p>
     <w:p>
       <w:pPr>
         <w:pStyle w:val="Heading1"/>
@@ -2616,7 +2863,6 @@
           <w:bottom w:val="single" w:sz="4" w:space="4" w:color="2E75B6"/>
         </w:pBdr>
       </w:pPr>
-      <w:bookmarkStart w:id="1" w:name="_Toc228712293"/>
       <w:r>
         <w:lastRenderedPageBreak/>
         <w:t>3. Unified Lakehouse/Warehouse CDC Ingestion</w:t>
@@ -3043,310 +3289,6 @@
     </w:p>
     <w:p>
       <w:pPr>
-        <w:spacing w:before="80" w:after="80"/>
-      </w:pPr>
-    </w:p>
-    <w:p>
-      <w:pPr>
-        <w:pStyle w:val="Heading2"/>
-      </w:pPr>
-      <w:r>
-        <w:t>Acceptance Criteria</w:t>
-      </w:r>
-    </w:p>
-    <w:tbl>
-      <w:tblPr>
-        <w:tblW w:w="9360" w:type="dxa"/>
-        <w:tblBorders>
-          <w:top w:val="single" w:sz="4" w:space="0" w:color="auto"/>
-          <w:left w:val="single" w:sz="4" w:space="0" w:color="auto"/>
-          <w:bottom w:val="single" w:sz="4" w:space="0" w:color="auto"/>
-          <w:right w:val="single" w:sz="4" w:space="0" w:color="auto"/>
-          <w:insideH w:val="single" w:sz="4" w:space="0" w:color="auto"/>
-          <w:insideV w:val="single" w:sz="4" w:space="0" w:color="auto"/>
-        </w:tblBorders>
-        <w:tblCellMar>
-          <w:left w:w="10" w:type="dxa"/>
-          <w:right w:w="10" w:type="dxa"/>
-        </w:tblCellMar>
-        <w:tblLook w:val="04A0" w:firstRow="1" w:lastRow="0" w:firstColumn="1" w:lastColumn="0" w:noHBand="0" w:noVBand="1"/>
-      </w:tblPr>
-      <w:tblGrid>
-        <w:gridCol w:w="9360"/>
-      </w:tblGrid>
-      <w:tr>
-        <w:tc>
-          <w:tcPr>
-            <w:tcW w:w="9360" w:type="dxa"/>
-            <w:tcBorders>
-              <w:top w:val="single" w:sz="1" w:space="0" w:color="CCCCCC"/>
-              <w:left w:val="single" w:sz="2" w:space="0" w:color="2E75B6"/>
-              <w:bottom w:val="single" w:sz="1" w:space="0" w:color="CCCCCC"/>
-              <w:right w:val="single" w:sz="1" w:space="0" w:color="CCCCCC"/>
-            </w:tcBorders>
-            <w:shd w:val="clear" w:color="auto" w:fill="FFFFFF"/>
-            <w:tcMar>
-              <w:top w:w="60" w:type="dxa"/>
-              <w:left w:w="120" w:type="dxa"/>
-              <w:bottom w:w="60" w:type="dxa"/>
-              <w:right w:w="120" w:type="dxa"/>
-            </w:tcMar>
-          </w:tcPr>
-          <w:p>
-            <w:r>
-              <w:rPr>
-                <w:sz w:val="21"/>
-                <w:szCs w:val="21"/>
-              </w:rPr>
-              <w:t xml:space="preserve">A single ingestion pipeline component processes </w:t>
-            </w:r>
-            <w:proofErr w:type="spellStart"/>
-            <w:r>
-              <w:rPr>
-                <w:sz w:val="21"/>
-                <w:szCs w:val="21"/>
-              </w:rPr>
-              <w:t>OpenCDC</w:t>
-            </w:r>
-            <w:proofErr w:type="spellEnd"/>
-            <w:r>
-              <w:rPr>
-                <w:sz w:val="21"/>
-                <w:szCs w:val="21"/>
-              </w:rPr>
-              <w:t xml:space="preserve"> events from </w:t>
-            </w:r>
-            <w:proofErr w:type="spellStart"/>
-            <w:r>
-              <w:rPr>
-                <w:sz w:val="21"/>
-                <w:szCs w:val="21"/>
-              </w:rPr>
-              <w:t>Debezium</w:t>
-            </w:r>
-            <w:proofErr w:type="spellEnd"/>
-            <w:r>
-              <w:rPr>
-                <w:sz w:val="21"/>
-                <w:szCs w:val="21"/>
-              </w:rPr>
-              <w:t xml:space="preserve"> (Oracle), </w:t>
-            </w:r>
-            <w:proofErr w:type="spellStart"/>
-            <w:r>
-              <w:rPr>
-                <w:sz w:val="21"/>
-                <w:szCs w:val="21"/>
-              </w:rPr>
-              <w:t>Debezium</w:t>
-            </w:r>
-            <w:proofErr w:type="spellEnd"/>
-            <w:r>
-              <w:rPr>
-                <w:sz w:val="21"/>
-                <w:szCs w:val="21"/>
-              </w:rPr>
-              <w:t xml:space="preserve"> (PostgreSQL), and IBM IIDR without source-specific branching logic.</w:t>
-            </w:r>
-          </w:p>
-        </w:tc>
-      </w:tr>
-      <w:tr>
-        <w:tc>
-          <w:tcPr>
-            <w:tcW w:w="9360" w:type="dxa"/>
-            <w:tcBorders>
-              <w:top w:val="single" w:sz="1" w:space="0" w:color="CCCCCC"/>
-              <w:left w:val="single" w:sz="2" w:space="0" w:color="2E75B6"/>
-              <w:bottom w:val="single" w:sz="1" w:space="0" w:color="CCCCCC"/>
-              <w:right w:val="single" w:sz="1" w:space="0" w:color="CCCCCC"/>
-            </w:tcBorders>
-            <w:shd w:val="clear" w:color="auto" w:fill="F2F2F2"/>
-            <w:tcMar>
-              <w:top w:w="60" w:type="dxa"/>
-              <w:left w:w="120" w:type="dxa"/>
-              <w:bottom w:w="60" w:type="dxa"/>
-              <w:right w:w="120" w:type="dxa"/>
-            </w:tcMar>
-          </w:tcPr>
-          <w:p>
-            <w:r>
-              <w:rPr>
-                <w:sz w:val="21"/>
-                <w:szCs w:val="21"/>
-              </w:rPr>
-              <w:t>Before/after record state, operation type, and sequence position are accessible via consistent field paths regardless of the originating tool or database.</w:t>
-            </w:r>
-          </w:p>
-        </w:tc>
-      </w:tr>
-      <w:tr>
-        <w:tc>
-          <w:tcPr>
-            <w:tcW w:w="9360" w:type="dxa"/>
-            <w:tcBorders>
-              <w:top w:val="single" w:sz="1" w:space="0" w:color="CCCCCC"/>
-              <w:left w:val="single" w:sz="2" w:space="0" w:color="2E75B6"/>
-              <w:bottom w:val="single" w:sz="1" w:space="0" w:color="CCCCCC"/>
-              <w:right w:val="single" w:sz="1" w:space="0" w:color="CCCCCC"/>
-            </w:tcBorders>
-            <w:shd w:val="clear" w:color="auto" w:fill="FFFFFF"/>
-            <w:tcMar>
-              <w:top w:w="60" w:type="dxa"/>
-              <w:left w:w="120" w:type="dxa"/>
-              <w:bottom w:w="60" w:type="dxa"/>
-              <w:right w:w="120" w:type="dxa"/>
-            </w:tcMar>
-          </w:tcPr>
-          <w:p>
-            <w:r>
-              <w:rPr>
-                <w:sz w:val="21"/>
-                <w:szCs w:val="21"/>
-              </w:rPr>
-              <w:t>DELETE events are represented uniformly and do not require source-specific null-handling workarounds.</w:t>
-            </w:r>
-          </w:p>
-        </w:tc>
-      </w:tr>
-      <w:tr>
-        <w:tc>
-          <w:tcPr>
-            <w:tcW w:w="9360" w:type="dxa"/>
-            <w:tcBorders>
-              <w:top w:val="single" w:sz="1" w:space="0" w:color="CCCCCC"/>
-              <w:left w:val="single" w:sz="2" w:space="0" w:color="2E75B6"/>
-              <w:bottom w:val="single" w:sz="1" w:space="0" w:color="CCCCCC"/>
-              <w:right w:val="single" w:sz="1" w:space="0" w:color="CCCCCC"/>
-            </w:tcBorders>
-            <w:shd w:val="clear" w:color="auto" w:fill="F2F2F2"/>
-            <w:tcMar>
-              <w:top w:w="60" w:type="dxa"/>
-              <w:left w:w="120" w:type="dxa"/>
-              <w:bottom w:w="60" w:type="dxa"/>
-              <w:right w:w="120" w:type="dxa"/>
-            </w:tcMar>
-          </w:tcPr>
-          <w:p>
-            <w:r>
-              <w:rPr>
-                <w:sz w:val="21"/>
-                <w:szCs w:val="21"/>
-              </w:rPr>
-              <w:t xml:space="preserve">Transaction boundaries are preserved such that multi-row commits land atomically in the </w:t>
-            </w:r>
-            <w:proofErr w:type="gramStart"/>
-            <w:r>
-              <w:rPr>
-                <w:sz w:val="21"/>
-                <w:szCs w:val="21"/>
-              </w:rPr>
-              <w:t>Bronze</w:t>
-            </w:r>
-            <w:proofErr w:type="gramEnd"/>
-            <w:r>
-              <w:rPr>
-                <w:sz w:val="21"/>
-                <w:szCs w:val="21"/>
-              </w:rPr>
-              <w:t xml:space="preserve"> layer.</w:t>
-            </w:r>
-          </w:p>
-        </w:tc>
-      </w:tr>
-      <w:tr>
-        <w:tc>
-          <w:tcPr>
-            <w:tcW w:w="9360" w:type="dxa"/>
-            <w:tcBorders>
-              <w:top w:val="single" w:sz="1" w:space="0" w:color="CCCCCC"/>
-              <w:left w:val="single" w:sz="2" w:space="0" w:color="2E75B6"/>
-              <w:bottom w:val="single" w:sz="1" w:space="0" w:color="CCCCCC"/>
-              <w:right w:val="single" w:sz="1" w:space="0" w:color="CCCCCC"/>
-            </w:tcBorders>
-            <w:shd w:val="clear" w:color="auto" w:fill="FFFFFF"/>
-            <w:tcMar>
-              <w:top w:w="60" w:type="dxa"/>
-              <w:left w:w="120" w:type="dxa"/>
-              <w:bottom w:w="60" w:type="dxa"/>
-              <w:right w:w="120" w:type="dxa"/>
-            </w:tcMar>
-          </w:tcPr>
-          <w:p>
-            <w:r>
-              <w:rPr>
-                <w:sz w:val="21"/>
-                <w:szCs w:val="21"/>
-              </w:rPr>
-              <w:t xml:space="preserve">Adding a new </w:t>
-            </w:r>
-            <w:proofErr w:type="spellStart"/>
-            <w:r>
-              <w:rPr>
-                <w:sz w:val="21"/>
-                <w:szCs w:val="21"/>
-              </w:rPr>
-              <w:t>OpenCDC</w:t>
-            </w:r>
-            <w:proofErr w:type="spellEnd"/>
-            <w:r>
-              <w:rPr>
-                <w:sz w:val="21"/>
-                <w:szCs w:val="21"/>
-              </w:rPr>
-              <w:t>-compliant source requires configuration only — no new parsing code.</w:t>
-            </w:r>
-          </w:p>
-        </w:tc>
-      </w:tr>
-      <w:tr>
-        <w:tc>
-          <w:tcPr>
-            <w:tcW w:w="9360" w:type="dxa"/>
-            <w:tcBorders>
-              <w:top w:val="single" w:sz="1" w:space="0" w:color="CCCCCC"/>
-              <w:left w:val="single" w:sz="2" w:space="0" w:color="2E75B6"/>
-              <w:bottom w:val="single" w:sz="1" w:space="0" w:color="CCCCCC"/>
-              <w:right w:val="single" w:sz="1" w:space="0" w:color="CCCCCC"/>
-            </w:tcBorders>
-            <w:shd w:val="clear" w:color="auto" w:fill="F2F2F2"/>
-            <w:tcMar>
-              <w:top w:w="60" w:type="dxa"/>
-              <w:left w:w="120" w:type="dxa"/>
-              <w:bottom w:w="60" w:type="dxa"/>
-              <w:right w:w="120" w:type="dxa"/>
-            </w:tcMar>
-          </w:tcPr>
-          <w:p>
-            <w:r>
-              <w:rPr>
-                <w:sz w:val="21"/>
-                <w:szCs w:val="21"/>
-              </w:rPr>
-              <w:t xml:space="preserve">The ingestion pipeline can validate an incoming event against the </w:t>
-            </w:r>
-            <w:proofErr w:type="spellStart"/>
-            <w:r>
-              <w:rPr>
-                <w:sz w:val="21"/>
-                <w:szCs w:val="21"/>
-              </w:rPr>
-              <w:t>OpenCDC</w:t>
-            </w:r>
-            <w:proofErr w:type="spellEnd"/>
-            <w:r>
-              <w:rPr>
-                <w:sz w:val="21"/>
-                <w:szCs w:val="21"/>
-              </w:rPr>
-              <w:t xml:space="preserve"> schema without knowledge of the upstream vendor.</w:t>
-            </w:r>
-          </w:p>
-        </w:tc>
-      </w:tr>
-    </w:tbl>
-    <w:p>
-      <w:pPr>
         <w:spacing w:before="160"/>
       </w:pPr>
     </w:p>
@@ -3364,22 +3306,7 @@
       </w:pPr>
       <w:r>
         <w:lastRenderedPageBreak/>
-        <w:t>4</w:t>
-      </w:r>
-      <w:r>
-        <w:t xml:space="preserve">. AI Agent </w:t>
-      </w:r>
-      <w:r>
-        <w:t>(r</w:t>
-      </w:r>
-      <w:r>
-        <w:t>eactive</w:t>
-      </w:r>
-      <w:r>
-        <w:t>) Listens to</w:t>
-      </w:r>
-      <w:r>
-        <w:t xml:space="preserve"> CDC Event Stream</w:t>
+        <w:t>4. AI Agent (reactive) Listens to CDC Event Stream</w:t>
       </w:r>
     </w:p>
     <w:p>
@@ -5116,326 +5043,6 @@
         <w:t>10–14 days, driven by batch windows.</w:t>
       </w:r>
     </w:p>
-    <w:p>
-      <w:pPr>
-        <w:spacing w:before="80" w:after="80"/>
-      </w:pPr>
-    </w:p>
-    <w:p>
-      <w:pPr>
-        <w:pStyle w:val="Heading2"/>
-      </w:pPr>
-      <w:r>
-        <w:t>Acceptance Criteria</w:t>
-      </w:r>
-    </w:p>
-    <w:tbl>
-      <w:tblPr>
-        <w:tblW w:w="9360" w:type="dxa"/>
-        <w:tblBorders>
-          <w:top w:val="single" w:sz="4" w:space="0" w:color="auto"/>
-          <w:left w:val="single" w:sz="4" w:space="0" w:color="auto"/>
-          <w:bottom w:val="single" w:sz="4" w:space="0" w:color="auto"/>
-          <w:right w:val="single" w:sz="4" w:space="0" w:color="auto"/>
-          <w:insideH w:val="single" w:sz="4" w:space="0" w:color="auto"/>
-          <w:insideV w:val="single" w:sz="4" w:space="0" w:color="auto"/>
-        </w:tblBorders>
-        <w:tblCellMar>
-          <w:left w:w="10" w:type="dxa"/>
-          <w:right w:w="10" w:type="dxa"/>
-        </w:tblCellMar>
-        <w:tblLook w:val="04A0" w:firstRow="1" w:lastRow="0" w:firstColumn="1" w:lastColumn="0" w:noHBand="0" w:noVBand="1"/>
-      </w:tblPr>
-      <w:tblGrid>
-        <w:gridCol w:w="9360"/>
-      </w:tblGrid>
-      <w:tr>
-        <w:tc>
-          <w:tcPr>
-            <w:tcW w:w="9360" w:type="dxa"/>
-            <w:tcBorders>
-              <w:top w:val="single" w:sz="1" w:space="0" w:color="CCCCCC"/>
-              <w:left w:val="single" w:sz="2" w:space="0" w:color="2E75B6"/>
-              <w:bottom w:val="single" w:sz="1" w:space="0" w:color="CCCCCC"/>
-              <w:right w:val="single" w:sz="1" w:space="0" w:color="CCCCCC"/>
-            </w:tcBorders>
-            <w:shd w:val="clear" w:color="auto" w:fill="FFFFFF"/>
-            <w:tcMar>
-              <w:top w:w="60" w:type="dxa"/>
-              <w:left w:w="120" w:type="dxa"/>
-              <w:bottom w:w="60" w:type="dxa"/>
-              <w:right w:w="120" w:type="dxa"/>
-            </w:tcMar>
-          </w:tcPr>
-          <w:p>
-            <w:r>
-              <w:rPr>
-                <w:sz w:val="21"/>
-                <w:szCs w:val="21"/>
-              </w:rPr>
-              <w:t xml:space="preserve">An AI agent can submit an </w:t>
-            </w:r>
-            <w:proofErr w:type="spellStart"/>
-            <w:r>
-              <w:rPr>
-                <w:sz w:val="21"/>
-                <w:szCs w:val="21"/>
-              </w:rPr>
-              <w:t>OpenCDC</w:t>
-            </w:r>
-            <w:proofErr w:type="spellEnd"/>
-            <w:r>
-              <w:rPr>
-                <w:sz w:val="21"/>
-                <w:szCs w:val="21"/>
-              </w:rPr>
-              <w:t xml:space="preserve"> stream request to a </w:t>
-            </w:r>
-            <w:proofErr w:type="spellStart"/>
-            <w:r>
-              <w:rPr>
-                <w:sz w:val="21"/>
-                <w:szCs w:val="21"/>
-              </w:rPr>
-              <w:t>Debezium</w:t>
-            </w:r>
-            <w:proofErr w:type="spellEnd"/>
-            <w:r>
-              <w:rPr>
-                <w:sz w:val="21"/>
-                <w:szCs w:val="21"/>
-              </w:rPr>
-              <w:t xml:space="preserve"> endpoint and receive change events on the specified Kafka topic without manual CDC configuration by a DBA.</w:t>
-            </w:r>
-          </w:p>
-        </w:tc>
-      </w:tr>
-      <w:tr>
-        <w:tc>
-          <w:tcPr>
-            <w:tcW w:w="9360" w:type="dxa"/>
-            <w:tcBorders>
-              <w:top w:val="single" w:sz="1" w:space="0" w:color="CCCCCC"/>
-              <w:left w:val="single" w:sz="2" w:space="0" w:color="2E75B6"/>
-              <w:bottom w:val="single" w:sz="1" w:space="0" w:color="CCCCCC"/>
-              <w:right w:val="single" w:sz="1" w:space="0" w:color="CCCCCC"/>
-            </w:tcBorders>
-            <w:shd w:val="clear" w:color="auto" w:fill="F2F2F2"/>
-            <w:tcMar>
-              <w:top w:w="60" w:type="dxa"/>
-              <w:left w:w="120" w:type="dxa"/>
-              <w:bottom w:w="60" w:type="dxa"/>
-              <w:right w:w="120" w:type="dxa"/>
-            </w:tcMar>
-          </w:tcPr>
-          <w:p>
-            <w:r>
-              <w:rPr>
-                <w:sz w:val="21"/>
-                <w:szCs w:val="21"/>
-              </w:rPr>
-              <w:t xml:space="preserve">An AI agent can submit an </w:t>
-            </w:r>
-            <w:proofErr w:type="spellStart"/>
-            <w:r>
-              <w:rPr>
-                <w:sz w:val="21"/>
-                <w:szCs w:val="21"/>
-              </w:rPr>
-              <w:t>OpenCDC</w:t>
-            </w:r>
-            <w:proofErr w:type="spellEnd"/>
-            <w:r>
-              <w:rPr>
-                <w:sz w:val="21"/>
-                <w:szCs w:val="21"/>
-              </w:rPr>
-              <w:t xml:space="preserve"> stream request to a GoldenGate endpoint and receive change events on the specified AsyncAPI channel without manual Extract configuration.</w:t>
-            </w:r>
-          </w:p>
-        </w:tc>
-      </w:tr>
-      <w:tr>
-        <w:tc>
-          <w:tcPr>
-            <w:tcW w:w="9360" w:type="dxa"/>
-            <w:tcBorders>
-              <w:top w:val="single" w:sz="1" w:space="0" w:color="CCCCCC"/>
-              <w:left w:val="single" w:sz="2" w:space="0" w:color="2E75B6"/>
-              <w:bottom w:val="single" w:sz="1" w:space="0" w:color="CCCCCC"/>
-              <w:right w:val="single" w:sz="1" w:space="0" w:color="CCCCCC"/>
-            </w:tcBorders>
-            <w:shd w:val="clear" w:color="auto" w:fill="FFFFFF"/>
-            <w:tcMar>
-              <w:top w:w="60" w:type="dxa"/>
-              <w:left w:w="120" w:type="dxa"/>
-              <w:bottom w:w="60" w:type="dxa"/>
-              <w:right w:w="120" w:type="dxa"/>
-            </w:tcMar>
-          </w:tcPr>
-          <w:p>
-            <w:r>
-              <w:rPr>
-                <w:sz w:val="21"/>
-                <w:szCs w:val="21"/>
-              </w:rPr>
-              <w:lastRenderedPageBreak/>
-              <w:t>Both CDC tools authenticate the agent’s identity and enforce data access permissions before opening any stream.</w:t>
-            </w:r>
-          </w:p>
-        </w:tc>
-      </w:tr>
-      <w:tr>
-        <w:tc>
-          <w:tcPr>
-            <w:tcW w:w="9360" w:type="dxa"/>
-            <w:tcBorders>
-              <w:top w:val="single" w:sz="1" w:space="0" w:color="CCCCCC"/>
-              <w:left w:val="single" w:sz="2" w:space="0" w:color="2E75B6"/>
-              <w:bottom w:val="single" w:sz="1" w:space="0" w:color="CCCCCC"/>
-              <w:right w:val="single" w:sz="1" w:space="0" w:color="CCCCCC"/>
-            </w:tcBorders>
-            <w:shd w:val="clear" w:color="auto" w:fill="F2F2F2"/>
-            <w:tcMar>
-              <w:top w:w="60" w:type="dxa"/>
-              <w:left w:w="120" w:type="dxa"/>
-              <w:bottom w:w="60" w:type="dxa"/>
-              <w:right w:w="120" w:type="dxa"/>
-            </w:tcMar>
-          </w:tcPr>
-          <w:p>
-            <w:r>
-              <w:rPr>
-                <w:sz w:val="21"/>
-                <w:szCs w:val="21"/>
-              </w:rPr>
-              <w:t xml:space="preserve">Change events from Postgres (via </w:t>
-            </w:r>
-            <w:proofErr w:type="spellStart"/>
-            <w:r>
-              <w:rPr>
-                <w:sz w:val="21"/>
-                <w:szCs w:val="21"/>
-              </w:rPr>
-              <w:t>Debezium</w:t>
-            </w:r>
-            <w:proofErr w:type="spellEnd"/>
-            <w:r>
-              <w:rPr>
-                <w:sz w:val="21"/>
-                <w:szCs w:val="21"/>
-              </w:rPr>
-              <w:t xml:space="preserve">) and Oracle (via GoldenGate) arrive at the agent in an identical </w:t>
-            </w:r>
-            <w:proofErr w:type="spellStart"/>
-            <w:r>
-              <w:rPr>
-                <w:sz w:val="21"/>
-                <w:szCs w:val="21"/>
-              </w:rPr>
-              <w:t>OpenCDC</w:t>
-            </w:r>
-            <w:proofErr w:type="spellEnd"/>
-            <w:r>
-              <w:rPr>
-                <w:sz w:val="21"/>
-                <w:szCs w:val="21"/>
-              </w:rPr>
-              <w:t xml:space="preserve"> envelope structure, processed by a single event handler without source-specific branching.</w:t>
-            </w:r>
-          </w:p>
-        </w:tc>
-      </w:tr>
-      <w:tr>
-        <w:tc>
-          <w:tcPr>
-            <w:tcW w:w="9360" w:type="dxa"/>
-            <w:tcBorders>
-              <w:top w:val="single" w:sz="1" w:space="0" w:color="CCCCCC"/>
-              <w:left w:val="single" w:sz="2" w:space="0" w:color="2E75B6"/>
-              <w:bottom w:val="single" w:sz="1" w:space="0" w:color="CCCCCC"/>
-              <w:right w:val="single" w:sz="1" w:space="0" w:color="CCCCCC"/>
-            </w:tcBorders>
-            <w:shd w:val="clear" w:color="auto" w:fill="FFFFFF"/>
-            <w:tcMar>
-              <w:top w:w="60" w:type="dxa"/>
-              <w:left w:w="120" w:type="dxa"/>
-              <w:bottom w:w="60" w:type="dxa"/>
-              <w:right w:w="120" w:type="dxa"/>
-            </w:tcMar>
-          </w:tcPr>
-          <w:p>
-            <w:r>
-              <w:rPr>
-                <w:sz w:val="21"/>
-                <w:szCs w:val="21"/>
-              </w:rPr>
-              <w:t>The agent can filter requested events by business object type and status values — receiving only the state transitions relevant to onboarding workflows.</w:t>
-            </w:r>
-          </w:p>
-        </w:tc>
-      </w:tr>
-      <w:tr>
-        <w:tc>
-          <w:tcPr>
-            <w:tcW w:w="9360" w:type="dxa"/>
-            <w:tcBorders>
-              <w:top w:val="single" w:sz="1" w:space="0" w:color="CCCCCC"/>
-              <w:left w:val="single" w:sz="2" w:space="0" w:color="2E75B6"/>
-              <w:bottom w:val="single" w:sz="1" w:space="0" w:color="CCCCCC"/>
-              <w:right w:val="single" w:sz="1" w:space="0" w:color="CCCCCC"/>
-            </w:tcBorders>
-            <w:shd w:val="clear" w:color="auto" w:fill="F2F2F2"/>
-            <w:tcMar>
-              <w:top w:w="60" w:type="dxa"/>
-              <w:left w:w="120" w:type="dxa"/>
-              <w:bottom w:w="60" w:type="dxa"/>
-              <w:right w:w="120" w:type="dxa"/>
-            </w:tcMar>
-          </w:tcPr>
-          <w:p>
-            <w:r>
-              <w:rPr>
-                <w:sz w:val="21"/>
-                <w:szCs w:val="21"/>
-              </w:rPr>
-              <w:t>An onboarding milestone that previously required a batch ETL window (up to 24 hours) is triggered within seconds of the underlying database record changing state.</w:t>
-            </w:r>
-          </w:p>
-        </w:tc>
-      </w:tr>
-      <w:tr>
-        <w:tc>
-          <w:tcPr>
-            <w:tcW w:w="9360" w:type="dxa"/>
-            <w:tcBorders>
-              <w:top w:val="single" w:sz="1" w:space="0" w:color="CCCCCC"/>
-              <w:left w:val="single" w:sz="2" w:space="0" w:color="2E75B6"/>
-              <w:bottom w:val="single" w:sz="1" w:space="0" w:color="CCCCCC"/>
-              <w:right w:val="single" w:sz="1" w:space="0" w:color="CCCCCC"/>
-            </w:tcBorders>
-            <w:shd w:val="clear" w:color="auto" w:fill="FFFFFF"/>
-            <w:tcMar>
-              <w:top w:w="60" w:type="dxa"/>
-              <w:left w:w="120" w:type="dxa"/>
-              <w:bottom w:w="60" w:type="dxa"/>
-              <w:right w:w="120" w:type="dxa"/>
-            </w:tcMar>
-          </w:tcPr>
-          <w:p>
-            <w:r>
-              <w:rPr>
-                <w:sz w:val="21"/>
-                <w:szCs w:val="21"/>
-              </w:rPr>
-              <w:t>The agent can request, consume, and act on streams from at least four distinct enterprise systems without requiring API access to any of them.</w:t>
-            </w:r>
-          </w:p>
-        </w:tc>
-      </w:tr>
-    </w:tbl>
-    <w:p/>
-    <w:p/>
     <w:p/>
     <w:p>
       <w:pPr>
@@ -5461,10 +5068,7 @@
       </w:pPr>
       <w:r>
         <w:lastRenderedPageBreak/>
-        <w:t>5</w:t>
-      </w:r>
-      <w:r>
-        <w:t xml:space="preserve">. Database Fire-and-Forget to </w:t>
+        <w:t xml:space="preserve">5. Database Fire-and-Forget to </w:t>
       </w:r>
       <w:proofErr w:type="gramStart"/>
       <w:r>
@@ -6215,318 +5819,6 @@
       </w:r>
     </w:p>
     <w:p>
-      <w:pPr>
-        <w:spacing w:before="80" w:after="80"/>
-      </w:pPr>
-    </w:p>
-    <w:p>
-      <w:pPr>
-        <w:spacing w:before="80" w:after="80"/>
-      </w:pPr>
-    </w:p>
-    <w:p>
-      <w:pPr>
-        <w:pStyle w:val="Heading2"/>
-      </w:pPr>
-      <w:r>
-        <w:lastRenderedPageBreak/>
-        <w:t>Acceptance Criteria</w:t>
-      </w:r>
-    </w:p>
-    <w:tbl>
-      <w:tblPr>
-        <w:tblW w:w="9360" w:type="dxa"/>
-        <w:tblBorders>
-          <w:top w:val="single" w:sz="4" w:space="0" w:color="auto"/>
-          <w:left w:val="single" w:sz="4" w:space="0" w:color="auto"/>
-          <w:bottom w:val="single" w:sz="4" w:space="0" w:color="auto"/>
-          <w:right w:val="single" w:sz="4" w:space="0" w:color="auto"/>
-          <w:insideH w:val="single" w:sz="4" w:space="0" w:color="auto"/>
-          <w:insideV w:val="single" w:sz="4" w:space="0" w:color="auto"/>
-        </w:tblBorders>
-        <w:tblCellMar>
-          <w:left w:w="10" w:type="dxa"/>
-          <w:right w:w="10" w:type="dxa"/>
-        </w:tblCellMar>
-        <w:tblLook w:val="04A0" w:firstRow="1" w:lastRow="0" w:firstColumn="1" w:lastColumn="0" w:noHBand="0" w:noVBand="1"/>
-      </w:tblPr>
-      <w:tblGrid>
-        <w:gridCol w:w="9360"/>
-      </w:tblGrid>
-      <w:tr>
-        <w:tc>
-          <w:tcPr>
-            <w:tcW w:w="9360" w:type="dxa"/>
-            <w:tcBorders>
-              <w:top w:val="single" w:sz="1" w:space="0" w:color="CCCCCC"/>
-              <w:left w:val="single" w:sz="2" w:space="0" w:color="2E75B6"/>
-              <w:bottom w:val="single" w:sz="1" w:space="0" w:color="CCCCCC"/>
-              <w:right w:val="single" w:sz="1" w:space="0" w:color="CCCCCC"/>
-            </w:tcBorders>
-            <w:shd w:val="clear" w:color="auto" w:fill="FFFFFF"/>
-            <w:tcMar>
-              <w:top w:w="60" w:type="dxa"/>
-              <w:left w:w="120" w:type="dxa"/>
-              <w:bottom w:w="60" w:type="dxa"/>
-              <w:right w:w="120" w:type="dxa"/>
-            </w:tcMar>
-          </w:tcPr>
-          <w:p>
-            <w:r>
-              <w:rPr>
-                <w:sz w:val="21"/>
-                <w:szCs w:val="21"/>
-              </w:rPr>
-              <w:t xml:space="preserve">The </w:t>
-            </w:r>
-            <w:proofErr w:type="spellStart"/>
-            <w:r>
-              <w:rPr>
-                <w:sz w:val="21"/>
-                <w:szCs w:val="21"/>
-              </w:rPr>
-              <w:t>Flink</w:t>
-            </w:r>
-            <w:proofErr w:type="spellEnd"/>
-            <w:r>
-              <w:rPr>
-                <w:sz w:val="21"/>
-                <w:szCs w:val="21"/>
-              </w:rPr>
-              <w:t xml:space="preserve"> pipeline receives change events from all 10 hub PostgreSQL databases over Arrow Flight without polling or scheduled queries.</w:t>
-            </w:r>
-          </w:p>
-        </w:tc>
-      </w:tr>
-      <w:tr>
-        <w:tc>
-          <w:tcPr>
-            <w:tcW w:w="9360" w:type="dxa"/>
-            <w:tcBorders>
-              <w:top w:val="single" w:sz="1" w:space="0" w:color="CCCCCC"/>
-              <w:left w:val="single" w:sz="2" w:space="0" w:color="2E75B6"/>
-              <w:bottom w:val="single" w:sz="1" w:space="0" w:color="CCCCCC"/>
-              <w:right w:val="single" w:sz="1" w:space="0" w:color="CCCCCC"/>
-            </w:tcBorders>
-            <w:shd w:val="clear" w:color="auto" w:fill="F2F2F2"/>
-            <w:tcMar>
-              <w:top w:w="60" w:type="dxa"/>
-              <w:left w:w="120" w:type="dxa"/>
-              <w:bottom w:w="60" w:type="dxa"/>
-              <w:right w:w="120" w:type="dxa"/>
-            </w:tcMar>
-          </w:tcPr>
-          <w:p>
-            <w:r>
-              <w:rPr>
-                <w:sz w:val="21"/>
-                <w:szCs w:val="21"/>
-              </w:rPr>
-              <w:t xml:space="preserve">Events conform to the </w:t>
-            </w:r>
-            <w:proofErr w:type="spellStart"/>
-            <w:r>
-              <w:rPr>
-                <w:sz w:val="21"/>
-                <w:szCs w:val="21"/>
-              </w:rPr>
-              <w:t>OpenCDC</w:t>
-            </w:r>
-            <w:proofErr w:type="spellEnd"/>
-            <w:r>
-              <w:rPr>
-                <w:sz w:val="21"/>
-                <w:szCs w:val="21"/>
-              </w:rPr>
-              <w:t xml:space="preserve"> specification: operation type, before/after record state, source metadata, and sequence position are consistently structured across all hub sources.</w:t>
-            </w:r>
-          </w:p>
-        </w:tc>
-      </w:tr>
-      <w:tr>
-        <w:tc>
-          <w:tcPr>
-            <w:tcW w:w="9360" w:type="dxa"/>
-            <w:tcBorders>
-              <w:top w:val="single" w:sz="1" w:space="0" w:color="CCCCCC"/>
-              <w:left w:val="single" w:sz="2" w:space="0" w:color="2E75B6"/>
-              <w:bottom w:val="single" w:sz="1" w:space="0" w:color="CCCCCC"/>
-              <w:right w:val="single" w:sz="1" w:space="0" w:color="CCCCCC"/>
-            </w:tcBorders>
-            <w:shd w:val="clear" w:color="auto" w:fill="FFFFFF"/>
-            <w:tcMar>
-              <w:top w:w="60" w:type="dxa"/>
-              <w:left w:w="120" w:type="dxa"/>
-              <w:bottom w:w="60" w:type="dxa"/>
-              <w:right w:w="120" w:type="dxa"/>
-            </w:tcMar>
-          </w:tcPr>
-          <w:p>
-            <w:r>
-              <w:rPr>
-                <w:sz w:val="21"/>
-                <w:szCs w:val="21"/>
-              </w:rPr>
-              <w:t xml:space="preserve">The </w:t>
-            </w:r>
-            <w:proofErr w:type="spellStart"/>
-            <w:r>
-              <w:rPr>
-                <w:sz w:val="21"/>
-                <w:szCs w:val="21"/>
-              </w:rPr>
-              <w:t>Flink</w:t>
-            </w:r>
-            <w:proofErr w:type="spellEnd"/>
-            <w:r>
-              <w:rPr>
-                <w:sz w:val="21"/>
-                <w:szCs w:val="21"/>
-              </w:rPr>
-              <w:t xml:space="preserve"> source reconnects automatically after a transient network interruption and resumes consuming from the current stream position.</w:t>
-            </w:r>
-          </w:p>
-        </w:tc>
-      </w:tr>
-      <w:tr>
-        <w:tc>
-          <w:tcPr>
-            <w:tcW w:w="9360" w:type="dxa"/>
-            <w:tcBorders>
-              <w:top w:val="single" w:sz="1" w:space="0" w:color="CCCCCC"/>
-              <w:left w:val="single" w:sz="2" w:space="0" w:color="2E75B6"/>
-              <w:bottom w:val="single" w:sz="1" w:space="0" w:color="CCCCCC"/>
-              <w:right w:val="single" w:sz="1" w:space="0" w:color="CCCCCC"/>
-            </w:tcBorders>
-            <w:shd w:val="clear" w:color="auto" w:fill="F2F2F2"/>
-            <w:tcMar>
-              <w:top w:w="60" w:type="dxa"/>
-              <w:left w:w="120" w:type="dxa"/>
-              <w:bottom w:w="60" w:type="dxa"/>
-              <w:right w:w="120" w:type="dxa"/>
-            </w:tcMar>
-          </w:tcPr>
-          <w:p>
-            <w:r>
-              <w:rPr>
-                <w:sz w:val="21"/>
-                <w:szCs w:val="21"/>
-              </w:rPr>
-              <w:t xml:space="preserve">A single </w:t>
-            </w:r>
-            <w:proofErr w:type="spellStart"/>
-            <w:r>
-              <w:rPr>
-                <w:sz w:val="21"/>
-                <w:szCs w:val="21"/>
-              </w:rPr>
-              <w:t>Flink</w:t>
-            </w:r>
-            <w:proofErr w:type="spellEnd"/>
-            <w:r>
-              <w:rPr>
-                <w:sz w:val="21"/>
-                <w:szCs w:val="21"/>
-              </w:rPr>
-              <w:t xml:space="preserve"> source implementation handles all 10 hub connections without source-specific parsing logic.</w:t>
-            </w:r>
-          </w:p>
-        </w:tc>
-      </w:tr>
-      <w:tr>
-        <w:tc>
-          <w:tcPr>
-            <w:tcW w:w="9360" w:type="dxa"/>
-            <w:tcBorders>
-              <w:top w:val="single" w:sz="1" w:space="0" w:color="CCCCCC"/>
-              <w:left w:val="single" w:sz="2" w:space="0" w:color="2E75B6"/>
-              <w:bottom w:val="single" w:sz="1" w:space="0" w:color="CCCCCC"/>
-              <w:right w:val="single" w:sz="1" w:space="0" w:color="CCCCCC"/>
-            </w:tcBorders>
-            <w:shd w:val="clear" w:color="auto" w:fill="FFFFFF"/>
-            <w:tcMar>
-              <w:top w:w="60" w:type="dxa"/>
-              <w:left w:w="120" w:type="dxa"/>
-              <w:bottom w:w="60" w:type="dxa"/>
-              <w:right w:w="120" w:type="dxa"/>
-            </w:tcMar>
-          </w:tcPr>
-          <w:p>
-            <w:r>
-              <w:rPr>
-                <w:sz w:val="21"/>
-                <w:szCs w:val="21"/>
-              </w:rPr>
-              <w:t>Events are secured in transit via TLS on all hub connections.</w:t>
-            </w:r>
-          </w:p>
-        </w:tc>
-      </w:tr>
-      <w:tr>
-        <w:tc>
-          <w:tcPr>
-            <w:tcW w:w="9360" w:type="dxa"/>
-            <w:tcBorders>
-              <w:top w:val="single" w:sz="1" w:space="0" w:color="CCCCCC"/>
-              <w:left w:val="single" w:sz="2" w:space="0" w:color="2E75B6"/>
-              <w:bottom w:val="single" w:sz="1" w:space="0" w:color="CCCCCC"/>
-              <w:right w:val="single" w:sz="1" w:space="0" w:color="CCCCCC"/>
-            </w:tcBorders>
-            <w:shd w:val="clear" w:color="auto" w:fill="F2F2F2"/>
-            <w:tcMar>
-              <w:top w:w="60" w:type="dxa"/>
-              <w:left w:w="120" w:type="dxa"/>
-              <w:bottom w:w="60" w:type="dxa"/>
-              <w:right w:w="120" w:type="dxa"/>
-            </w:tcMar>
-          </w:tcPr>
-          <w:p>
-            <w:r>
-              <w:rPr>
-                <w:sz w:val="21"/>
-                <w:szCs w:val="21"/>
-              </w:rPr>
-              <w:t>No agent installation or broker infrastructure is required at hub sites beyond enabling the Postgres extension.</w:t>
-            </w:r>
-          </w:p>
-        </w:tc>
-      </w:tr>
-      <w:tr>
-        <w:tc>
-          <w:tcPr>
-            <w:tcW w:w="9360" w:type="dxa"/>
-            <w:tcBorders>
-              <w:top w:val="single" w:sz="1" w:space="0" w:color="CCCCCC"/>
-              <w:left w:val="single" w:sz="2" w:space="0" w:color="2E75B6"/>
-              <w:bottom w:val="single" w:sz="1" w:space="0" w:color="CCCCCC"/>
-              <w:right w:val="single" w:sz="1" w:space="0" w:color="CCCCCC"/>
-            </w:tcBorders>
-            <w:shd w:val="clear" w:color="auto" w:fill="FFFFFF"/>
-            <w:tcMar>
-              <w:top w:w="60" w:type="dxa"/>
-              <w:left w:w="120" w:type="dxa"/>
-              <w:bottom w:w="60" w:type="dxa"/>
-              <w:right w:w="120" w:type="dxa"/>
-            </w:tcMar>
-          </w:tcPr>
-          <w:p>
-            <w:r>
-              <w:rPr>
-                <w:sz w:val="21"/>
-                <w:szCs w:val="21"/>
-              </w:rPr>
-              <w:t>Loss of events during a planned or unplanned stream outage is acceptable and does not constitute an SLA breach.</w:t>
-            </w:r>
-          </w:p>
-        </w:tc>
-      </w:tr>
-    </w:tbl>
-    <w:p>
-      <w:pPr>
-        <w:spacing w:before="160"/>
-      </w:pPr>
-    </w:p>
-    <w:p>
       <w:r>
         <w:br w:type="page"/>
       </w:r>
@@ -6541,10 +5833,7 @@
       <w:bookmarkStart w:id="3" w:name="_Toc228712295"/>
       <w:r>
         <w:lastRenderedPageBreak/>
-        <w:t>6</w:t>
-      </w:r>
-      <w:r>
-        <w:t>. Database-to-Database Sync Without CDC Tools</w:t>
+        <w:t>6. Database-to-Database Sync Without CDC Tools</w:t>
       </w:r>
       <w:bookmarkEnd w:id="3"/>
     </w:p>
@@ -7154,457 +6443,6 @@
     <w:p>
       <w:pPr>
         <w:spacing w:before="80" w:after="80"/>
-      </w:pPr>
-    </w:p>
-    <w:p>
-      <w:pPr>
-        <w:spacing w:before="80" w:after="80"/>
-      </w:pPr>
-    </w:p>
-    <w:p>
-      <w:pPr>
-        <w:spacing w:before="80" w:after="80"/>
-      </w:pPr>
-    </w:p>
-    <w:p>
-      <w:pPr>
-        <w:spacing w:before="80" w:after="80"/>
-      </w:pPr>
-    </w:p>
-    <w:p>
-      <w:pPr>
-        <w:spacing w:before="80" w:after="80"/>
-      </w:pPr>
-    </w:p>
-    <w:p>
-      <w:pPr>
-        <w:spacing w:before="80" w:after="80"/>
-      </w:pPr>
-    </w:p>
-    <w:p>
-      <w:pPr>
-        <w:spacing w:before="80" w:after="80"/>
-      </w:pPr>
-    </w:p>
-    <w:p>
-      <w:pPr>
-        <w:pStyle w:val="Heading2"/>
-      </w:pPr>
-      <w:r>
-        <w:lastRenderedPageBreak/>
-        <w:t>Acceptance Criteria</w:t>
-      </w:r>
-    </w:p>
-    <w:tbl>
-      <w:tblPr>
-        <w:tblW w:w="9360" w:type="dxa"/>
-        <w:tblBorders>
-          <w:top w:val="single" w:sz="4" w:space="0" w:color="auto"/>
-          <w:left w:val="single" w:sz="4" w:space="0" w:color="auto"/>
-          <w:bottom w:val="single" w:sz="4" w:space="0" w:color="auto"/>
-          <w:right w:val="single" w:sz="4" w:space="0" w:color="auto"/>
-          <w:insideH w:val="single" w:sz="4" w:space="0" w:color="auto"/>
-          <w:insideV w:val="single" w:sz="4" w:space="0" w:color="auto"/>
-        </w:tblBorders>
-        <w:tblCellMar>
-          <w:left w:w="10" w:type="dxa"/>
-          <w:right w:w="10" w:type="dxa"/>
-        </w:tblCellMar>
-        <w:tblLook w:val="04A0" w:firstRow="1" w:lastRow="0" w:firstColumn="1" w:lastColumn="0" w:noHBand="0" w:noVBand="1"/>
-      </w:tblPr>
-      <w:tblGrid>
-        <w:gridCol w:w="9360"/>
-      </w:tblGrid>
-      <w:tr>
-        <w:tc>
-          <w:tcPr>
-            <w:tcW w:w="9360" w:type="dxa"/>
-            <w:tcBorders>
-              <w:top w:val="single" w:sz="1" w:space="0" w:color="CCCCCC"/>
-              <w:left w:val="single" w:sz="2" w:space="0" w:color="2E75B6"/>
-              <w:bottom w:val="single" w:sz="1" w:space="0" w:color="CCCCCC"/>
-              <w:right w:val="single" w:sz="1" w:space="0" w:color="CCCCCC"/>
-            </w:tcBorders>
-            <w:shd w:val="clear" w:color="auto" w:fill="FFFFFF"/>
-            <w:tcMar>
-              <w:top w:w="60" w:type="dxa"/>
-              <w:left w:w="120" w:type="dxa"/>
-              <w:bottom w:w="60" w:type="dxa"/>
-              <w:right w:w="120" w:type="dxa"/>
-            </w:tcMar>
-          </w:tcPr>
-          <w:p>
-            <w:r>
-              <w:rPr>
-                <w:sz w:val="21"/>
-                <w:szCs w:val="21"/>
-              </w:rPr>
-              <w:t xml:space="preserve">Aurora PostgreSQL emits </w:t>
-            </w:r>
-            <w:proofErr w:type="spellStart"/>
-            <w:r>
-              <w:rPr>
-                <w:sz w:val="21"/>
-                <w:szCs w:val="21"/>
-              </w:rPr>
-              <w:t>OpenCDC</w:t>
-            </w:r>
-            <w:proofErr w:type="spellEnd"/>
-            <w:r>
-              <w:rPr>
-                <w:sz w:val="21"/>
-                <w:szCs w:val="21"/>
-              </w:rPr>
-              <w:t>-formatted change events for a configured subset of tables directly to a managed messaging service without requiring an external CDC tool.</w:t>
-            </w:r>
-          </w:p>
-        </w:tc>
-      </w:tr>
-      <w:tr>
-        <w:tc>
-          <w:tcPr>
-            <w:tcW w:w="9360" w:type="dxa"/>
-            <w:tcBorders>
-              <w:top w:val="single" w:sz="1" w:space="0" w:color="CCCCCC"/>
-              <w:left w:val="single" w:sz="2" w:space="0" w:color="2E75B6"/>
-              <w:bottom w:val="single" w:sz="1" w:space="0" w:color="CCCCCC"/>
-              <w:right w:val="single" w:sz="1" w:space="0" w:color="CCCCCC"/>
-            </w:tcBorders>
-            <w:shd w:val="clear" w:color="auto" w:fill="F2F2F2"/>
-            <w:tcMar>
-              <w:top w:w="60" w:type="dxa"/>
-              <w:left w:w="120" w:type="dxa"/>
-              <w:bottom w:w="60" w:type="dxa"/>
-              <w:right w:w="120" w:type="dxa"/>
-            </w:tcMar>
-          </w:tcPr>
-          <w:p>
-            <w:r>
-              <w:rPr>
-                <w:sz w:val="21"/>
-                <w:szCs w:val="21"/>
-              </w:rPr>
-              <w:t>SQL Server consumes those events and applies them to corresponding tables, preserving data integrity and operation semantics.</w:t>
-            </w:r>
-          </w:p>
-        </w:tc>
-      </w:tr>
-      <w:tr>
-        <w:tc>
-          <w:tcPr>
-            <w:tcW w:w="9360" w:type="dxa"/>
-            <w:tcBorders>
-              <w:top w:val="single" w:sz="1" w:space="0" w:color="CCCCCC"/>
-              <w:left w:val="single" w:sz="2" w:space="0" w:color="2E75B6"/>
-              <w:bottom w:val="single" w:sz="1" w:space="0" w:color="CCCCCC"/>
-              <w:right w:val="single" w:sz="1" w:space="0" w:color="CCCCCC"/>
-            </w:tcBorders>
-            <w:shd w:val="clear" w:color="auto" w:fill="FFFFFF"/>
-            <w:tcMar>
-              <w:top w:w="60" w:type="dxa"/>
-              <w:left w:w="120" w:type="dxa"/>
-              <w:bottom w:w="60" w:type="dxa"/>
-              <w:right w:w="120" w:type="dxa"/>
-            </w:tcMar>
-          </w:tcPr>
-          <w:p>
-            <w:r>
-              <w:rPr>
-                <w:sz w:val="21"/>
-                <w:szCs w:val="21"/>
-              </w:rPr>
-              <w:t xml:space="preserve">SQL Server emits its own </w:t>
-            </w:r>
-            <w:proofErr w:type="spellStart"/>
-            <w:r>
-              <w:rPr>
-                <w:sz w:val="21"/>
-                <w:szCs w:val="21"/>
-              </w:rPr>
-              <w:t>OpenCDC</w:t>
-            </w:r>
-            <w:proofErr w:type="spellEnd"/>
-            <w:r>
-              <w:rPr>
-                <w:sz w:val="21"/>
-                <w:szCs w:val="21"/>
-              </w:rPr>
-              <w:t>-formatted change events for the same subset of tables, which are consumed and applied by Aurora PostgreSQL.</w:t>
-            </w:r>
-          </w:p>
-        </w:tc>
-      </w:tr>
-      <w:tr>
-        <w:tc>
-          <w:tcPr>
-            <w:tcW w:w="9360" w:type="dxa"/>
-            <w:tcBorders>
-              <w:top w:val="single" w:sz="1" w:space="0" w:color="CCCCCC"/>
-              <w:left w:val="single" w:sz="2" w:space="0" w:color="2E75B6"/>
-              <w:bottom w:val="single" w:sz="1" w:space="0" w:color="CCCCCC"/>
-              <w:right w:val="single" w:sz="1" w:space="0" w:color="CCCCCC"/>
-            </w:tcBorders>
-            <w:shd w:val="clear" w:color="auto" w:fill="F2F2F2"/>
-            <w:tcMar>
-              <w:top w:w="60" w:type="dxa"/>
-              <w:left w:w="120" w:type="dxa"/>
-              <w:bottom w:w="60" w:type="dxa"/>
-              <w:right w:w="120" w:type="dxa"/>
-            </w:tcMar>
-          </w:tcPr>
-          <w:p>
-            <w:r>
-              <w:rPr>
-                <w:sz w:val="21"/>
-                <w:szCs w:val="21"/>
-              </w:rPr>
-              <w:t xml:space="preserve">Events include operation type, before/after record state, source metadata, and a monotonic sequence identifier consistent with the </w:t>
-            </w:r>
-            <w:proofErr w:type="spellStart"/>
-            <w:r>
-              <w:rPr>
-                <w:sz w:val="21"/>
-                <w:szCs w:val="21"/>
-              </w:rPr>
-              <w:t>OpenCDC</w:t>
-            </w:r>
-            <w:proofErr w:type="spellEnd"/>
-            <w:r>
-              <w:rPr>
-                <w:sz w:val="21"/>
-                <w:szCs w:val="21"/>
-              </w:rPr>
-              <w:t xml:space="preserve"> specification.</w:t>
-            </w:r>
-          </w:p>
-        </w:tc>
-      </w:tr>
-      <w:tr>
-        <w:tc>
-          <w:tcPr>
-            <w:tcW w:w="9360" w:type="dxa"/>
-            <w:tcBorders>
-              <w:top w:val="single" w:sz="1" w:space="0" w:color="CCCCCC"/>
-              <w:left w:val="single" w:sz="2" w:space="0" w:color="2E75B6"/>
-              <w:bottom w:val="single" w:sz="1" w:space="0" w:color="CCCCCC"/>
-              <w:right w:val="single" w:sz="1" w:space="0" w:color="CCCCCC"/>
-            </w:tcBorders>
-            <w:shd w:val="clear" w:color="auto" w:fill="FFFFFF"/>
-            <w:tcMar>
-              <w:top w:w="60" w:type="dxa"/>
-              <w:left w:w="120" w:type="dxa"/>
-              <w:bottom w:w="60" w:type="dxa"/>
-              <w:right w:w="120" w:type="dxa"/>
-            </w:tcMar>
-          </w:tcPr>
-          <w:p>
-            <w:r>
-              <w:rPr>
-                <w:sz w:val="21"/>
-                <w:szCs w:val="21"/>
-              </w:rPr>
-              <w:t>Data types are preserved across PostgreSQL and SQL Server without loss of precision or semantic ambiguity.</w:t>
-            </w:r>
-          </w:p>
-        </w:tc>
-      </w:tr>
-      <w:tr>
-        <w:tc>
-          <w:tcPr>
-            <w:tcW w:w="9360" w:type="dxa"/>
-            <w:tcBorders>
-              <w:top w:val="single" w:sz="1" w:space="0" w:color="CCCCCC"/>
-              <w:left w:val="single" w:sz="2" w:space="0" w:color="2E75B6"/>
-              <w:bottom w:val="single" w:sz="1" w:space="0" w:color="CCCCCC"/>
-              <w:right w:val="single" w:sz="1" w:space="0" w:color="CCCCCC"/>
-            </w:tcBorders>
-            <w:shd w:val="clear" w:color="auto" w:fill="F2F2F2"/>
-            <w:tcMar>
-              <w:top w:w="60" w:type="dxa"/>
-              <w:left w:w="120" w:type="dxa"/>
-              <w:bottom w:w="60" w:type="dxa"/>
-              <w:right w:w="120" w:type="dxa"/>
-            </w:tcMar>
-          </w:tcPr>
-          <w:p>
-            <w:r>
-              <w:rPr>
-                <w:sz w:val="21"/>
-                <w:szCs w:val="21"/>
-              </w:rPr>
-              <w:t>Multi-row transactions are applied in order and maintain logical consistency on both sides.</w:t>
-            </w:r>
-          </w:p>
-        </w:tc>
-      </w:tr>
-      <w:tr>
-        <w:tc>
-          <w:tcPr>
-            <w:tcW w:w="9360" w:type="dxa"/>
-            <w:tcBorders>
-              <w:top w:val="single" w:sz="1" w:space="0" w:color="CCCCCC"/>
-              <w:left w:val="single" w:sz="2" w:space="0" w:color="2E75B6"/>
-              <w:bottom w:val="single" w:sz="1" w:space="0" w:color="CCCCCC"/>
-              <w:right w:val="single" w:sz="1" w:space="0" w:color="CCCCCC"/>
-            </w:tcBorders>
-            <w:shd w:val="clear" w:color="auto" w:fill="FFFFFF"/>
-            <w:tcMar>
-              <w:top w:w="60" w:type="dxa"/>
-              <w:left w:w="120" w:type="dxa"/>
-              <w:bottom w:w="60" w:type="dxa"/>
-              <w:right w:w="120" w:type="dxa"/>
-            </w:tcMar>
-          </w:tcPr>
-          <w:p>
-            <w:r>
-              <w:rPr>
-                <w:sz w:val="21"/>
-                <w:szCs w:val="21"/>
-              </w:rPr>
-              <w:t>A transient network or messaging outage does not result in data corruption; processing resumes from the last successfully applied event position.</w:t>
-            </w:r>
-          </w:p>
-        </w:tc>
-      </w:tr>
-      <w:tr>
-        <w:tc>
-          <w:tcPr>
-            <w:tcW w:w="9360" w:type="dxa"/>
-            <w:tcBorders>
-              <w:top w:val="single" w:sz="1" w:space="0" w:color="CCCCCC"/>
-              <w:left w:val="single" w:sz="2" w:space="0" w:color="2E75B6"/>
-              <w:bottom w:val="single" w:sz="1" w:space="0" w:color="CCCCCC"/>
-              <w:right w:val="single" w:sz="1" w:space="0" w:color="CCCCCC"/>
-            </w:tcBorders>
-            <w:shd w:val="clear" w:color="auto" w:fill="F2F2F2"/>
-            <w:tcMar>
-              <w:top w:w="60" w:type="dxa"/>
-              <w:left w:w="120" w:type="dxa"/>
-              <w:bottom w:w="60" w:type="dxa"/>
-              <w:right w:w="120" w:type="dxa"/>
-            </w:tcMar>
-          </w:tcPr>
-          <w:p>
-            <w:r>
-              <w:rPr>
-                <w:sz w:val="21"/>
-                <w:szCs w:val="21"/>
-              </w:rPr>
-              <w:t xml:space="preserve">Loop detection prevents an event originating in one system from being re-emitted after the other system applies it, using </w:t>
-            </w:r>
-            <w:proofErr w:type="spellStart"/>
-            <w:r>
-              <w:rPr>
-                <w:sz w:val="21"/>
-                <w:szCs w:val="21"/>
-              </w:rPr>
-              <w:t>OpenCDC</w:t>
-            </w:r>
-            <w:proofErr w:type="spellEnd"/>
-            <w:r>
-              <w:rPr>
-                <w:sz w:val="21"/>
-                <w:szCs w:val="21"/>
-              </w:rPr>
-              <w:t xml:space="preserve"> source metadata.</w:t>
-            </w:r>
-          </w:p>
-        </w:tc>
-      </w:tr>
-      <w:tr>
-        <w:tc>
-          <w:tcPr>
-            <w:tcW w:w="9360" w:type="dxa"/>
-            <w:tcBorders>
-              <w:top w:val="single" w:sz="1" w:space="0" w:color="CCCCCC"/>
-              <w:left w:val="single" w:sz="2" w:space="0" w:color="2E75B6"/>
-              <w:bottom w:val="single" w:sz="1" w:space="0" w:color="CCCCCC"/>
-              <w:right w:val="single" w:sz="1" w:space="0" w:color="CCCCCC"/>
-            </w:tcBorders>
-            <w:shd w:val="clear" w:color="auto" w:fill="FFFFFF"/>
-            <w:tcMar>
-              <w:top w:w="60" w:type="dxa"/>
-              <w:left w:w="120" w:type="dxa"/>
-              <w:bottom w:w="60" w:type="dxa"/>
-              <w:right w:w="120" w:type="dxa"/>
-            </w:tcMar>
-          </w:tcPr>
-          <w:p>
-            <w:r>
-              <w:rPr>
-                <w:sz w:val="21"/>
-                <w:szCs w:val="21"/>
-              </w:rPr>
-              <w:t>No dedicated CDC tools (</w:t>
-            </w:r>
-            <w:proofErr w:type="spellStart"/>
-            <w:r>
-              <w:rPr>
-                <w:sz w:val="21"/>
-                <w:szCs w:val="21"/>
-              </w:rPr>
-              <w:t>Debezium</w:t>
-            </w:r>
-            <w:proofErr w:type="spellEnd"/>
-            <w:r>
-              <w:rPr>
-                <w:sz w:val="21"/>
-                <w:szCs w:val="21"/>
-              </w:rPr>
-              <w:t>, GoldenGate, Kafka) are installed or required in either environment.</w:t>
-            </w:r>
-          </w:p>
-        </w:tc>
-      </w:tr>
-      <w:tr>
-        <w:tc>
-          <w:tcPr>
-            <w:tcW w:w="9360" w:type="dxa"/>
-            <w:tcBorders>
-              <w:top w:val="single" w:sz="1" w:space="0" w:color="CCCCCC"/>
-              <w:left w:val="single" w:sz="2" w:space="0" w:color="2E75B6"/>
-              <w:bottom w:val="single" w:sz="1" w:space="0" w:color="CCCCCC"/>
-              <w:right w:val="single" w:sz="1" w:space="0" w:color="CCCCCC"/>
-            </w:tcBorders>
-            <w:shd w:val="clear" w:color="auto" w:fill="F2F2F2"/>
-            <w:tcMar>
-              <w:top w:w="60" w:type="dxa"/>
-              <w:left w:w="120" w:type="dxa"/>
-              <w:bottom w:w="60" w:type="dxa"/>
-              <w:right w:w="120" w:type="dxa"/>
-            </w:tcMar>
-          </w:tcPr>
-          <w:p>
-            <w:r>
-              <w:rPr>
-                <w:sz w:val="21"/>
-                <w:szCs w:val="21"/>
-              </w:rPr>
-              <w:t xml:space="preserve">A DBA can validate event conformance using the </w:t>
-            </w:r>
-            <w:proofErr w:type="spellStart"/>
-            <w:r>
-              <w:rPr>
-                <w:sz w:val="21"/>
-                <w:szCs w:val="21"/>
-              </w:rPr>
-              <w:t>OpenCDC</w:t>
-            </w:r>
-            <w:proofErr w:type="spellEnd"/>
-            <w:r>
-              <w:rPr>
-                <w:sz w:val="21"/>
-                <w:szCs w:val="21"/>
-              </w:rPr>
-              <w:t xml:space="preserve"> schema specification without vendor-specific tooling.</w:t>
-            </w:r>
-          </w:p>
-        </w:tc>
-      </w:tr>
-    </w:tbl>
-    <w:p>
-      <w:pPr>
-        <w:spacing w:before="160"/>
       </w:pPr>
     </w:p>
     <w:p/>
@@ -7797,6 +6635,232 @@
 <file path=word/numbering.xml><?xml version="1.0" encoding="utf-8"?>
 <w:numbering xmlns:wpc="http://schemas.microsoft.com/office/word/2010/wordprocessingCanvas" xmlns:cx="http://schemas.microsoft.com/office/drawing/2014/chartex" xmlns:cx1="http://schemas.microsoft.com/office/drawing/2015/9/8/chartex" xmlns:cx2="http://schemas.microsoft.com/office/drawing/2015/10/21/chartex" xmlns:cx3="http://schemas.microsoft.com/office/drawing/2016/5/9/chartex" xmlns:cx4="http://schemas.microsoft.com/office/drawing/2016/5/10/chartex" xmlns:cx5="http://schemas.microsoft.com/office/drawing/2016/5/11/chartex" xmlns:cx6="http://schemas.microsoft.com/office/drawing/2016/5/12/chartex" xmlns:cx7="http://schemas.microsoft.com/office/drawing/2016/5/13/chartex" xmlns:cx8="http://schemas.microsoft.com/office/drawing/2016/5/14/chartex" xmlns:mc="http://schemas.openxmlformats.org/markup-compatibility/2006" xmlns:aink="http://schemas.microsoft.com/office/drawing/2016/ink" xmlns:am3d="http://schemas.microsoft.com/office/drawing/2017/model3d" xmlns:o="urn:schemas-microsoft-com:office:office" xmlns:oel="http://schemas.microsoft.com/office/2019/extlst" xmlns:r="http://schemas.openxmlformats.org/officeDocument/2006/relationships" xmlns:m="http://schemas.openxmlformats.org/officeDocument/2006/math" xmlns:v="urn:schemas-microsoft-com:vml" xmlns:wp14="http://schemas.microsoft.com/office/word/2010/wordprocessingDrawing" xmlns:wp="http://schemas.openxmlformats.org/drawingml/2006/wordprocessingDrawing" xmlns:w10="urn:schemas-microsoft-com:office:word" xmlns:w="http://schemas.openxmlformats.org/wordprocessingml/2006/main" xmlns:w14="http://schemas.microsoft.com/office/word/2010/wordml" xmlns:w15="http://schemas.microsoft.com/office/word/2012/wordml" xmlns:w16cex="http://schemas.microsoft.com/office/word/2018/wordml/cex" xmlns:w16cid="http://schemas.microsoft.com/office/word/2016/wordml/cid" xmlns:w16="http://schemas.microsoft.com/office/word/2018/wordml" xmlns:w16sdtdh="http://schemas.microsoft.com/office/word/2020/wordml/sdtdatahash" xmlns:w16se="http://schemas.microsoft.com/office/word/2015/wordml/symex" xmlns:wpg="http://schemas.microsoft.com/office/word/2010/wordprocessingGroup" xmlns:wpi="http://schemas.microsoft.com/office/word/2010/wordprocessingInk" xmlns:wne="http://schemas.microsoft.com/office/word/2006/wordml" xmlns:wps="http://schemas.microsoft.com/office/word/2010/wordprocessingShape" mc:Ignorable="w14 w15 w16se w16cid w16 w16cex w16sdtdh wp14">
   <w:abstractNum w:abstractNumId="0" w15:restartNumberingAfterBreak="0">
+    <w:nsid w:val="04B66810"/>
+    <w:multiLevelType w:val="hybridMultilevel"/>
+    <w:tmpl w:val="E174D61E"/>
+    <w:lvl w:ilvl="0" w:tplc="04090001">
+      <w:start w:val="1"/>
+      <w:numFmt w:val="bullet"/>
+      <w:lvlText w:val=""/>
+      <w:lvlJc w:val="left"/>
+      <w:pPr>
+        <w:ind w:left="720" w:hanging="360"/>
+      </w:pPr>
+      <w:rPr>
+        <w:rFonts w:ascii="Symbol" w:hAnsi="Symbol" w:hint="default"/>
+      </w:rPr>
+    </w:lvl>
+    <w:lvl w:ilvl="1" w:tplc="04090003" w:tentative="1">
+      <w:start w:val="1"/>
+      <w:numFmt w:val="bullet"/>
+      <w:lvlText w:val="o"/>
+      <w:lvlJc w:val="left"/>
+      <w:pPr>
+        <w:ind w:left="1440" w:hanging="360"/>
+      </w:pPr>
+      <w:rPr>
+        <w:rFonts w:ascii="Courier New" w:hAnsi="Courier New" w:cs="Courier New" w:hint="default"/>
+      </w:rPr>
+    </w:lvl>
+    <w:lvl w:ilvl="2" w:tplc="04090005" w:tentative="1">
+      <w:start w:val="1"/>
+      <w:numFmt w:val="bullet"/>
+      <w:lvlText w:val=""/>
+      <w:lvlJc w:val="left"/>
+      <w:pPr>
+        <w:ind w:left="2160" w:hanging="360"/>
+      </w:pPr>
+      <w:rPr>
+        <w:rFonts w:ascii="Wingdings" w:hAnsi="Wingdings" w:hint="default"/>
+      </w:rPr>
+    </w:lvl>
+    <w:lvl w:ilvl="3" w:tplc="04090001" w:tentative="1">
+      <w:start w:val="1"/>
+      <w:numFmt w:val="bullet"/>
+      <w:lvlText w:val=""/>
+      <w:lvlJc w:val="left"/>
+      <w:pPr>
+        <w:ind w:left="2880" w:hanging="360"/>
+      </w:pPr>
+      <w:rPr>
+        <w:rFonts w:ascii="Symbol" w:hAnsi="Symbol" w:hint="default"/>
+      </w:rPr>
+    </w:lvl>
+    <w:lvl w:ilvl="4" w:tplc="04090003" w:tentative="1">
+      <w:start w:val="1"/>
+      <w:numFmt w:val="bullet"/>
+      <w:lvlText w:val="o"/>
+      <w:lvlJc w:val="left"/>
+      <w:pPr>
+        <w:ind w:left="3600" w:hanging="360"/>
+      </w:pPr>
+      <w:rPr>
+        <w:rFonts w:ascii="Courier New" w:hAnsi="Courier New" w:cs="Courier New" w:hint="default"/>
+      </w:rPr>
+    </w:lvl>
+    <w:lvl w:ilvl="5" w:tplc="04090005" w:tentative="1">
+      <w:start w:val="1"/>
+      <w:numFmt w:val="bullet"/>
+      <w:lvlText w:val=""/>
+      <w:lvlJc w:val="left"/>
+      <w:pPr>
+        <w:ind w:left="4320" w:hanging="360"/>
+      </w:pPr>
+      <w:rPr>
+        <w:rFonts w:ascii="Wingdings" w:hAnsi="Wingdings" w:hint="default"/>
+      </w:rPr>
+    </w:lvl>
+    <w:lvl w:ilvl="6" w:tplc="04090001" w:tentative="1">
+      <w:start w:val="1"/>
+      <w:numFmt w:val="bullet"/>
+      <w:lvlText w:val=""/>
+      <w:lvlJc w:val="left"/>
+      <w:pPr>
+        <w:ind w:left="5040" w:hanging="360"/>
+      </w:pPr>
+      <w:rPr>
+        <w:rFonts w:ascii="Symbol" w:hAnsi="Symbol" w:hint="default"/>
+      </w:rPr>
+    </w:lvl>
+    <w:lvl w:ilvl="7" w:tplc="04090003" w:tentative="1">
+      <w:start w:val="1"/>
+      <w:numFmt w:val="bullet"/>
+      <w:lvlText w:val="o"/>
+      <w:lvlJc w:val="left"/>
+      <w:pPr>
+        <w:ind w:left="5760" w:hanging="360"/>
+      </w:pPr>
+      <w:rPr>
+        <w:rFonts w:ascii="Courier New" w:hAnsi="Courier New" w:cs="Courier New" w:hint="default"/>
+      </w:rPr>
+    </w:lvl>
+    <w:lvl w:ilvl="8" w:tplc="04090005" w:tentative="1">
+      <w:start w:val="1"/>
+      <w:numFmt w:val="bullet"/>
+      <w:lvlText w:val=""/>
+      <w:lvlJc w:val="left"/>
+      <w:pPr>
+        <w:ind w:left="6480" w:hanging="360"/>
+      </w:pPr>
+      <w:rPr>
+        <w:rFonts w:ascii="Wingdings" w:hAnsi="Wingdings" w:hint="default"/>
+      </w:rPr>
+    </w:lvl>
+  </w:abstractNum>
+  <w:abstractNum w:abstractNumId="1" w15:restartNumberingAfterBreak="0">
+    <w:nsid w:val="04C519D4"/>
+    <w:multiLevelType w:val="hybridMultilevel"/>
+    <w:tmpl w:val="4330EF00"/>
+    <w:lvl w:ilvl="0" w:tplc="04090001">
+      <w:start w:val="1"/>
+      <w:numFmt w:val="bullet"/>
+      <w:lvlText w:val=""/>
+      <w:lvlJc w:val="left"/>
+      <w:pPr>
+        <w:ind w:left="720" w:hanging="360"/>
+      </w:pPr>
+      <w:rPr>
+        <w:rFonts w:ascii="Symbol" w:hAnsi="Symbol" w:hint="default"/>
+      </w:rPr>
+    </w:lvl>
+    <w:lvl w:ilvl="1" w:tplc="04090003" w:tentative="1">
+      <w:start w:val="1"/>
+      <w:numFmt w:val="bullet"/>
+      <w:lvlText w:val="o"/>
+      <w:lvlJc w:val="left"/>
+      <w:pPr>
+        <w:ind w:left="1440" w:hanging="360"/>
+      </w:pPr>
+      <w:rPr>
+        <w:rFonts w:ascii="Courier New" w:hAnsi="Courier New" w:cs="Courier New" w:hint="default"/>
+      </w:rPr>
+    </w:lvl>
+    <w:lvl w:ilvl="2" w:tplc="04090005" w:tentative="1">
+      <w:start w:val="1"/>
+      <w:numFmt w:val="bullet"/>
+      <w:lvlText w:val=""/>
+      <w:lvlJc w:val="left"/>
+      <w:pPr>
+        <w:ind w:left="2160" w:hanging="360"/>
+      </w:pPr>
+      <w:rPr>
+        <w:rFonts w:ascii="Wingdings" w:hAnsi="Wingdings" w:hint="default"/>
+      </w:rPr>
+    </w:lvl>
+    <w:lvl w:ilvl="3" w:tplc="04090001" w:tentative="1">
+      <w:start w:val="1"/>
+      <w:numFmt w:val="bullet"/>
+      <w:lvlText w:val=""/>
+      <w:lvlJc w:val="left"/>
+      <w:pPr>
+        <w:ind w:left="2880" w:hanging="360"/>
+      </w:pPr>
+      <w:rPr>
+        <w:rFonts w:ascii="Symbol" w:hAnsi="Symbol" w:hint="default"/>
+      </w:rPr>
+    </w:lvl>
+    <w:lvl w:ilvl="4" w:tplc="04090003" w:tentative="1">
+      <w:start w:val="1"/>
+      <w:numFmt w:val="bullet"/>
+      <w:lvlText w:val="o"/>
+      <w:lvlJc w:val="left"/>
+      <w:pPr>
+        <w:ind w:left="3600" w:hanging="360"/>
+      </w:pPr>
+      <w:rPr>
+        <w:rFonts w:ascii="Courier New" w:hAnsi="Courier New" w:cs="Courier New" w:hint="default"/>
+      </w:rPr>
+    </w:lvl>
+    <w:lvl w:ilvl="5" w:tplc="04090005" w:tentative="1">
+      <w:start w:val="1"/>
+      <w:numFmt w:val="bullet"/>
+      <w:lvlText w:val=""/>
+      <w:lvlJc w:val="left"/>
+      <w:pPr>
+        <w:ind w:left="4320" w:hanging="360"/>
+      </w:pPr>
+      <w:rPr>
+        <w:rFonts w:ascii="Wingdings" w:hAnsi="Wingdings" w:hint="default"/>
+      </w:rPr>
+    </w:lvl>
+    <w:lvl w:ilvl="6" w:tplc="04090001" w:tentative="1">
+      <w:start w:val="1"/>
+      <w:numFmt w:val="bullet"/>
+      <w:lvlText w:val=""/>
+      <w:lvlJc w:val="left"/>
+      <w:pPr>
+        <w:ind w:left="5040" w:hanging="360"/>
+      </w:pPr>
+      <w:rPr>
+        <w:rFonts w:ascii="Symbol" w:hAnsi="Symbol" w:hint="default"/>
+      </w:rPr>
+    </w:lvl>
+    <w:lvl w:ilvl="7" w:tplc="04090003" w:tentative="1">
+      <w:start w:val="1"/>
+      <w:numFmt w:val="bullet"/>
+      <w:lvlText w:val="o"/>
+      <w:lvlJc w:val="left"/>
+      <w:pPr>
+        <w:ind w:left="5760" w:hanging="360"/>
+      </w:pPr>
+      <w:rPr>
+        <w:rFonts w:ascii="Courier New" w:hAnsi="Courier New" w:cs="Courier New" w:hint="default"/>
+      </w:rPr>
+    </w:lvl>
+    <w:lvl w:ilvl="8" w:tplc="04090005" w:tentative="1">
+      <w:start w:val="1"/>
+      <w:numFmt w:val="bullet"/>
+      <w:lvlText w:val=""/>
+      <w:lvlJc w:val="left"/>
+      <w:pPr>
+        <w:ind w:left="6480" w:hanging="360"/>
+      </w:pPr>
+      <w:rPr>
+        <w:rFonts w:ascii="Wingdings" w:hAnsi="Wingdings" w:hint="default"/>
+      </w:rPr>
+    </w:lvl>
+  </w:abstractNum>
+  <w:abstractNum w:abstractNumId="2" w15:restartNumberingAfterBreak="0">
     <w:nsid w:val="4C052247"/>
     <w:multiLevelType w:val="hybridMultilevel"/>
     <w:tmpl w:val="75EE8EF4"/>
@@ -7882,7 +6946,120 @@
       </w:pPr>
     </w:lvl>
   </w:abstractNum>
-  <w:abstractNum w:abstractNumId="1" w15:restartNumberingAfterBreak="0">
+  <w:abstractNum w:abstractNumId="3" w15:restartNumberingAfterBreak="0">
+    <w:nsid w:val="5F3F3BDF"/>
+    <w:multiLevelType w:val="hybridMultilevel"/>
+    <w:tmpl w:val="3F7A8D0C"/>
+    <w:lvl w:ilvl="0" w:tplc="04090001">
+      <w:start w:val="1"/>
+      <w:numFmt w:val="bullet"/>
+      <w:lvlText w:val=""/>
+      <w:lvlJc w:val="left"/>
+      <w:pPr>
+        <w:ind w:left="720" w:hanging="360"/>
+      </w:pPr>
+      <w:rPr>
+        <w:rFonts w:ascii="Symbol" w:hAnsi="Symbol" w:hint="default"/>
+      </w:rPr>
+    </w:lvl>
+    <w:lvl w:ilvl="1" w:tplc="04090003" w:tentative="1">
+      <w:start w:val="1"/>
+      <w:numFmt w:val="bullet"/>
+      <w:lvlText w:val="o"/>
+      <w:lvlJc w:val="left"/>
+      <w:pPr>
+        <w:ind w:left="1440" w:hanging="360"/>
+      </w:pPr>
+      <w:rPr>
+        <w:rFonts w:ascii="Courier New" w:hAnsi="Courier New" w:cs="Courier New" w:hint="default"/>
+      </w:rPr>
+    </w:lvl>
+    <w:lvl w:ilvl="2" w:tplc="04090005" w:tentative="1">
+      <w:start w:val="1"/>
+      <w:numFmt w:val="bullet"/>
+      <w:lvlText w:val=""/>
+      <w:lvlJc w:val="left"/>
+      <w:pPr>
+        <w:ind w:left="2160" w:hanging="360"/>
+      </w:pPr>
+      <w:rPr>
+        <w:rFonts w:ascii="Wingdings" w:hAnsi="Wingdings" w:hint="default"/>
+      </w:rPr>
+    </w:lvl>
+    <w:lvl w:ilvl="3" w:tplc="04090001" w:tentative="1">
+      <w:start w:val="1"/>
+      <w:numFmt w:val="bullet"/>
+      <w:lvlText w:val=""/>
+      <w:lvlJc w:val="left"/>
+      <w:pPr>
+        <w:ind w:left="2880" w:hanging="360"/>
+      </w:pPr>
+      <w:rPr>
+        <w:rFonts w:ascii="Symbol" w:hAnsi="Symbol" w:hint="default"/>
+      </w:rPr>
+    </w:lvl>
+    <w:lvl w:ilvl="4" w:tplc="04090003" w:tentative="1">
+      <w:start w:val="1"/>
+      <w:numFmt w:val="bullet"/>
+      <w:lvlText w:val="o"/>
+      <w:lvlJc w:val="left"/>
+      <w:pPr>
+        <w:ind w:left="3600" w:hanging="360"/>
+      </w:pPr>
+      <w:rPr>
+        <w:rFonts w:ascii="Courier New" w:hAnsi="Courier New" w:cs="Courier New" w:hint="default"/>
+      </w:rPr>
+    </w:lvl>
+    <w:lvl w:ilvl="5" w:tplc="04090005" w:tentative="1">
+      <w:start w:val="1"/>
+      <w:numFmt w:val="bullet"/>
+      <w:lvlText w:val=""/>
+      <w:lvlJc w:val="left"/>
+      <w:pPr>
+        <w:ind w:left="4320" w:hanging="360"/>
+      </w:pPr>
+      <w:rPr>
+        <w:rFonts w:ascii="Wingdings" w:hAnsi="Wingdings" w:hint="default"/>
+      </w:rPr>
+    </w:lvl>
+    <w:lvl w:ilvl="6" w:tplc="04090001" w:tentative="1">
+      <w:start w:val="1"/>
+      <w:numFmt w:val="bullet"/>
+      <w:lvlText w:val=""/>
+      <w:lvlJc w:val="left"/>
+      <w:pPr>
+        <w:ind w:left="5040" w:hanging="360"/>
+      </w:pPr>
+      <w:rPr>
+        <w:rFonts w:ascii="Symbol" w:hAnsi="Symbol" w:hint="default"/>
+      </w:rPr>
+    </w:lvl>
+    <w:lvl w:ilvl="7" w:tplc="04090003" w:tentative="1">
+      <w:start w:val="1"/>
+      <w:numFmt w:val="bullet"/>
+      <w:lvlText w:val="o"/>
+      <w:lvlJc w:val="left"/>
+      <w:pPr>
+        <w:ind w:left="5760" w:hanging="360"/>
+      </w:pPr>
+      <w:rPr>
+        <w:rFonts w:ascii="Courier New" w:hAnsi="Courier New" w:cs="Courier New" w:hint="default"/>
+      </w:rPr>
+    </w:lvl>
+    <w:lvl w:ilvl="8" w:tplc="04090005" w:tentative="1">
+      <w:start w:val="1"/>
+      <w:numFmt w:val="bullet"/>
+      <w:lvlText w:val=""/>
+      <w:lvlJc w:val="left"/>
+      <w:pPr>
+        <w:ind w:left="6480" w:hanging="360"/>
+      </w:pPr>
+      <w:rPr>
+        <w:rFonts w:ascii="Wingdings" w:hAnsi="Wingdings" w:hint="default"/>
+      </w:rPr>
+    </w:lvl>
+  </w:abstractNum>
+  <w:abstractNum w:abstractNumId="4" w15:restartNumberingAfterBreak="0">
     <w:nsid w:val="76382723"/>
     <w:multiLevelType w:val="hybridMultilevel"/>
     <w:tmpl w:val="4B882634"/>
@@ -7940,17 +7117,142 @@
       <w:lvlJc w:val="left"/>
     </w:lvl>
   </w:abstractNum>
+  <w:abstractNum w:abstractNumId="5" w15:restartNumberingAfterBreak="0">
+    <w:nsid w:val="7AF14E41"/>
+    <w:multiLevelType w:val="hybridMultilevel"/>
+    <w:tmpl w:val="B8682482"/>
+    <w:lvl w:ilvl="0" w:tplc="04090001">
+      <w:start w:val="1"/>
+      <w:numFmt w:val="bullet"/>
+      <w:lvlText w:val=""/>
+      <w:lvlJc w:val="left"/>
+      <w:pPr>
+        <w:ind w:left="720" w:hanging="360"/>
+      </w:pPr>
+      <w:rPr>
+        <w:rFonts w:ascii="Symbol" w:hAnsi="Symbol" w:hint="default"/>
+      </w:rPr>
+    </w:lvl>
+    <w:lvl w:ilvl="1" w:tplc="04090003" w:tentative="1">
+      <w:start w:val="1"/>
+      <w:numFmt w:val="bullet"/>
+      <w:lvlText w:val="o"/>
+      <w:lvlJc w:val="left"/>
+      <w:pPr>
+        <w:ind w:left="1440" w:hanging="360"/>
+      </w:pPr>
+      <w:rPr>
+        <w:rFonts w:ascii="Courier New" w:hAnsi="Courier New" w:cs="Courier New" w:hint="default"/>
+      </w:rPr>
+    </w:lvl>
+    <w:lvl w:ilvl="2" w:tplc="04090005" w:tentative="1">
+      <w:start w:val="1"/>
+      <w:numFmt w:val="bullet"/>
+      <w:lvlText w:val=""/>
+      <w:lvlJc w:val="left"/>
+      <w:pPr>
+        <w:ind w:left="2160" w:hanging="360"/>
+      </w:pPr>
+      <w:rPr>
+        <w:rFonts w:ascii="Wingdings" w:hAnsi="Wingdings" w:hint="default"/>
+      </w:rPr>
+    </w:lvl>
+    <w:lvl w:ilvl="3" w:tplc="04090001" w:tentative="1">
+      <w:start w:val="1"/>
+      <w:numFmt w:val="bullet"/>
+      <w:lvlText w:val=""/>
+      <w:lvlJc w:val="left"/>
+      <w:pPr>
+        <w:ind w:left="2880" w:hanging="360"/>
+      </w:pPr>
+      <w:rPr>
+        <w:rFonts w:ascii="Symbol" w:hAnsi="Symbol" w:hint="default"/>
+      </w:rPr>
+    </w:lvl>
+    <w:lvl w:ilvl="4" w:tplc="04090003" w:tentative="1">
+      <w:start w:val="1"/>
+      <w:numFmt w:val="bullet"/>
+      <w:lvlText w:val="o"/>
+      <w:lvlJc w:val="left"/>
+      <w:pPr>
+        <w:ind w:left="3600" w:hanging="360"/>
+      </w:pPr>
+      <w:rPr>
+        <w:rFonts w:ascii="Courier New" w:hAnsi="Courier New" w:cs="Courier New" w:hint="default"/>
+      </w:rPr>
+    </w:lvl>
+    <w:lvl w:ilvl="5" w:tplc="04090005" w:tentative="1">
+      <w:start w:val="1"/>
+      <w:numFmt w:val="bullet"/>
+      <w:lvlText w:val=""/>
+      <w:lvlJc w:val="left"/>
+      <w:pPr>
+        <w:ind w:left="4320" w:hanging="360"/>
+      </w:pPr>
+      <w:rPr>
+        <w:rFonts w:ascii="Wingdings" w:hAnsi="Wingdings" w:hint="default"/>
+      </w:rPr>
+    </w:lvl>
+    <w:lvl w:ilvl="6" w:tplc="04090001" w:tentative="1">
+      <w:start w:val="1"/>
+      <w:numFmt w:val="bullet"/>
+      <w:lvlText w:val=""/>
+      <w:lvlJc w:val="left"/>
+      <w:pPr>
+        <w:ind w:left="5040" w:hanging="360"/>
+      </w:pPr>
+      <w:rPr>
+        <w:rFonts w:ascii="Symbol" w:hAnsi="Symbol" w:hint="default"/>
+      </w:rPr>
+    </w:lvl>
+    <w:lvl w:ilvl="7" w:tplc="04090003" w:tentative="1">
+      <w:start w:val="1"/>
+      <w:numFmt w:val="bullet"/>
+      <w:lvlText w:val="o"/>
+      <w:lvlJc w:val="left"/>
+      <w:pPr>
+        <w:ind w:left="5760" w:hanging="360"/>
+      </w:pPr>
+      <w:rPr>
+        <w:rFonts w:ascii="Courier New" w:hAnsi="Courier New" w:cs="Courier New" w:hint="default"/>
+      </w:rPr>
+    </w:lvl>
+    <w:lvl w:ilvl="8" w:tplc="04090005" w:tentative="1">
+      <w:start w:val="1"/>
+      <w:numFmt w:val="bullet"/>
+      <w:lvlText w:val=""/>
+      <w:lvlJc w:val="left"/>
+      <w:pPr>
+        <w:ind w:left="6480" w:hanging="360"/>
+      </w:pPr>
+      <w:rPr>
+        <w:rFonts w:ascii="Wingdings" w:hAnsi="Wingdings" w:hint="default"/>
+      </w:rPr>
+    </w:lvl>
+  </w:abstractNum>
   <w:num w:numId="1" w16cid:durableId="1870529823">
-    <w:abstractNumId w:val="0"/>
+    <w:abstractNumId w:val="2"/>
     <w:lvlOverride w:ilvl="0">
       <w:startOverride w:val="1"/>
     </w:lvlOverride>
   </w:num>
   <w:num w:numId="2" w16cid:durableId="1528717735">
-    <w:abstractNumId w:val="1"/>
+    <w:abstractNumId w:val="4"/>
     <w:lvlOverride w:ilvl="0">
       <w:startOverride w:val="1"/>
     </w:lvlOverride>
+  </w:num>
+  <w:num w:numId="3" w16cid:durableId="2040233514">
+    <w:abstractNumId w:val="3"/>
+  </w:num>
+  <w:num w:numId="4" w16cid:durableId="510527798">
+    <w:abstractNumId w:val="0"/>
+  </w:num>
+  <w:num w:numId="5" w16cid:durableId="1822577819">
+    <w:abstractNumId w:val="5"/>
+  </w:num>
+  <w:num w:numId="6" w16cid:durableId="252323955">
+    <w:abstractNumId w:val="1"/>
   </w:num>
 </w:numbering>
 </file>

</xml_diff>

<commit_message>
fixed a couple typos
</commit_message>
<xml_diff>
--- a/OpenCDC-UserStories.docx
+++ b/OpenCDC-UserStories.docx
@@ -29,25 +29,7 @@
           <w:sz w:val="36"/>
           <w:szCs w:val="36"/>
         </w:rPr>
-        <w:t xml:space="preserve">for the </w:t>
-      </w:r>
-      <w:proofErr w:type="spellStart"/>
-      <w:r>
-        <w:rPr>
-          <w:color w:val="2E75B6"/>
-          <w:sz w:val="36"/>
-          <w:szCs w:val="36"/>
-        </w:rPr>
-        <w:t>OpenCDC</w:t>
-      </w:r>
-      <w:proofErr w:type="spellEnd"/>
-      <w:r>
-        <w:rPr>
-          <w:color w:val="2E75B6"/>
-          <w:sz w:val="36"/>
-          <w:szCs w:val="36"/>
-        </w:rPr>
-        <w:t xml:space="preserve"> Initiative</w:t>
+        <w:t>for the OpenCDC Initiative</w:t>
       </w:r>
     </w:p>
     <w:p>
@@ -105,23 +87,13 @@
         <w:spacing w:after="160"/>
         <w:ind w:left="360"/>
       </w:pPr>
-      <w:proofErr w:type="spellStart"/>
       <w:r>
         <w:rPr>
           <w:i/>
           <w:iCs/>
           <w:color w:val="333333"/>
         </w:rPr>
-        <w:t>OpenCDC</w:t>
-      </w:r>
-      <w:proofErr w:type="spellEnd"/>
-      <w:r>
-        <w:rPr>
-          <w:i/>
-          <w:iCs/>
-          <w:color w:val="333333"/>
-        </w:rPr>
-        <w:t xml:space="preserve"> is a proposed standard for the structure and semantics of database change events. Any compliant producer — CDC tool or database — can interoperate with any compliant consumer — </w:t>
+        <w:t xml:space="preserve">OpenCDC is a proposed standard for the structure and semantics of database change events. Any compliant producer — CDC tool or database — can interoperate with any compliant consumer — </w:t>
       </w:r>
       <w:r>
         <w:rPr>
@@ -139,23 +111,13 @@
         </w:rPr>
         <w:t xml:space="preserve">tool, pipeline, </w:t>
       </w:r>
-      <w:proofErr w:type="spellStart"/>
       <w:r>
         <w:rPr>
           <w:i/>
           <w:iCs/>
           <w:color w:val="333333"/>
         </w:rPr>
-        <w:t>lakehouse</w:t>
-      </w:r>
-      <w:proofErr w:type="spellEnd"/>
-      <w:r>
-        <w:rPr>
-          <w:i/>
-          <w:iCs/>
-          <w:color w:val="333333"/>
-        </w:rPr>
-        <w:t xml:space="preserve"> </w:t>
+        <w:t xml:space="preserve">lakehouse </w:t>
       </w:r>
       <w:r>
         <w:rPr>
@@ -208,15 +170,7 @@
         <w:spacing w:after="160"/>
       </w:pPr>
       <w:r>
-        <w:t xml:space="preserve">This document describes six use cases for an </w:t>
-      </w:r>
-      <w:proofErr w:type="spellStart"/>
-      <w:r>
-        <w:t>OpenCDC</w:t>
-      </w:r>
-      <w:proofErr w:type="spellEnd"/>
-      <w:r>
-        <w:t xml:space="preserve"> specification, organized by complexity and working-group priority</w:t>
+        <w:t>This document describes six use cases for an OpenCDC specification, organized by complexity and working-group priority</w:t>
       </w:r>
       <w:r>
         <w:t>:</w:t>
@@ -588,23 +542,7 @@
                 <w:sz w:val="20"/>
                 <w:szCs w:val="20"/>
               </w:rPr>
-              <w:t xml:space="preserve">Unified </w:t>
-            </w:r>
-            <w:proofErr w:type="spellStart"/>
-            <w:r>
-              <w:rPr>
-                <w:sz w:val="20"/>
-                <w:szCs w:val="20"/>
-              </w:rPr>
-              <w:t>lakehouse</w:t>
-            </w:r>
-            <w:proofErr w:type="spellEnd"/>
-            <w:r>
-              <w:rPr>
-                <w:sz w:val="20"/>
-                <w:szCs w:val="20"/>
-              </w:rPr>
-              <w:t>/warehouse CDC ingestion</w:t>
+              <w:t>Unified lakehouse/warehouse CDC ingestion</w:t>
             </w:r>
           </w:p>
         </w:tc>
@@ -803,23 +741,7 @@
                 <w:sz w:val="20"/>
                 <w:szCs w:val="20"/>
               </w:rPr>
-              <w:t xml:space="preserve">Database fire-and-forget to </w:t>
-            </w:r>
-            <w:proofErr w:type="gramStart"/>
-            <w:r>
-              <w:rPr>
-                <w:sz w:val="20"/>
-                <w:szCs w:val="20"/>
-              </w:rPr>
-              <w:t>streaming</w:t>
-            </w:r>
-            <w:proofErr w:type="gramEnd"/>
-            <w:r>
-              <w:rPr>
-                <w:sz w:val="20"/>
-                <w:szCs w:val="20"/>
-              </w:rPr>
-              <w:t xml:space="preserve"> pipeline (no CDC tools)</w:t>
+              <w:t>Database fire-and-forget to streaming pipeline (no CDC tools)</w:t>
             </w:r>
           </w:p>
         </w:tc>
@@ -997,11 +919,9 @@
       <w:r>
         <w:t xml:space="preserve"> </w:t>
       </w:r>
-      <w:proofErr w:type="spellStart"/>
       <w:r>
         <w:t>OpenCDC</w:t>
       </w:r>
-      <w:proofErr w:type="spellEnd"/>
       <w:r>
         <w:t xml:space="preserve"> </w:t>
       </w:r>
@@ -1018,15 +938,7 @@
         <w:t>, not the transport</w:t>
       </w:r>
       <w:r>
-        <w:t xml:space="preserve">, </w:t>
-      </w:r>
-      <w:proofErr w:type="gramStart"/>
-      <w:r>
-        <w:t>serialization</w:t>
-      </w:r>
-      <w:proofErr w:type="gramEnd"/>
-      <w:r>
-        <w:t xml:space="preserve"> or infrastructure details</w:t>
+        <w:t>, serialization or infrastructure details</w:t>
       </w:r>
       <w:r>
         <w:t>. Therefore, all mentions of databases, CDC tools</w:t>
@@ -1054,23 +966,7 @@
           <w:b/>
           <w:bCs/>
         </w:rPr>
-        <w:t xml:space="preserve">Why now, for </w:t>
-      </w:r>
-      <w:proofErr w:type="spellStart"/>
-      <w:r>
-        <w:rPr>
-          <w:b/>
-          <w:bCs/>
-        </w:rPr>
-        <w:t>OpenCDC</w:t>
-      </w:r>
-      <w:proofErr w:type="spellEnd"/>
-      <w:r>
-        <w:rPr>
-          <w:b/>
-          <w:bCs/>
-        </w:rPr>
-        <w:t>?</w:t>
+        <w:t>Why now, for OpenCDC?</w:t>
       </w:r>
     </w:p>
     <w:p>
@@ -1097,13 +993,8 @@
       <w:r>
         <w:t xml:space="preserve">log, </w:t>
       </w:r>
-      <w:proofErr w:type="gramStart"/>
-      <w:r>
-        <w:t>detect</w:t>
-      </w:r>
-      <w:proofErr w:type="gramEnd"/>
-      <w:r>
-        <w:t xml:space="preserve"> and capture</w:t>
+      <w:r>
+        <w:t>detect and capture</w:t>
       </w:r>
       <w:r>
         <w:t xml:space="preserve"> transaction</w:t>
@@ -1115,15 +1006,7 @@
         <w:t>s</w:t>
       </w:r>
       <w:r>
-        <w:t xml:space="preserve">. </w:t>
-      </w:r>
-      <w:proofErr w:type="spellStart"/>
-      <w:r>
-        <w:t>OpenCDC</w:t>
-      </w:r>
-      <w:proofErr w:type="spellEnd"/>
-      <w:r>
-        <w:t xml:space="preserve"> standardizes the remaining layer: the structure and semantics of the change event itself, enabling any producer to interoperate with any consumer regardless of vendor, database, </w:t>
+        <w:t xml:space="preserve">. OpenCDC standardizes the remaining layer: the structure and semantics of the change event itself, enabling any producer to interoperate with any consumer regardless of vendor, database, </w:t>
       </w:r>
       <w:r>
         <w:t xml:space="preserve">CDC tool </w:t>
@@ -1137,12 +1020,10 @@
       <w:pPr>
         <w:pStyle w:val="Heading1"/>
       </w:pPr>
-      <w:proofErr w:type="spellStart"/>
       <w:r>
         <w:lastRenderedPageBreak/>
         <w:t>OpenCDC</w:t>
       </w:r>
-      <w:proofErr w:type="spellEnd"/>
       <w:r>
         <w:t xml:space="preserve"> </w:t>
       </w:r>
@@ -1172,15 +1053,7 @@
         <w:t>The central</w:t>
       </w:r>
       <w:r>
-        <w:t xml:space="preserve"> guiding idea behind </w:t>
-      </w:r>
-      <w:proofErr w:type="spellStart"/>
-      <w:r>
-        <w:t>OpenCDC</w:t>
-      </w:r>
-      <w:proofErr w:type="spellEnd"/>
-      <w:r>
-        <w:t xml:space="preserve"> is that a change event should be meaningful on its own — readable and trustworthy without depending on the tools, formats, or plumbing that happen to carry it. </w:t>
+        <w:t xml:space="preserve"> guiding idea behind OpenCDC is that a change event should be meaningful on its own — readable and trustworthy without depending on the tools, formats, or plumbing that happen to carry it. </w:t>
       </w:r>
       <w:r>
         <w:t>Logical c</w:t>
@@ -1211,15 +1084,7 @@
         <w:t>Serialization independence</w:t>
       </w:r>
       <w:r>
-        <w:t xml:space="preserve"> — </w:t>
-      </w:r>
-      <w:proofErr w:type="spellStart"/>
-      <w:r>
-        <w:t>OpenCDC</w:t>
-      </w:r>
-      <w:proofErr w:type="spellEnd"/>
-      <w:r>
-        <w:t xml:space="preserve"> describes the </w:t>
+        <w:t xml:space="preserve"> — OpenCDC describes the </w:t>
       </w:r>
       <w:r>
         <w:t>transactions</w:t>
@@ -1240,6 +1105,9 @@
         <w:t xml:space="preserve">as the working example because nearly any platform can read it without special libraries — but JSON is </w:t>
       </w:r>
       <w:r>
+        <w:t xml:space="preserve">not </w:t>
+      </w:r>
+      <w:r>
         <w:t>mandated</w:t>
       </w:r>
       <w:r>
@@ -1249,15 +1117,7 @@
         <w:t>Producers could emit the</w:t>
       </w:r>
       <w:r>
-        <w:t xml:space="preserve"> same events as Avro, Protocol Buffers, Parquet, or Arrow, and remain fully conformant. Every schema also travels with the stream in a standard, </w:t>
-      </w:r>
-      <w:proofErr w:type="spellStart"/>
-      <w:r>
-        <w:t>validatable</w:t>
-      </w:r>
-      <w:proofErr w:type="spellEnd"/>
-      <w:r>
-        <w:t xml:space="preserve"> form, so a conformant stream can always be checked for correctness on its own terms</w:t>
+        <w:t xml:space="preserve"> same events as Avro, Protocol Buffers, Parquet, or Arrow, and remain fully conformant. Every schema also travels with the stream in a standard, validatable form, so a conformant stream can always be checked for correctness on its own terms</w:t>
       </w:r>
       <w:r>
         <w:t>,</w:t>
@@ -1295,26 +1155,10 @@
         <w:t>Transport and infrastructure independence</w:t>
       </w:r>
       <w:r>
-        <w:t xml:space="preserve"> — the stream stands alone. </w:t>
-      </w:r>
-      <w:proofErr w:type="spellStart"/>
-      <w:r>
-        <w:t>OpenCDC</w:t>
-      </w:r>
-      <w:proofErr w:type="spellEnd"/>
-      <w:r>
-        <w:t xml:space="preserve"> assumes no </w:t>
-      </w:r>
-      <w:proofErr w:type="gramStart"/>
-      <w:r>
-        <w:t>particular</w:t>
-      </w:r>
-      <w:r>
-        <w:t xml:space="preserve"> wire</w:t>
-      </w:r>
-      <w:proofErr w:type="gramEnd"/>
-      <w:r>
-        <w:t xml:space="preserve"> protocol,</w:t>
+        <w:t xml:space="preserve"> — the stream stands alone. OpenCDC assumes no particular</w:t>
+      </w:r>
+      <w:r>
+        <w:t xml:space="preserve"> wire protocol,</w:t>
       </w:r>
       <w:r>
         <w:t xml:space="preserve"> message broker, schema registry, SDK, or vendor runtime. A conformant stream can be parsed, validated, and applied with nothing more than a standard parser and this specification. </w:t>
@@ -1347,15 +1191,7 @@
         <w:t xml:space="preserve">B: </w:t>
       </w:r>
       <w:r>
-        <w:t xml:space="preserve">Support for </w:t>
-      </w:r>
-      <w:proofErr w:type="gramStart"/>
-      <w:r>
-        <w:t>Tightly-Coupled</w:t>
-      </w:r>
-      <w:proofErr w:type="gramEnd"/>
-      <w:r>
-        <w:t xml:space="preserve"> and Loosely-Coupled Transports</w:t>
+        <w:t>Support for Tightly-Coupled and Loosely-Coupled Transports</w:t>
       </w:r>
     </w:p>
     <w:p>
@@ -1372,15 +1208,7 @@
         <w:t>may</w:t>
       </w:r>
       <w:r>
-        <w:t xml:space="preserve"> </w:t>
-      </w:r>
-      <w:proofErr w:type="gramStart"/>
-      <w:r>
-        <w:t>delivered</w:t>
-      </w:r>
-      <w:proofErr w:type="gramEnd"/>
-      <w:r>
-        <w:t xml:space="preserve"> in very different ways. Sometimes a producer hands events straight to a consumer in a single, orderly </w:t>
+        <w:t xml:space="preserve"> delivered in very different ways. Sometimes a producer hands events straight to a consumer in a single, orderly </w:t>
       </w:r>
       <w:r>
         <w:t>sequence</w:t>
@@ -1392,15 +1220,7 @@
         <w:t>partitions</w:t>
       </w:r>
       <w:r>
-        <w:t xml:space="preserve"> or parked in storage to be picked up later. </w:t>
-      </w:r>
-      <w:proofErr w:type="spellStart"/>
-      <w:r>
-        <w:t>OpenCDC</w:t>
-      </w:r>
-      <w:proofErr w:type="spellEnd"/>
-      <w:r>
-        <w:t xml:space="preserve"> is designed to give the consumer the same trustworthy picture of a transaction </w:t>
+        <w:t xml:space="preserve"> or parked in storage to be picked up later. OpenCDC is designed to give the consumer the same trustworthy picture of a transaction </w:t>
       </w:r>
       <w:r>
         <w:t>regardless of transport or storage technologies</w:t>
@@ -1458,21 +1278,7 @@
         <w:t xml:space="preserve"> they </w:t>
       </w:r>
       <w:r>
-        <w:t>share one ordered channel</w:t>
-      </w:r>
-      <w:r>
-        <w:t xml:space="preserve"> (such as a Secure WebSocket stream of events)</w:t>
-      </w:r>
-      <w:r>
-        <w:t xml:space="preserve">, </w:t>
-      </w:r>
-      <w:proofErr w:type="spellStart"/>
-      <w:r>
-        <w:t>OpenCDC</w:t>
-      </w:r>
-      <w:proofErr w:type="spellEnd"/>
-      <w:r>
-        <w:t xml:space="preserve"> </w:t>
+        <w:t xml:space="preserve">share one ordered channel (such as a Secure WebSocket stream of events), OpenCDC </w:t>
       </w:r>
       <w:r>
         <w:t>producers</w:t>
@@ -1551,35 +1357,14 @@
       <w:r>
         <w:t xml:space="preserve"> (</w:t>
       </w:r>
-      <w:proofErr w:type="spellStart"/>
-      <w:proofErr w:type="gramStart"/>
-      <w:r>
-        <w:t>eg</w:t>
-      </w:r>
-      <w:proofErr w:type="spellEnd"/>
-      <w:r>
-        <w:t>;</w:t>
-      </w:r>
-      <w:proofErr w:type="gramEnd"/>
-      <w:r>
-        <w:t xml:space="preserve"> Kafka</w:t>
-      </w:r>
-      <w:r>
-        <w:t>)</w:t>
-      </w:r>
-      <w:r>
-        <w:t xml:space="preserve"> or retrieved from storage in parallel</w:t>
-      </w:r>
-      <w:r>
-        <w:t xml:space="preserve"> (</w:t>
-      </w:r>
-      <w:proofErr w:type="spellStart"/>
-      <w:r>
-        <w:t>eg</w:t>
-      </w:r>
-      <w:proofErr w:type="spellEnd"/>
-      <w:r>
-        <w:t>;</w:t>
+      <w:r>
+        <w:t>eg; Kafka</w:t>
+      </w:r>
+      <w:r>
+        <w:t>) or retrieved from storage in parallel (</w:t>
+      </w:r>
+      <w:r>
+        <w:t>eg;</w:t>
       </w:r>
       <w:r>
         <w:t xml:space="preserve"> </w:t>
@@ -1606,26 +1391,13 @@
         <w:t>A</w:t>
       </w:r>
       <w:r>
-        <w:t xml:space="preserve"> single transaction's events may land in different </w:t>
-      </w:r>
-      <w:proofErr w:type="gramStart"/>
-      <w:r>
-        <w:t>places, and</w:t>
-      </w:r>
-      <w:proofErr w:type="gramEnd"/>
-      <w:r>
-        <w:t xml:space="preserve"> seeing "the next transaction" on one channel tells you nothing about pieces sitting elsewhere. </w:t>
+        <w:t xml:space="preserve"> single transaction's events may land in different places, and seeing "the next transaction" on one channel tells you nothing about pieces sitting elsewhere. </w:t>
       </w:r>
       <w:r>
         <w:t xml:space="preserve">For these situations, </w:t>
       </w:r>
-      <w:proofErr w:type="spellStart"/>
-      <w:r>
-        <w:t>OpenCDC</w:t>
-      </w:r>
-      <w:proofErr w:type="spellEnd"/>
-      <w:r>
-        <w:t xml:space="preserve"> </w:t>
+      <w:r>
+        <w:t xml:space="preserve">OpenCDC </w:t>
       </w:r>
       <w:r>
         <w:t xml:space="preserve">provides </w:t>
@@ -1658,15 +1430,7 @@
     </w:p>
     <w:p>
       <w:r>
-        <w:t xml:space="preserve">In </w:t>
-      </w:r>
-      <w:proofErr w:type="spellStart"/>
-      <w:r>
-        <w:t>OpenCDC</w:t>
-      </w:r>
-      <w:proofErr w:type="spellEnd"/>
-      <w:r>
-        <w:t xml:space="preserve"> a logical</w:t>
+        <w:t>In OpenCDC a logical</w:t>
       </w:r>
       <w:r>
         <w:t xml:space="preserve"> change stream carries its own instructions for reading it. Before any data event appears, the stream delivers the schema that describes it — the table's columns, their types, and how their values are encoded — as an ordinary event in the same ordered sequence. </w:t>
@@ -1713,13 +1477,7 @@
         <w:t>,</w:t>
       </w:r>
       <w:r>
-        <w:t xml:space="preserve"> comes from reading the stream itself. There is no </w:t>
-      </w:r>
-      <w:r>
-        <w:t xml:space="preserve">mandate for a </w:t>
-      </w:r>
-      <w:r>
-        <w:t>separate registry to consult, no database to inspect, and nothing to poll. A consumer that has read the stream up to a given event always knows exactly how to decode it.</w:t>
+        <w:t xml:space="preserve"> comes from reading the stream itself. There is no mandate for a separate registry to consult, no database to inspect, and nothing to poll. A consumer that has read the stream up to a given event always knows exactly how to decode it.</w:t>
       </w:r>
       <w:r>
         <w:br/>
@@ -1727,44 +1485,7 @@
     </w:p>
     <w:p>
       <w:r>
-        <w:t xml:space="preserve">By keeping schema, schema changes, and data together and in order, </w:t>
-      </w:r>
-      <w:proofErr w:type="spellStart"/>
-      <w:r>
-        <w:t>OpenCDC</w:t>
-      </w:r>
-      <w:proofErr w:type="spellEnd"/>
-      <w:r>
-        <w:t xml:space="preserve"> preserves that correlation by </w:t>
-      </w:r>
-      <w:r>
-        <w:t>precise ordering in the sequence of events</w:t>
-      </w:r>
-      <w:r>
-        <w:t xml:space="preserve">. It is the same </w:t>
-      </w:r>
-      <w:r>
-        <w:t xml:space="preserve">core principle for why the </w:t>
-      </w:r>
-      <w:proofErr w:type="spellStart"/>
-      <w:r>
-        <w:t>OpenCDC</w:t>
-      </w:r>
-      <w:proofErr w:type="spellEnd"/>
-      <w:r>
-        <w:t xml:space="preserve"> transaction-commit marker</w:t>
-      </w:r>
-      <w:r>
-        <w:t xml:space="preserve">s are delivered </w:t>
-      </w:r>
-      <w:r>
-        <w:t xml:space="preserve">in the stream rather than </w:t>
-      </w:r>
-      <w:r>
-        <w:t>on</w:t>
-      </w:r>
-      <w:r>
-        <w:t xml:space="preserve"> a side channel: when the order and the relationships between events carry meaning, the events belong together in one </w:t>
+        <w:t xml:space="preserve">By keeping schema, schema changes, and data together and in order, OpenCDC preserves that correlation by precise ordering in the sequence of events. It is the same core principle for why the OpenCDC transaction-commit markers are delivered in the stream rather than on a side channel: when the order and the relationships between events carry meaning, the events belong together in one </w:t>
       </w:r>
       <w:r>
         <w:t xml:space="preserve">continuous sequence, </w:t>
@@ -1830,25 +1551,7 @@
           <w:sz w:val="20"/>
           <w:szCs w:val="20"/>
         </w:rPr>
-        <w:t xml:space="preserve"> </w:t>
-      </w:r>
-      <w:proofErr w:type="gramStart"/>
-      <w:r>
-        <w:rPr>
-          <w:color w:val="595959"/>
-          <w:sz w:val="20"/>
-          <w:szCs w:val="20"/>
-        </w:rPr>
-        <w:t>Story</w:t>
-      </w:r>
-      <w:proofErr w:type="gramEnd"/>
-      <w:r>
-        <w:rPr>
-          <w:color w:val="595959"/>
-          <w:sz w:val="20"/>
-          <w:szCs w:val="20"/>
-        </w:rPr>
-        <w:t xml:space="preserve"> 1 &amp; 2 are both about interoperability of CDC tools, the rationale for splitting into two distinct stories is to provide for details that emerge when the databases are homogenous vs heterogeneous.</w:t>
+        <w:t xml:space="preserve"> Story 1 &amp; 2 are both about interoperability of CDC tools, the rationale for splitting into two distinct stories is to provide for details that emerge when the databases are homogenous vs heterogeneous.</w:t>
       </w:r>
     </w:p>
     <w:p>
@@ -1871,61 +1574,7 @@
           <w:iCs/>
           <w:color w:val="333333"/>
         </w:rPr>
-        <w:t xml:space="preserve">As a DBA in a large enterprise IT organization, I want </w:t>
-      </w:r>
-      <w:proofErr w:type="spellStart"/>
-      <w:r>
-        <w:rPr>
-          <w:i/>
-          <w:iCs/>
-          <w:color w:val="333333"/>
-        </w:rPr>
-        <w:t>Debezium</w:t>
-      </w:r>
-      <w:proofErr w:type="spellEnd"/>
-      <w:r>
-        <w:rPr>
-          <w:i/>
-          <w:iCs/>
-          <w:color w:val="333333"/>
-        </w:rPr>
-        <w:t xml:space="preserve"> and </w:t>
-      </w:r>
-      <w:proofErr w:type="spellStart"/>
-      <w:r>
-        <w:rPr>
-          <w:i/>
-          <w:iCs/>
-          <w:color w:val="333333"/>
-        </w:rPr>
-        <w:t>Fivetran</w:t>
-      </w:r>
-      <w:proofErr w:type="spellEnd"/>
-      <w:r>
-        <w:rPr>
-          <w:i/>
-          <w:iCs/>
-          <w:color w:val="333333"/>
-        </w:rPr>
-        <w:t xml:space="preserve"> to exchange change events using the </w:t>
-      </w:r>
-      <w:proofErr w:type="spellStart"/>
-      <w:r>
-        <w:rPr>
-          <w:i/>
-          <w:iCs/>
-          <w:color w:val="333333"/>
-        </w:rPr>
-        <w:t>OpenCDC</w:t>
-      </w:r>
-      <w:proofErr w:type="spellEnd"/>
-      <w:r>
-        <w:rPr>
-          <w:i/>
-          <w:iCs/>
-          <w:color w:val="333333"/>
-        </w:rPr>
-        <w:t xml:space="preserve"> format over a cloud message stream, so that I can replicate data from AWS Aurora PostgreSQL to an on-premises PostgreSQL database by composing two already-deployed CDC tools — without installing new software on either system or risking data loss from type-semantic differences.</w:t>
+        <w:t>As a DBA in a large enterprise IT organization, I want Debezium and Fivetran to exchange change events using the OpenCDC format over a cloud message stream, so that I can replicate data from AWS Aurora PostgreSQL to an on-premises PostgreSQL database by composing two already-deployed CDC tools — without installing new software on either system or risking data loss from type-semantic differences.</w:t>
       </w:r>
     </w:p>
     <w:p>
@@ -2016,21 +1665,8 @@
         <w:spacing w:before="40" w:after="40"/>
       </w:pPr>
       <w:r>
-        <w:t xml:space="preserve">Cloud (Aurora): </w:t>
-      </w:r>
-      <w:proofErr w:type="spellStart"/>
-      <w:r>
-        <w:t>Debezium</w:t>
-      </w:r>
-      <w:proofErr w:type="spellEnd"/>
-      <w:r>
-        <w:t xml:space="preserve"> captures change events for an AWS data warehouse </w:t>
-      </w:r>
-      <w:proofErr w:type="gramStart"/>
-      <w:r>
-        <w:t>pipeline</w:t>
-      </w:r>
-      <w:proofErr w:type="gramEnd"/>
+        <w:t>Cloud (Aurora): Debezium captures change events for an AWS data warehouse pipeline</w:t>
+      </w:r>
     </w:p>
     <w:p>
       <w:pPr>
@@ -2042,21 +1678,8 @@
         <w:spacing w:before="40" w:after="40"/>
       </w:pPr>
       <w:r>
-        <w:t xml:space="preserve">On-premises (Postgres): </w:t>
-      </w:r>
-      <w:proofErr w:type="spellStart"/>
-      <w:r>
-        <w:t>Fivetran</w:t>
-      </w:r>
-      <w:proofErr w:type="spellEnd"/>
-      <w:r>
-        <w:t xml:space="preserve">/HVR ingests data from other sources into the on-prem </w:t>
-      </w:r>
-      <w:proofErr w:type="gramStart"/>
-      <w:r>
-        <w:t>database</w:t>
-      </w:r>
-      <w:proofErr w:type="gramEnd"/>
+        <w:t>On-premises (Postgres): Fivetran/HVR ingests data from other sources into the on-prem database</w:t>
+      </w:r>
     </w:p>
     <w:p>
       <w:pPr>
@@ -2076,15 +1699,7 @@
         <w:pStyle w:val="Heading2"/>
       </w:pPr>
       <w:r>
-        <w:t xml:space="preserve">The </w:t>
-      </w:r>
-      <w:proofErr w:type="spellStart"/>
-      <w:r>
-        <w:t>OpenCDC</w:t>
-      </w:r>
-      <w:proofErr w:type="spellEnd"/>
-      <w:r>
-        <w:t xml:space="preserve"> Solution</w:t>
+        <w:t>The OpenCDC Solution</w:t>
       </w:r>
     </w:p>
     <w:p>
@@ -2092,31 +1707,7 @@
         <w:spacing w:after="160"/>
       </w:pPr>
       <w:r>
-        <w:t xml:space="preserve">Both </w:t>
-      </w:r>
-      <w:proofErr w:type="spellStart"/>
-      <w:r>
-        <w:t>Debezium</w:t>
-      </w:r>
-      <w:proofErr w:type="spellEnd"/>
-      <w:r>
-        <w:t xml:space="preserve"> and </w:t>
-      </w:r>
-      <w:proofErr w:type="spellStart"/>
-      <w:r>
-        <w:t>Fivetran</w:t>
-      </w:r>
-      <w:proofErr w:type="spellEnd"/>
-      <w:r>
-        <w:t xml:space="preserve">/HVR have added support for </w:t>
-      </w:r>
-      <w:proofErr w:type="spellStart"/>
-      <w:r>
-        <w:t>OpenCDC</w:t>
-      </w:r>
-      <w:proofErr w:type="spellEnd"/>
-      <w:r>
-        <w:t>-formatted events over Kafka/Kinesis topics. The path forward requires no new software on either side:</w:t>
+        <w:t>Both Debezium and Fivetran/HVR have added support for OpenCDC-formatted events over Kafka/Kinesis topics. The path forward requires no new software on either side:</w:t>
       </w:r>
     </w:p>
     <w:p>
@@ -2128,27 +1719,9 @@
         </w:numPr>
         <w:spacing w:before="40" w:after="40"/>
       </w:pPr>
-      <w:proofErr w:type="spellStart"/>
-      <w:r>
-        <w:t>Debezium</w:t>
-      </w:r>
-      <w:proofErr w:type="spellEnd"/>
-      <w:r>
-        <w:t xml:space="preserve"> publishes a filtered set of Aurora table changes as </w:t>
-      </w:r>
-      <w:proofErr w:type="spellStart"/>
-      <w:r>
-        <w:t>OpenCDC</w:t>
-      </w:r>
-      <w:proofErr w:type="spellEnd"/>
-      <w:r>
-        <w:t xml:space="preserve"> events to an AWS Kinesis stream — alongside its existing data warehouse feed, with no disruption to that </w:t>
-      </w:r>
-      <w:proofErr w:type="gramStart"/>
-      <w:r>
-        <w:t>pipeline</w:t>
-      </w:r>
-      <w:proofErr w:type="gramEnd"/>
+      <w:r>
+        <w:t>Debezium publishes a filtered set of Aurora table changes as OpenCDC events to an AWS Kinesis stream — alongside its existing data warehouse feed, with no disruption to that pipeline</w:t>
+      </w:r>
     </w:p>
     <w:p>
       <w:pPr>
@@ -2159,27 +1732,9 @@
         </w:numPr>
         <w:spacing w:before="40" w:after="40"/>
       </w:pPr>
-      <w:proofErr w:type="spellStart"/>
-      <w:r>
-        <w:t>Fivetran</w:t>
-      </w:r>
-      <w:proofErr w:type="spellEnd"/>
-      <w:r>
-        <w:t xml:space="preserve">/HVR consumes from that Kinesis stream and applies the </w:t>
-      </w:r>
-      <w:proofErr w:type="spellStart"/>
-      <w:r>
-        <w:t>OpenCDC</w:t>
-      </w:r>
-      <w:proofErr w:type="spellEnd"/>
-      <w:r>
-        <w:t xml:space="preserve"> events to the on-premises PostgreSQL </w:t>
-      </w:r>
-      <w:proofErr w:type="gramStart"/>
-      <w:r>
-        <w:t>database</w:t>
-      </w:r>
-      <w:proofErr w:type="gramEnd"/>
+      <w:r>
+        <w:t>Fivetran/HVR consumes from that Kinesis stream and applies the OpenCDC events to the on-premises PostgreSQL database</w:t>
+      </w:r>
     </w:p>
     <w:p>
       <w:pPr>
@@ -2192,15 +1747,7 @@
       </w:pPr>
       <w:r>
         <w:lastRenderedPageBreak/>
-        <w:t xml:space="preserve">The two tools never need to know anything about each other. They only need to agree on the event format — and </w:t>
-      </w:r>
-      <w:proofErr w:type="spellStart"/>
-      <w:r>
-        <w:t>OpenCDC</w:t>
-      </w:r>
-      <w:proofErr w:type="spellEnd"/>
-      <w:r>
-        <w:t xml:space="preserve"> is that agreement.</w:t>
+        <w:t>The two tools never need to know anything about each other. They only need to agree on the event format — and OpenCDC is that agreement.</w:t>
       </w:r>
     </w:p>
     <w:p>
@@ -2285,9 +1832,13 @@
                 <w:sz w:val="18"/>
                 <w:szCs w:val="18"/>
               </w:rPr>
-              <w:t xml:space="preserve">   </w:t>
-            </w:r>
-            <w:proofErr w:type="spellStart"/>
+              <w:t xml:space="preserve">   Debezium</w:t>
+            </w:r>
+          </w:p>
+          <w:p>
+            <w:pPr>
+              <w:spacing w:before="20" w:after="20"/>
+            </w:pPr>
             <w:r>
               <w:rPr>
                 <w:rFonts w:ascii="Courier New" w:eastAsia="Courier New" w:hAnsi="Courier New" w:cs="Courier New"/>
@@ -2295,9 +1846,8 @@
                 <w:sz w:val="18"/>
                 <w:szCs w:val="18"/>
               </w:rPr>
-              <w:t>Debezium</w:t>
-            </w:r>
-            <w:proofErr w:type="spellEnd"/>
+              <w:t xml:space="preserve">      │</w:t>
+            </w:r>
           </w:p>
           <w:p>
             <w:pPr>
@@ -2310,7 +1860,7 @@
                 <w:sz w:val="18"/>
                 <w:szCs w:val="18"/>
               </w:rPr>
-              <w:t xml:space="preserve">      │</w:t>
+              <w:t xml:space="preserve">      ├──► Confluent (existing DW feed)</w:t>
             </w:r>
           </w:p>
           <w:p>
@@ -2324,7 +1874,7 @@
                 <w:sz w:val="18"/>
                 <w:szCs w:val="18"/>
               </w:rPr>
-              <w:t xml:space="preserve">      ├──► Confluent (existing DW feed)</w:t>
+              <w:t xml:space="preserve">      │</w:t>
             </w:r>
           </w:p>
           <w:p>
@@ -2338,7 +1888,7 @@
                 <w:sz w:val="18"/>
                 <w:szCs w:val="18"/>
               </w:rPr>
-              <w:t xml:space="preserve">      │</w:t>
+              <w:t xml:space="preserve">      └──► Kinesis (new OpenCDC stream)</w:t>
             </w:r>
           </w:p>
           <w:p>
@@ -2352,9 +1902,13 @@
                 <w:sz w:val="18"/>
                 <w:szCs w:val="18"/>
               </w:rPr>
-              <w:t xml:space="preserve">      └──► Kinesis (new </w:t>
-            </w:r>
-            <w:proofErr w:type="spellStart"/>
+              <w:t xml:space="preserve">                  │</w:t>
+            </w:r>
+          </w:p>
+          <w:p>
+            <w:pPr>
+              <w:spacing w:before="20" w:after="20"/>
+            </w:pPr>
             <w:r>
               <w:rPr>
                 <w:rFonts w:ascii="Courier New" w:eastAsia="Courier New" w:hAnsi="Courier New" w:cs="Courier New"/>
@@ -2362,9 +1916,13 @@
                 <w:sz w:val="18"/>
                 <w:szCs w:val="18"/>
               </w:rPr>
-              <w:t>OpenCDC</w:t>
-            </w:r>
-            <w:proofErr w:type="spellEnd"/>
+              <w:t xml:space="preserve">              Fivetran/HVR</w:t>
+            </w:r>
+          </w:p>
+          <w:p>
+            <w:pPr>
+              <w:spacing w:before="20" w:after="20"/>
+            </w:pPr>
             <w:r>
               <w:rPr>
                 <w:rFonts w:ascii="Courier New" w:eastAsia="Courier New" w:hAnsi="Courier New" w:cs="Courier New"/>
@@ -2372,7 +1930,7 @@
                 <w:sz w:val="18"/>
                 <w:szCs w:val="18"/>
               </w:rPr>
-              <w:t xml:space="preserve"> stream)</w:t>
+              <w:t xml:space="preserve">                  │</w:t>
             </w:r>
           </w:p>
           <w:p>
@@ -2386,68 +1944,6 @@
                 <w:sz w:val="18"/>
                 <w:szCs w:val="18"/>
               </w:rPr>
-              <w:t xml:space="preserve">                  │</w:t>
-            </w:r>
-          </w:p>
-          <w:p>
-            <w:pPr>
-              <w:spacing w:before="20" w:after="20"/>
-            </w:pPr>
-            <w:r>
-              <w:rPr>
-                <w:rFonts w:ascii="Courier New" w:eastAsia="Courier New" w:hAnsi="Courier New" w:cs="Courier New"/>
-                <w:color w:val="222222"/>
-                <w:sz w:val="18"/>
-                <w:szCs w:val="18"/>
-              </w:rPr>
-              <w:t xml:space="preserve">              </w:t>
-            </w:r>
-            <w:proofErr w:type="spellStart"/>
-            <w:r>
-              <w:rPr>
-                <w:rFonts w:ascii="Courier New" w:eastAsia="Courier New" w:hAnsi="Courier New" w:cs="Courier New"/>
-                <w:color w:val="222222"/>
-                <w:sz w:val="18"/>
-                <w:szCs w:val="18"/>
-              </w:rPr>
-              <w:t>Fivetran</w:t>
-            </w:r>
-            <w:proofErr w:type="spellEnd"/>
-            <w:r>
-              <w:rPr>
-                <w:rFonts w:ascii="Courier New" w:eastAsia="Courier New" w:hAnsi="Courier New" w:cs="Courier New"/>
-                <w:color w:val="222222"/>
-                <w:sz w:val="18"/>
-                <w:szCs w:val="18"/>
-              </w:rPr>
-              <w:t>/HVR</w:t>
-            </w:r>
-          </w:p>
-          <w:p>
-            <w:pPr>
-              <w:spacing w:before="20" w:after="20"/>
-            </w:pPr>
-            <w:r>
-              <w:rPr>
-                <w:rFonts w:ascii="Courier New" w:eastAsia="Courier New" w:hAnsi="Courier New" w:cs="Courier New"/>
-                <w:color w:val="222222"/>
-                <w:sz w:val="18"/>
-                <w:szCs w:val="18"/>
-              </w:rPr>
-              <w:t xml:space="preserve">                  │</w:t>
-            </w:r>
-          </w:p>
-          <w:p>
-            <w:pPr>
-              <w:spacing w:before="20" w:after="20"/>
-            </w:pPr>
-            <w:r>
-              <w:rPr>
-                <w:rFonts w:ascii="Courier New" w:eastAsia="Courier New" w:hAnsi="Courier New" w:cs="Courier New"/>
-                <w:color w:val="222222"/>
-                <w:sz w:val="18"/>
-                <w:szCs w:val="18"/>
-              </w:rPr>
               <w:t xml:space="preserve">          On-Premises PostgreSQL</w:t>
             </w:r>
           </w:p>
@@ -2464,15 +1960,7 @@
         <w:pStyle w:val="Heading2"/>
       </w:pPr>
       <w:r>
-        <w:t xml:space="preserve">Why </w:t>
-      </w:r>
-      <w:proofErr w:type="spellStart"/>
-      <w:r>
-        <w:t>OpenCDC</w:t>
-      </w:r>
-      <w:proofErr w:type="spellEnd"/>
-      <w:r>
-        <w:t xml:space="preserve"> Is the Critical Enabler</w:t>
+        <w:t>Why OpenCDC Is the Critical Enabler</w:t>
       </w:r>
     </w:p>
     <w:p>
@@ -2480,23 +1968,7 @@
         <w:spacing w:after="160"/>
       </w:pPr>
       <w:r>
-        <w:t xml:space="preserve">Aurora PostgreSQL and community PostgreSQL are not identical engines. They diverge in subtle but important ways: data type representations, system column behavior, and how certain operations are encoded in the WAL. Without a common specification, translating a </w:t>
-      </w:r>
-      <w:proofErr w:type="spellStart"/>
-      <w:r>
-        <w:t>Debezium</w:t>
-      </w:r>
-      <w:proofErr w:type="spellEnd"/>
-      <w:r>
-        <w:t xml:space="preserve"> event formatted for Aurora’s dialect into something </w:t>
-      </w:r>
-      <w:proofErr w:type="spellStart"/>
-      <w:r>
-        <w:t>Fivetran</w:t>
-      </w:r>
-      <w:proofErr w:type="spellEnd"/>
-      <w:r>
-        <w:t xml:space="preserve"> can reliably apply to on-prem Postgres requires custom mapping logic — exactly the brittle glue code that creates long-term maintenance burden and silent data quality risk.</w:t>
+        <w:t>Aurora PostgreSQL and community PostgreSQL are not identical engines. They diverge in subtle but important ways: data type representations, system column behavior, and how certain operations are encoded in the WAL. Without a common specification, translating a Debezium event formatted for Aurora’s dialect into something Fivetran can reliably apply to on-prem Postgres requires custom mapping logic — exactly the brittle glue code that creates long-term maintenance burden and silent data quality risk.</w:t>
       </w:r>
     </w:p>
     <w:p>
@@ -2508,13 +1980,8 @@
       <w:pPr>
         <w:spacing w:after="160"/>
       </w:pPr>
-      <w:proofErr w:type="spellStart"/>
-      <w:r>
-        <w:t>OpenCDC</w:t>
-      </w:r>
-      <w:proofErr w:type="spellEnd"/>
-      <w:r>
-        <w:t xml:space="preserve"> resolves this by providing:</w:t>
+      <w:r>
+        <w:t>OpenCDC resolves this by providing:</w:t>
       </w:r>
     </w:p>
     <w:p>
@@ -2534,23 +2001,7 @@
         <w:t xml:space="preserve">Canonical type semantics. </w:t>
       </w:r>
       <w:r>
-        <w:t xml:space="preserve">PostgreSQL data types are represented consistently in the </w:t>
-      </w:r>
-      <w:proofErr w:type="spellStart"/>
-      <w:r>
-        <w:t>OpenCDC</w:t>
-      </w:r>
-      <w:proofErr w:type="spellEnd"/>
-      <w:r>
-        <w:t xml:space="preserve"> envelope, versioned by the spec, so numeric precision, timestamp </w:t>
-      </w:r>
-      <w:proofErr w:type="spellStart"/>
-      <w:r>
-        <w:t>timezone</w:t>
-      </w:r>
-      <w:proofErr w:type="spellEnd"/>
-      <w:r>
-        <w:t xml:space="preserve"> handling, and array types arrive on-prem exactly as they left Aurora.</w:t>
+        <w:t>PostgreSQL data types are represented consistently in the OpenCDC envelope, versioned by the spec, so numeric precision, timestamp timezone handling, and array types arrive on-prem exactly as they left Aurora.</w:t>
       </w:r>
     </w:p>
     <w:p>
@@ -2610,15 +2061,7 @@
         <w:t xml:space="preserve">Sequence and transaction metadata. </w:t>
       </w:r>
       <w:r>
-        <w:t xml:space="preserve">Events carry monotonic identifiers and transaction boundaries, so </w:t>
-      </w:r>
-      <w:proofErr w:type="spellStart"/>
-      <w:r>
-        <w:t>Fivetran</w:t>
-      </w:r>
-      <w:proofErr w:type="spellEnd"/>
-      <w:r>
-        <w:t xml:space="preserve"> can apply changes in the correct order even if events arrive out of sequence.</w:t>
+        <w:t>Events carry monotonic identifiers and transaction boundaries, so Fivetran can apply changes in the correct order even if events arrive out of sequence.</w:t>
       </w:r>
     </w:p>
     <w:p>
@@ -2762,21 +2205,8 @@
         <w:spacing w:before="40" w:after="40"/>
       </w:pPr>
       <w:r>
-        <w:t>Marketing runs IBM IIDR on a DB2/</w:t>
-      </w:r>
-      <w:proofErr w:type="spellStart"/>
-      <w:r>
-        <w:t>zSeries</w:t>
-      </w:r>
-      <w:proofErr w:type="spellEnd"/>
-      <w:r>
-        <w:t xml:space="preserve"> </w:t>
-      </w:r>
-      <w:proofErr w:type="gramStart"/>
-      <w:r>
-        <w:t>system</w:t>
-      </w:r>
-      <w:proofErr w:type="gramEnd"/>
+        <w:t>Marketing runs IBM IIDR on a DB2/zSeries system</w:t>
+      </w:r>
     </w:p>
     <w:p>
       <w:pPr>
@@ -2788,13 +2218,8 @@
         <w:spacing w:before="40" w:after="40"/>
       </w:pPr>
       <w:r>
-        <w:t xml:space="preserve">Finance runs Oracle GoldenGate on an Exadata </w:t>
-      </w:r>
-      <w:proofErr w:type="gramStart"/>
-      <w:r>
-        <w:t>system</w:t>
-      </w:r>
-      <w:proofErr w:type="gramEnd"/>
+        <w:t>Finance runs Oracle GoldenGate on an Exadata system</w:t>
+      </w:r>
     </w:p>
     <w:p>
       <w:pPr>
@@ -2806,15 +2231,7 @@
         <w:spacing w:after="160"/>
       </w:pPr>
       <w:r>
-        <w:t xml:space="preserve">A new requirement mandates that selected customer tables be kept in sync across both systems in real time. The traditional options — deploying a third-party replication tool across both </w:t>
-      </w:r>
-      <w:proofErr w:type="gramStart"/>
-      <w:r>
-        <w:t>environments, or</w:t>
-      </w:r>
-      <w:proofErr w:type="gramEnd"/>
-      <w:r>
-        <w:t xml:space="preserve"> building a bespoke translation layer between the two vendors’ proprietary formats — are expensive and operationally risky in regulated enterprise settings.</w:t>
+        <w:t>A new requirement mandates that selected customer tables be kept in sync across both systems in real time. The traditional options — deploying a third-party replication tool across both environments, or building a bespoke translation layer between the two vendors’ proprietary formats — are expensive and operationally risky in regulated enterprise settings.</w:t>
       </w:r>
     </w:p>
     <w:p>
@@ -2822,27 +2239,63 @@
         <w:spacing w:after="160"/>
       </w:pPr>
       <w:r>
-        <w:t xml:space="preserve">Both IBM and Oracle have recently shipped </w:t>
-      </w:r>
-      <w:proofErr w:type="spellStart"/>
-      <w:r>
-        <w:t>OpenCDC</w:t>
-      </w:r>
-      <w:proofErr w:type="spellEnd"/>
-      <w:r>
-        <w:t xml:space="preserve"> </w:t>
-      </w:r>
-      <w:proofErr w:type="spellStart"/>
-      <w:r>
-        <w:t>CloudEvents</w:t>
-      </w:r>
-      <w:proofErr w:type="spellEnd"/>
-      <w:r>
-        <w:t xml:space="preserve"> as an optional output format, and both expose AsyncAPI-compliant interfaces. This enables direct point-to-point event exchange without a shared message broker.</w:t>
-      </w:r>
-    </w:p>
-    <w:p>
-      <w:pPr>
+        <w:t>Both IBM and Oracle have recently shipped OpenCDC CloudEvents as an optional output format, and both expose AsyncAPI-compliant interfaces. This enables direct point-to-point event exchange without a shared message broker.</w:t>
+      </w:r>
+    </w:p>
+    <w:p>
+      <w:pPr>
+        <w:pStyle w:val="Heading2"/>
+      </w:pPr>
+      <w:r>
+        <w:t>The OpenCDC Solution</w:t>
+      </w:r>
+    </w:p>
+    <w:p>
+      <w:pPr>
+        <w:spacing w:after="160"/>
+      </w:pPr>
+      <w:r>
+        <w:t>When b</w:t>
+      </w:r>
+      <w:r>
+        <w:t>oth IBM IIDR and Oracle GoldenGate have added support for OpenCDC-formatted events over their respective interfaces</w:t>
+      </w:r>
+      <w:r>
+        <w:t>; t</w:t>
+      </w:r>
+      <w:r>
+        <w:t>he path forward requires no new replication infrastructure on either side:</w:t>
+      </w:r>
+    </w:p>
+    <w:p>
+      <w:pPr>
+        <w:pStyle w:val="ListParagraph"/>
+        <w:numPr>
+          <w:ilvl w:val="0"/>
+          <w:numId w:val="7"/>
+        </w:numPr>
+        <w:spacing w:after="160"/>
+      </w:pPr>
+      <w:r>
+        <w:t>IBM IIDR publishes a filtered set of DB2/zSeries customer table changes as OpenCDC events to a shared message channel — alongside its existing internal feeds, with no disruption to those pipelines</w:t>
+      </w:r>
+    </w:p>
+    <w:p>
+      <w:pPr>
+        <w:pStyle w:val="ListParagraph"/>
+        <w:numPr>
+          <w:ilvl w:val="0"/>
+          <w:numId w:val="7"/>
+        </w:numPr>
+        <w:spacing w:after="160"/>
+      </w:pPr>
+      <w:r>
+        <w:t>Oracle GoldenGate consumes from that same channel and applies the OpenCDC events to the Exadata system, and symmetrically publishes its own customer table changes back as OpenCDC events for IIDR to consume</w:t>
+      </w:r>
+    </w:p>
+    <w:p>
+      <w:pPr>
+        <w:spacing w:after="160"/>
         <w:rPr>
           <w:b/>
           <w:bCs/>
@@ -2851,6 +2304,15 @@
           <w:szCs w:val="32"/>
         </w:rPr>
       </w:pPr>
+      <w:r>
+        <w:t>The two tools never need to understand each other's proprietary formats. They only need to agree on the event structure</w:t>
+      </w:r>
+      <w:r>
+        <w:t xml:space="preserve"> between them,</w:t>
+      </w:r>
+      <w:r>
+        <w:t xml:space="preserve"> and OpenCDC is that agreement.</w:t>
+      </w:r>
       <w:bookmarkStart w:id="1" w:name="_Toc228712293"/>
       <w:r>
         <w:br w:type="page"/>
@@ -2881,43 +2343,7 @@
           <w:iCs/>
           <w:color w:val="333333"/>
         </w:rPr>
-        <w:t xml:space="preserve">As a Data Platform Engineer responsible for ingesting CDC feeds into a Bronze-layer </w:t>
-      </w:r>
-      <w:proofErr w:type="spellStart"/>
-      <w:r>
-        <w:rPr>
-          <w:i/>
-          <w:iCs/>
-          <w:color w:val="333333"/>
-        </w:rPr>
-        <w:t>lakehouse</w:t>
-      </w:r>
-      <w:proofErr w:type="spellEnd"/>
-      <w:r>
-        <w:rPr>
-          <w:i/>
-          <w:iCs/>
-          <w:color w:val="333333"/>
-        </w:rPr>
-        <w:t xml:space="preserve">, I want all upstream CDC tools to emit events in a common </w:t>
-      </w:r>
-      <w:proofErr w:type="spellStart"/>
-      <w:r>
-        <w:rPr>
-          <w:i/>
-          <w:iCs/>
-          <w:color w:val="333333"/>
-        </w:rPr>
-        <w:t>OpenCDC</w:t>
-      </w:r>
-      <w:proofErr w:type="spellEnd"/>
-      <w:r>
-        <w:rPr>
-          <w:i/>
-          <w:iCs/>
-          <w:color w:val="333333"/>
-        </w:rPr>
-        <w:t xml:space="preserve"> format, so that I can build and maintain a single, unified ingestion pipeline instead of writing and managing bespoke format handlers for every source system.</w:t>
+        <w:t>As a Data Platform Engineer responsible for ingesting CDC feeds into a Bronze-layer lakehouse, I want all upstream CDC tools to emit events in a common OpenCDC format, so that I can build and maintain a single, unified ingestion pipeline instead of writing and managing bespoke format handlers for every source system.</w:t>
       </w:r>
     </w:p>
     <w:p>
@@ -3001,13 +2427,8 @@
         </w:numPr>
         <w:spacing w:before="40" w:after="40"/>
       </w:pPr>
-      <w:proofErr w:type="spellStart"/>
-      <w:r>
-        <w:t>Debezium</w:t>
-      </w:r>
-      <w:proofErr w:type="spellEnd"/>
-      <w:r>
-        <w:t xml:space="preserve"> on Oracle: one payload shape, one set of transaction semantics</w:t>
+      <w:r>
+        <w:t>Debezium on Oracle: one payload shape, one set of transaction semantics</w:t>
       </w:r>
     </w:p>
     <w:p>
@@ -3019,13 +2440,8 @@
         </w:numPr>
         <w:spacing w:before="40" w:after="40"/>
       </w:pPr>
-      <w:proofErr w:type="spellStart"/>
-      <w:r>
-        <w:t>Debezium</w:t>
-      </w:r>
-      <w:proofErr w:type="spellEnd"/>
-      <w:r>
-        <w:t xml:space="preserve"> on PostgreSQL: similar, but with subtly different field names, type representations, and LSN-based sequencing</w:t>
+      <w:r>
+        <w:t>Debezium on PostgreSQL: similar, but with subtly different field names, type representations, and LSN-based sequencing</w:t>
       </w:r>
     </w:p>
     <w:p>
@@ -3038,13 +2454,8 @@
         <w:spacing w:before="40" w:after="40"/>
       </w:pPr>
       <w:r>
-        <w:t xml:space="preserve">IBM IIDR on DB2 LUW: a third proprietary format with its own before/after record structure and commit </w:t>
-      </w:r>
-      <w:proofErr w:type="gramStart"/>
-      <w:r>
-        <w:t>metadata</w:t>
-      </w:r>
-      <w:proofErr w:type="gramEnd"/>
+        <w:t>IBM IIDR on DB2 LUW: a third proprietary format with its own before/after record structure and commit metadata</w:t>
+      </w:r>
     </w:p>
     <w:p>
       <w:pPr>
@@ -3069,13 +2480,8 @@
         <w:spacing w:before="40" w:after="40"/>
       </w:pPr>
       <w:r>
-        <w:t xml:space="preserve">Three independent ingestion code paths to build, test, and </w:t>
-      </w:r>
-      <w:proofErr w:type="gramStart"/>
-      <w:r>
-        <w:t>maintain</w:t>
-      </w:r>
-      <w:proofErr w:type="gramEnd"/>
+        <w:t>Three independent ingestion code paths to build, test, and maintain</w:t>
+      </w:r>
     </w:p>
     <w:p>
       <w:pPr>
@@ -3087,13 +2493,8 @@
         <w:spacing w:before="40" w:after="40"/>
       </w:pPr>
       <w:r>
-        <w:t xml:space="preserve">Three different interpretations of before state, delete, and transaction </w:t>
-      </w:r>
-      <w:proofErr w:type="gramStart"/>
-      <w:r>
-        <w:t>boundary</w:t>
-      </w:r>
-      <w:proofErr w:type="gramEnd"/>
+        <w:t>Three different interpretations of before state, delete, and transaction boundary</w:t>
+      </w:r>
     </w:p>
     <w:p>
       <w:pPr>
@@ -3118,15 +2519,7 @@
         <w:spacing w:before="40" w:after="40"/>
       </w:pPr>
       <w:r>
-        <w:t xml:space="preserve">Every new CDC source </w:t>
-      </w:r>
-      <w:proofErr w:type="gramStart"/>
-      <w:r>
-        <w:t>risks</w:t>
-      </w:r>
-      <w:proofErr w:type="gramEnd"/>
-      <w:r>
-        <w:t xml:space="preserve"> introducing yet another format variant</w:t>
+        <w:t>Every new CDC source risks introducing yet another format variant</w:t>
       </w:r>
     </w:p>
     <w:p>
@@ -3139,15 +2532,7 @@
         <w:spacing w:after="160"/>
       </w:pPr>
       <w:r>
-        <w:t xml:space="preserve">The cost is not just engineering time — it is data quality risk. Subtle differences in how each pipeline interprets its source format create inconsistencies that propagate into </w:t>
-      </w:r>
-      <w:proofErr w:type="gramStart"/>
-      <w:r>
-        <w:t>Silver and Gold</w:t>
-      </w:r>
-      <w:proofErr w:type="gramEnd"/>
-      <w:r>
-        <w:t xml:space="preserve"> layers and ultimately into business reporting.</w:t>
+        <w:t>The cost is not just engineering time — it is data quality risk. Subtle differences in how each pipeline interprets its source format create inconsistencies that propagate into Silver and Gold layers and ultimately into business reporting.</w:t>
       </w:r>
     </w:p>
     <w:p>
@@ -3156,15 +2541,7 @@
       </w:pPr>
       <w:r>
         <w:lastRenderedPageBreak/>
-        <w:t xml:space="preserve">The </w:t>
-      </w:r>
-      <w:proofErr w:type="spellStart"/>
-      <w:r>
-        <w:t>OpenCDC</w:t>
-      </w:r>
-      <w:proofErr w:type="spellEnd"/>
-      <w:r>
-        <w:t xml:space="preserve"> Difference</w:t>
+        <w:t>The OpenCDC Difference</w:t>
       </w:r>
     </w:p>
     <w:p>
@@ -3172,23 +2549,7 @@
         <w:spacing w:after="160"/>
       </w:pPr>
       <w:r>
-        <w:t xml:space="preserve">As upstream teams adopt CDC tools that support </w:t>
-      </w:r>
-      <w:proofErr w:type="spellStart"/>
-      <w:r>
-        <w:t>OpenCDC</w:t>
-      </w:r>
-      <w:proofErr w:type="spellEnd"/>
-      <w:r>
-        <w:t xml:space="preserve"> as a native output format, the Data Platform Engineer can retire per-source format handlers one by one — replacing them with a single shared ingestion processor that understands the </w:t>
-      </w:r>
-      <w:proofErr w:type="spellStart"/>
-      <w:r>
-        <w:t>OpenCDC</w:t>
-      </w:r>
-      <w:proofErr w:type="spellEnd"/>
-      <w:r>
-        <w:t xml:space="preserve"> event envelope.</w:t>
+        <w:t>As upstream teams adopt CDC tools that support OpenCDC as a native output format, the Data Platform Engineer can retire per-source format handlers one by one — replacing them with a single shared ingestion processor that understands the OpenCDC event envelope.</w:t>
       </w:r>
     </w:p>
     <w:p>
@@ -3201,15 +2562,7 @@
         <w:spacing w:after="160"/>
       </w:pPr>
       <w:r>
-        <w:t xml:space="preserve">The normalized </w:t>
-      </w:r>
-      <w:proofErr w:type="spellStart"/>
-      <w:r>
-        <w:t>OpenCDC</w:t>
-      </w:r>
-      <w:proofErr w:type="spellEnd"/>
-      <w:r>
-        <w:t xml:space="preserve"> event provides, consistently across all sources:</w:t>
+        <w:t>The normalized OpenCDC event provides, consistently across all sources:</w:t>
       </w:r>
     </w:p>
     <w:p>
@@ -3261,13 +2614,8 @@
         <w:spacing w:before="40" w:after="40"/>
       </w:pPr>
       <w:r>
-        <w:t xml:space="preserve">A monotonic sequence identifier enabling reliable ordering and </w:t>
-      </w:r>
-      <w:proofErr w:type="gramStart"/>
-      <w:r>
-        <w:t>deduplication</w:t>
-      </w:r>
-      <w:proofErr w:type="gramEnd"/>
+        <w:t>A monotonic sequence identifier enabling reliable ordering and deduplication</w:t>
+      </w:r>
     </w:p>
     <w:p>
       <w:pPr>
@@ -3279,13 +2627,8 @@
         <w:spacing w:before="40" w:after="40"/>
       </w:pPr>
       <w:r>
-        <w:t xml:space="preserve">Transaction boundaries, allowing atomic multi-row operations to be applied </w:t>
-      </w:r>
-      <w:proofErr w:type="gramStart"/>
-      <w:r>
-        <w:t>correctly</w:t>
-      </w:r>
-      <w:proofErr w:type="gramEnd"/>
+        <w:t>Transaction boundaries, allowing atomic multi-row operations to be applied correctly</w:t>
+      </w:r>
     </w:p>
     <w:p>
       <w:pPr>
@@ -3321,18 +2664,7 @@
           <w:sz w:val="20"/>
           <w:szCs w:val="20"/>
         </w:rPr>
-        <w:t xml:space="preserve">○ Stretch </w:t>
-      </w:r>
-      <w:proofErr w:type="gramStart"/>
-      <w:r>
-        <w:rPr>
-          <w:b/>
-          <w:bCs/>
-          <w:color w:val="8B6914"/>
-          <w:sz w:val="20"/>
-          <w:szCs w:val="20"/>
-        </w:rPr>
-        <w:t>Story</w:t>
+        <w:t>○ Stretch Story</w:t>
       </w:r>
       <w:r>
         <w:rPr>
@@ -3340,16 +2672,7 @@
           <w:sz w:val="20"/>
           <w:szCs w:val="20"/>
         </w:rPr>
-        <w:t xml:space="preserve">  —</w:t>
-      </w:r>
-      <w:proofErr w:type="gramEnd"/>
-      <w:r>
-        <w:rPr>
-          <w:color w:val="595959"/>
-          <w:sz w:val="20"/>
-          <w:szCs w:val="20"/>
-        </w:rPr>
-        <w:t xml:space="preserve">  Proposed future capability</w:t>
+        <w:t xml:space="preserve">  —  Proposed future capability</w:t>
       </w:r>
     </w:p>
     <w:p>
@@ -3364,25 +2687,7 @@
           <w:iCs/>
           <w:color w:val="333333"/>
         </w:rPr>
-        <w:t xml:space="preserve">As an AI Engineer building a collaborative agent framework for HR onboarding, I want AI agents to autonomously request and consume </w:t>
-      </w:r>
-      <w:proofErr w:type="spellStart"/>
-      <w:r>
-        <w:rPr>
-          <w:i/>
-          <w:iCs/>
-          <w:color w:val="333333"/>
-        </w:rPr>
-        <w:t>OpenCDC</w:t>
-      </w:r>
-      <w:proofErr w:type="spellEnd"/>
-      <w:r>
-        <w:rPr>
-          <w:i/>
-          <w:iCs/>
-          <w:color w:val="333333"/>
-        </w:rPr>
-        <w:t xml:space="preserve"> change event streams from existing CDC infrastructure across multiple enterprise systems, so that onboarding workflows can react to real-time state changes across HR, IT, Facilities, and Security — eliminating the multi-day batch delays that today cause new employees to wait weeks for basic onboarding steps to complete.</w:t>
+        <w:t>As an AI Engineer building a collaborative agent framework for HR onboarding, I want AI agents to autonomously request and consume OpenCDC change event streams from existing CDC infrastructure across multiple enterprise systems, so that onboarding workflows can react to real-time state changes across HR, IT, Facilities, and Security — eliminating the multi-day batch delays that today cause new employees to wait weeks for basic onboarding steps to complete.</w:t>
       </w:r>
     </w:p>
     <w:p>
@@ -3467,15 +2772,7 @@
         <w:spacing w:after="160"/>
       </w:pPr>
       <w:r>
-        <w:t xml:space="preserve">Today, these systems do not communicate in real time. Each runs its own batch ETL process — nightly, or every few hours at best. Delays compound: a one-day lag from HCM to IT means the laptop order is placed late; a further lag to Facilities means the desk is not assigned until the laptop is almost ready to ship. What should be a </w:t>
-      </w:r>
-      <w:proofErr w:type="gramStart"/>
-      <w:r>
-        <w:t>same-day</w:t>
-      </w:r>
-      <w:proofErr w:type="gramEnd"/>
-      <w:r>
-        <w:t xml:space="preserve"> coordinated process routinely takes two weeks.</w:t>
+        <w:t>Today, these systems do not communicate in real time. Each runs its own batch ETL process — nightly, or every few hours at best. Delays compound: a one-day lag from HCM to IT means the laptop order is placed late; a further lag to Facilities means the desk is not assigned until the laptop is almost ready to ship. What should be a same-day coordinated process routinely takes two weeks.</w:t>
       </w:r>
     </w:p>
     <w:p>
@@ -3619,9 +2916,13 @@
                 <w:sz w:val="18"/>
                 <w:szCs w:val="18"/>
               </w:rPr>
-              <w:t xml:space="preserve">  (</w:t>
-            </w:r>
-            <w:proofErr w:type="spellStart"/>
+              <w:t xml:space="preserve">  (Debezium on Postgres, GoldenGate on Oracle)</w:t>
+            </w:r>
+          </w:p>
+          <w:p>
+            <w:pPr>
+              <w:spacing w:before="20" w:after="20"/>
+            </w:pPr>
             <w:r>
               <w:rPr>
                 <w:rFonts w:ascii="Courier New" w:eastAsia="Courier New" w:hAnsi="Courier New" w:cs="Courier New"/>
@@ -3629,9 +2930,13 @@
                 <w:sz w:val="18"/>
                 <w:szCs w:val="18"/>
               </w:rPr>
-              <w:t>Debezium</w:t>
-            </w:r>
-            <w:proofErr w:type="spellEnd"/>
+              <w:t xml:space="preserve">          │</w:t>
+            </w:r>
+          </w:p>
+          <w:p>
+            <w:pPr>
+              <w:spacing w:before="20" w:after="20"/>
+            </w:pPr>
             <w:r>
               <w:rPr>
                 <w:rFonts w:ascii="Courier New" w:eastAsia="Courier New" w:hAnsi="Courier New" w:cs="Courier New"/>
@@ -3639,7 +2944,7 @@
                 <w:sz w:val="18"/>
                 <w:szCs w:val="18"/>
               </w:rPr>
-              <w:t xml:space="preserve"> on Postgres, GoldenGate on Oracle)</w:t>
+              <w:t xml:space="preserve">    OpenCDC Event Streams (Kafka / AsyncAPI)</w:t>
             </w:r>
           </w:p>
           <w:p>
@@ -3667,9 +2972,13 @@
                 <w:sz w:val="18"/>
                 <w:szCs w:val="18"/>
               </w:rPr>
-              <w:t xml:space="preserve">    </w:t>
-            </w:r>
-            <w:proofErr w:type="spellStart"/>
+              <w:t xml:space="preserve">    ┌─────┴──────┐</w:t>
+            </w:r>
+          </w:p>
+          <w:p>
+            <w:pPr>
+              <w:spacing w:before="20" w:after="20"/>
+            </w:pPr>
             <w:r>
               <w:rPr>
                 <w:rFonts w:ascii="Courier New" w:eastAsia="Courier New" w:hAnsi="Courier New" w:cs="Courier New"/>
@@ -3677,9 +2986,13 @@
                 <w:sz w:val="18"/>
                 <w:szCs w:val="18"/>
               </w:rPr>
-              <w:t>OpenCDC</w:t>
-            </w:r>
-            <w:proofErr w:type="spellEnd"/>
+              <w:t xml:space="preserve">    │  AI Agent Framework  │  ◄── reacts to events</w:t>
+            </w:r>
+          </w:p>
+          <w:p>
+            <w:pPr>
+              <w:spacing w:before="20" w:after="20"/>
+            </w:pPr>
             <w:r>
               <w:rPr>
                 <w:rFonts w:ascii="Courier New" w:eastAsia="Courier New" w:hAnsi="Courier New" w:cs="Courier New"/>
@@ -3687,7 +3000,7 @@
                 <w:sz w:val="18"/>
                 <w:szCs w:val="18"/>
               </w:rPr>
-              <w:t xml:space="preserve"> Event Streams (Kafka / AsyncAPI)</w:t>
+              <w:t xml:space="preserve">    └─────┬──────┘</w:t>
             </w:r>
           </w:p>
           <w:p>
@@ -3715,7 +3028,7 @@
                 <w:sz w:val="18"/>
                 <w:szCs w:val="18"/>
               </w:rPr>
-              <w:t xml:space="preserve">    ┌─────┴──────┐</w:t>
+              <w:t xml:space="preserve">   Downstream Actions</w:t>
             </w:r>
           </w:p>
           <w:p>
@@ -3729,103 +3042,7 @@
                 <w:sz w:val="18"/>
                 <w:szCs w:val="18"/>
               </w:rPr>
-              <w:t xml:space="preserve">    </w:t>
-            </w:r>
-            <w:proofErr w:type="gramStart"/>
-            <w:r>
-              <w:rPr>
-                <w:rFonts w:ascii="Courier New" w:eastAsia="Courier New" w:hAnsi="Courier New" w:cs="Courier New"/>
-                <w:color w:val="222222"/>
-                <w:sz w:val="18"/>
-                <w:szCs w:val="18"/>
-              </w:rPr>
-              <w:t>│  AI</w:t>
-            </w:r>
-            <w:proofErr w:type="gramEnd"/>
-            <w:r>
-              <w:rPr>
-                <w:rFonts w:ascii="Courier New" w:eastAsia="Courier New" w:hAnsi="Courier New" w:cs="Courier New"/>
-                <w:color w:val="222222"/>
-                <w:sz w:val="18"/>
-                <w:szCs w:val="18"/>
-              </w:rPr>
-              <w:t xml:space="preserve"> Agent Framework  │  ◄── reacts to events</w:t>
-            </w:r>
-          </w:p>
-          <w:p>
-            <w:pPr>
-              <w:spacing w:before="20" w:after="20"/>
-            </w:pPr>
-            <w:r>
-              <w:rPr>
-                <w:rFonts w:ascii="Courier New" w:eastAsia="Courier New" w:hAnsi="Courier New" w:cs="Courier New"/>
-                <w:color w:val="222222"/>
-                <w:sz w:val="18"/>
-                <w:szCs w:val="18"/>
-              </w:rPr>
-              <w:t xml:space="preserve">    └─────┬──────┘</w:t>
-            </w:r>
-          </w:p>
-          <w:p>
-            <w:pPr>
-              <w:spacing w:before="20" w:after="20"/>
-            </w:pPr>
-            <w:r>
-              <w:rPr>
-                <w:rFonts w:ascii="Courier New" w:eastAsia="Courier New" w:hAnsi="Courier New" w:cs="Courier New"/>
-                <w:color w:val="222222"/>
-                <w:sz w:val="18"/>
-                <w:szCs w:val="18"/>
-              </w:rPr>
-              <w:t xml:space="preserve">          │</w:t>
-            </w:r>
-          </w:p>
-          <w:p>
-            <w:pPr>
-              <w:spacing w:before="20" w:after="20"/>
-            </w:pPr>
-            <w:r>
-              <w:rPr>
-                <w:rFonts w:ascii="Courier New" w:eastAsia="Courier New" w:hAnsi="Courier New" w:cs="Courier New"/>
-                <w:color w:val="222222"/>
-                <w:sz w:val="18"/>
-                <w:szCs w:val="18"/>
-              </w:rPr>
-              <w:t xml:space="preserve">   Downstream Actions</w:t>
-            </w:r>
-          </w:p>
-          <w:p>
-            <w:pPr>
-              <w:spacing w:before="20" w:after="20"/>
-            </w:pPr>
-            <w:r>
-              <w:rPr>
-                <w:rFonts w:ascii="Courier New" w:eastAsia="Courier New" w:hAnsi="Courier New" w:cs="Courier New"/>
-                <w:color w:val="222222"/>
-                <w:sz w:val="18"/>
-                <w:szCs w:val="18"/>
-              </w:rPr>
-              <w:t>(</w:t>
-            </w:r>
-            <w:proofErr w:type="gramStart"/>
-            <w:r>
-              <w:rPr>
-                <w:rFonts w:ascii="Courier New" w:eastAsia="Courier New" w:hAnsi="Courier New" w:cs="Courier New"/>
-                <w:color w:val="222222"/>
-                <w:sz w:val="18"/>
-                <w:szCs w:val="18"/>
-              </w:rPr>
-              <w:t>welcome</w:t>
-            </w:r>
-            <w:proofErr w:type="gramEnd"/>
-            <w:r>
-              <w:rPr>
-                <w:rFonts w:ascii="Courier New" w:eastAsia="Courier New" w:hAnsi="Courier New" w:cs="Courier New"/>
-                <w:color w:val="222222"/>
-                <w:sz w:val="18"/>
-                <w:szCs w:val="18"/>
-              </w:rPr>
-              <w:t xml:space="preserve"> email, IT ticket, badge, manager notify)</w:t>
+              <w:t>(welcome email, IT ticket, badge, manager notify)</w:t>
             </w:r>
           </w:p>
         </w:tc>
@@ -3869,15 +3086,7 @@
         <w:t xml:space="preserve">Note: </w:t>
       </w:r>
       <w:r>
-        <w:t xml:space="preserve">The following capability — allowing an AI agent to dynamically request a new CDC stream without manual DBA configuration — is a proposed future extension to the </w:t>
-      </w:r>
-      <w:proofErr w:type="spellStart"/>
-      <w:r>
-        <w:t>OpenCDC</w:t>
-      </w:r>
-      <w:proofErr w:type="spellEnd"/>
-      <w:r>
-        <w:t xml:space="preserve"> specification. It is not assumed to be present in an initial version of the standard.</w:t>
+        <w:t>The following capability — allowing an AI agent to dynamically request a new CDC stream without manual DBA configuration — is a proposed future extension to the OpenCDC specification. It is not assumed to be present in an initial version of the standard.</w:t>
       </w:r>
     </w:p>
     <w:p>
@@ -3890,15 +3099,7 @@
         <w:spacing w:after="160"/>
       </w:pPr>
       <w:r>
-        <w:t xml:space="preserve">The proposed mechanism: an agent submits a structured request document to a compliant CDC tool describing which business objects it wants to observe and where it wants events delivered. The CDC tool authenticates the request, validates the agent’s permissions, self-configures the appropriate table </w:t>
-      </w:r>
-      <w:proofErr w:type="gramStart"/>
-      <w:r>
-        <w:t>subscriptions</w:t>
-      </w:r>
-      <w:proofErr w:type="gramEnd"/>
-      <w:r>
-        <w:t xml:space="preserve"> and filters, and opens the requested stream.</w:t>
+        <w:t>The proposed mechanism: an agent submits a structured request document to a compliant CDC tool describing which business objects it wants to observe and where it wants events delivered. The CDC tool authenticates the request, validates the agent’s permissions, self-configures the appropriate table subscriptions and filters, and opens the requested stream.</w:t>
       </w:r>
     </w:p>
     <w:p>
@@ -3911,15 +3112,7 @@
         <w:spacing w:after="160"/>
       </w:pPr>
       <w:r>
-        <w:t xml:space="preserve">Example: Facilities desk assignment via </w:t>
-      </w:r>
-      <w:proofErr w:type="spellStart"/>
-      <w:r>
-        <w:t>Debezium</w:t>
-      </w:r>
-      <w:proofErr w:type="spellEnd"/>
-      <w:r>
-        <w:t xml:space="preserve"> on PostgreSQL</w:t>
+        <w:t>Example: Facilities desk assignment via Debezium on PostgreSQL</w:t>
       </w:r>
     </w:p>
     <w:tbl>
@@ -3964,7 +3157,6 @@
             <w:pPr>
               <w:spacing w:before="20" w:after="20"/>
             </w:pPr>
-            <w:proofErr w:type="spellStart"/>
             <w:r>
               <w:rPr>
                 <w:rFonts w:ascii="Courier New" w:eastAsia="Courier New" w:hAnsi="Courier New" w:cs="Courier New"/>
@@ -3972,9 +3164,13 @@
                 <w:sz w:val="18"/>
                 <w:szCs w:val="18"/>
               </w:rPr>
-              <w:t>opencdc</w:t>
-            </w:r>
-            <w:proofErr w:type="spellEnd"/>
+              <w:t>opencdc: v1</w:t>
+            </w:r>
+          </w:p>
+          <w:p>
+            <w:pPr>
+              <w:spacing w:before="20" w:after="20"/>
+            </w:pPr>
             <w:r>
               <w:rPr>
                 <w:rFonts w:ascii="Courier New" w:eastAsia="Courier New" w:hAnsi="Courier New" w:cs="Courier New"/>
@@ -3982,7 +3178,7 @@
                 <w:sz w:val="18"/>
                 <w:szCs w:val="18"/>
               </w:rPr>
-              <w:t>: v1</w:t>
+              <w:t>request:</w:t>
             </w:r>
           </w:p>
           <w:p>
@@ -3996,7 +3192,7 @@
                 <w:sz w:val="18"/>
                 <w:szCs w:val="18"/>
               </w:rPr>
-              <w:t>request:</w:t>
+              <w:t xml:space="preserve">  consumer:</w:t>
             </w:r>
           </w:p>
           <w:p>
@@ -4010,7 +3206,7 @@
                 <w:sz w:val="18"/>
                 <w:szCs w:val="18"/>
               </w:rPr>
-              <w:t xml:space="preserve">  consumer:</w:t>
+              <w:t xml:space="preserve">    id: onboarding-agent-facilities</w:t>
             </w:r>
           </w:p>
           <w:p>
@@ -4024,7 +3220,7 @@
                 <w:sz w:val="18"/>
                 <w:szCs w:val="18"/>
               </w:rPr>
-              <w:t xml:space="preserve">    id: onboarding-agent-facilities</w:t>
+              <w:t xml:space="preserve">    auth: bearer &lt;agent_token&gt;</w:t>
             </w:r>
           </w:p>
           <w:p>
@@ -4038,9 +3234,13 @@
                 <w:sz w:val="18"/>
                 <w:szCs w:val="18"/>
               </w:rPr>
-              <w:t xml:space="preserve">    auth: bearer &lt;</w:t>
-            </w:r>
-            <w:proofErr w:type="spellStart"/>
+              <w:t xml:space="preserve">  source:</w:t>
+            </w:r>
+          </w:p>
+          <w:p>
+            <w:pPr>
+              <w:spacing w:before="20" w:after="20"/>
+            </w:pPr>
             <w:r>
               <w:rPr>
                 <w:rFonts w:ascii="Courier New" w:eastAsia="Courier New" w:hAnsi="Courier New" w:cs="Courier New"/>
@@ -4048,9 +3248,13 @@
                 <w:sz w:val="18"/>
                 <w:szCs w:val="18"/>
               </w:rPr>
-              <w:t>agent_token</w:t>
-            </w:r>
-            <w:proofErr w:type="spellEnd"/>
+              <w:t xml:space="preserve">    database: facilities_db</w:t>
+            </w:r>
+          </w:p>
+          <w:p>
+            <w:pPr>
+              <w:spacing w:before="20" w:after="20"/>
+            </w:pPr>
             <w:r>
               <w:rPr>
                 <w:rFonts w:ascii="Courier New" w:eastAsia="Courier New" w:hAnsi="Courier New" w:cs="Courier New"/>
@@ -4058,7 +3262,7 @@
                 <w:sz w:val="18"/>
                 <w:szCs w:val="18"/>
               </w:rPr>
-              <w:t>&gt;</w:t>
+              <w:t xml:space="preserve">    objects:</w:t>
             </w:r>
           </w:p>
           <w:p>
@@ -4072,7 +3276,7 @@
                 <w:sz w:val="18"/>
                 <w:szCs w:val="18"/>
               </w:rPr>
-              <w:t xml:space="preserve">  source:</w:t>
+              <w:t xml:space="preserve">      - entity: room_assignment</w:t>
             </w:r>
           </w:p>
           <w:p>
@@ -4086,9 +3290,13 @@
                 <w:sz w:val="18"/>
                 <w:szCs w:val="18"/>
               </w:rPr>
-              <w:t xml:space="preserve">    database: </w:t>
-            </w:r>
-            <w:proofErr w:type="spellStart"/>
+              <w:t xml:space="preserve">        filter:</w:t>
+            </w:r>
+          </w:p>
+          <w:p>
+            <w:pPr>
+              <w:spacing w:before="20" w:after="20"/>
+            </w:pPr>
             <w:r>
               <w:rPr>
                 <w:rFonts w:ascii="Courier New" w:eastAsia="Courier New" w:hAnsi="Courier New" w:cs="Courier New"/>
@@ -4096,9 +3304,8 @@
                 <w:sz w:val="18"/>
                 <w:szCs w:val="18"/>
               </w:rPr>
-              <w:t>facilities_db</w:t>
-            </w:r>
-            <w:proofErr w:type="spellEnd"/>
+              <w:t xml:space="preserve">          status: [ASSIGNED, PENDING, RELEASED]</w:t>
+            </w:r>
           </w:p>
           <w:p>
             <w:pPr>
@@ -4111,7 +3318,8 @@
                 <w:sz w:val="18"/>
                 <w:szCs w:val="18"/>
               </w:rPr>
-              <w:t xml:space="preserve">    objects:</w:t>
+              <w:lastRenderedPageBreak/>
+              <w:t xml:space="preserve">      - entity: desk_inventory</w:t>
             </w:r>
           </w:p>
           <w:p>
@@ -4125,9 +3333,13 @@
                 <w:sz w:val="18"/>
                 <w:szCs w:val="18"/>
               </w:rPr>
-              <w:t xml:space="preserve">      - entity: </w:t>
-            </w:r>
-            <w:proofErr w:type="spellStart"/>
+              <w:t xml:space="preserve">        filter:</w:t>
+            </w:r>
+          </w:p>
+          <w:p>
+            <w:pPr>
+              <w:spacing w:before="20" w:after="20"/>
+            </w:pPr>
             <w:r>
               <w:rPr>
                 <w:rFonts w:ascii="Courier New" w:eastAsia="Courier New" w:hAnsi="Courier New" w:cs="Courier New"/>
@@ -4135,9 +3347,8 @@
                 <w:sz w:val="18"/>
                 <w:szCs w:val="18"/>
               </w:rPr>
-              <w:t>room_assignment</w:t>
-            </w:r>
-            <w:proofErr w:type="spellEnd"/>
+              <w:t xml:space="preserve">          availability: [AVAILABLE, RESERVED]</w:t>
+            </w:r>
           </w:p>
           <w:p>
             <w:pPr>
@@ -4150,7 +3361,7 @@
                 <w:sz w:val="18"/>
                 <w:szCs w:val="18"/>
               </w:rPr>
-              <w:t xml:space="preserve">        filter:</w:t>
+              <w:t xml:space="preserve">  delivery:</w:t>
             </w:r>
           </w:p>
           <w:p>
@@ -4164,7 +3375,7 @@
                 <w:sz w:val="18"/>
                 <w:szCs w:val="18"/>
               </w:rPr>
-              <w:t xml:space="preserve">          status: [ASSIGNED, PENDING, RELEASED]</w:t>
+              <w:t xml:space="preserve">    transport: kafka</w:t>
             </w:r>
           </w:p>
           <w:p>
@@ -4178,10 +3389,13 @@
                 <w:sz w:val="18"/>
                 <w:szCs w:val="18"/>
               </w:rPr>
-              <w:lastRenderedPageBreak/>
-              <w:t xml:space="preserve">      - entity: </w:t>
-            </w:r>
-            <w:proofErr w:type="spellStart"/>
+              <w:t xml:space="preserve">    topic: agent.facilities.assignments</w:t>
+            </w:r>
+          </w:p>
+          <w:p>
+            <w:pPr>
+              <w:spacing w:before="20" w:after="20"/>
+            </w:pPr>
             <w:r>
               <w:rPr>
                 <w:rFonts w:ascii="Courier New" w:eastAsia="Courier New" w:hAnsi="Courier New" w:cs="Courier New"/>
@@ -4189,9 +3403,8 @@
                 <w:sz w:val="18"/>
                 <w:szCs w:val="18"/>
               </w:rPr>
-              <w:t>desk_inventory</w:t>
-            </w:r>
-            <w:proofErr w:type="spellEnd"/>
+              <w:t xml:space="preserve">    format: opencdc</w:t>
+            </w:r>
           </w:p>
           <w:p>
             <w:pPr>
@@ -4204,155 +3417,7 @@
                 <w:sz w:val="18"/>
                 <w:szCs w:val="18"/>
               </w:rPr>
-              <w:t xml:space="preserve">        filter:</w:t>
-            </w:r>
-          </w:p>
-          <w:p>
-            <w:pPr>
-              <w:spacing w:before="20" w:after="20"/>
-            </w:pPr>
-            <w:r>
-              <w:rPr>
-                <w:rFonts w:ascii="Courier New" w:eastAsia="Courier New" w:hAnsi="Courier New" w:cs="Courier New"/>
-                <w:color w:val="222222"/>
-                <w:sz w:val="18"/>
-                <w:szCs w:val="18"/>
-              </w:rPr>
-              <w:t xml:space="preserve">          availability: [AVAILABLE, RESERVED]</w:t>
-            </w:r>
-          </w:p>
-          <w:p>
-            <w:pPr>
-              <w:spacing w:before="20" w:after="20"/>
-            </w:pPr>
-            <w:r>
-              <w:rPr>
-                <w:rFonts w:ascii="Courier New" w:eastAsia="Courier New" w:hAnsi="Courier New" w:cs="Courier New"/>
-                <w:color w:val="222222"/>
-                <w:sz w:val="18"/>
-                <w:szCs w:val="18"/>
-              </w:rPr>
-              <w:t xml:space="preserve">  delivery:</w:t>
-            </w:r>
-          </w:p>
-          <w:p>
-            <w:pPr>
-              <w:spacing w:before="20" w:after="20"/>
-            </w:pPr>
-            <w:r>
-              <w:rPr>
-                <w:rFonts w:ascii="Courier New" w:eastAsia="Courier New" w:hAnsi="Courier New" w:cs="Courier New"/>
-                <w:color w:val="222222"/>
-                <w:sz w:val="18"/>
-                <w:szCs w:val="18"/>
-              </w:rPr>
-              <w:t xml:space="preserve">    transport: </w:t>
-            </w:r>
-            <w:proofErr w:type="spellStart"/>
-            <w:r>
-              <w:rPr>
-                <w:rFonts w:ascii="Courier New" w:eastAsia="Courier New" w:hAnsi="Courier New" w:cs="Courier New"/>
-                <w:color w:val="222222"/>
-                <w:sz w:val="18"/>
-                <w:szCs w:val="18"/>
-              </w:rPr>
-              <w:t>kafka</w:t>
-            </w:r>
-            <w:proofErr w:type="spellEnd"/>
-          </w:p>
-          <w:p>
-            <w:pPr>
-              <w:spacing w:before="20" w:after="20"/>
-            </w:pPr>
-            <w:r>
-              <w:rPr>
-                <w:rFonts w:ascii="Courier New" w:eastAsia="Courier New" w:hAnsi="Courier New" w:cs="Courier New"/>
-                <w:color w:val="222222"/>
-                <w:sz w:val="18"/>
-                <w:szCs w:val="18"/>
-              </w:rPr>
-              <w:t xml:space="preserve">    topic: </w:t>
-            </w:r>
-            <w:proofErr w:type="spellStart"/>
-            <w:proofErr w:type="gramStart"/>
-            <w:r>
-              <w:rPr>
-                <w:rFonts w:ascii="Courier New" w:eastAsia="Courier New" w:hAnsi="Courier New" w:cs="Courier New"/>
-                <w:color w:val="222222"/>
-                <w:sz w:val="18"/>
-                <w:szCs w:val="18"/>
-              </w:rPr>
-              <w:t>agent.facilities</w:t>
-            </w:r>
-            <w:proofErr w:type="gramEnd"/>
-            <w:r>
-              <w:rPr>
-                <w:rFonts w:ascii="Courier New" w:eastAsia="Courier New" w:hAnsi="Courier New" w:cs="Courier New"/>
-                <w:color w:val="222222"/>
-                <w:sz w:val="18"/>
-                <w:szCs w:val="18"/>
-              </w:rPr>
-              <w:t>.assignments</w:t>
-            </w:r>
-            <w:proofErr w:type="spellEnd"/>
-          </w:p>
-          <w:p>
-            <w:pPr>
-              <w:spacing w:before="20" w:after="20"/>
-            </w:pPr>
-            <w:r>
-              <w:rPr>
-                <w:rFonts w:ascii="Courier New" w:eastAsia="Courier New" w:hAnsi="Courier New" w:cs="Courier New"/>
-                <w:color w:val="222222"/>
-                <w:sz w:val="18"/>
-                <w:szCs w:val="18"/>
-              </w:rPr>
-              <w:t xml:space="preserve">    format: </w:t>
-            </w:r>
-            <w:proofErr w:type="spellStart"/>
-            <w:r>
-              <w:rPr>
-                <w:rFonts w:ascii="Courier New" w:eastAsia="Courier New" w:hAnsi="Courier New" w:cs="Courier New"/>
-                <w:color w:val="222222"/>
-                <w:sz w:val="18"/>
-                <w:szCs w:val="18"/>
-              </w:rPr>
-              <w:t>opencdc</w:t>
-            </w:r>
-            <w:proofErr w:type="spellEnd"/>
-          </w:p>
-          <w:p>
-            <w:pPr>
-              <w:spacing w:before="20" w:after="20"/>
-            </w:pPr>
-            <w:r>
-              <w:rPr>
-                <w:rFonts w:ascii="Courier New" w:eastAsia="Courier New" w:hAnsi="Courier New" w:cs="Courier New"/>
-                <w:color w:val="222222"/>
-                <w:sz w:val="18"/>
-                <w:szCs w:val="18"/>
-              </w:rPr>
-              <w:t xml:space="preserve">    </w:t>
-            </w:r>
-            <w:proofErr w:type="spellStart"/>
-            <w:r>
-              <w:rPr>
-                <w:rFonts w:ascii="Courier New" w:eastAsia="Courier New" w:hAnsi="Courier New" w:cs="Courier New"/>
-                <w:color w:val="222222"/>
-                <w:sz w:val="18"/>
-                <w:szCs w:val="18"/>
-              </w:rPr>
-              <w:t>qos</w:t>
-            </w:r>
-            <w:proofErr w:type="spellEnd"/>
-            <w:r>
-              <w:rPr>
-                <w:rFonts w:ascii="Courier New" w:eastAsia="Courier New" w:hAnsi="Courier New" w:cs="Courier New"/>
-                <w:color w:val="222222"/>
-                <w:sz w:val="18"/>
-                <w:szCs w:val="18"/>
-              </w:rPr>
-              <w:t>: at-least-once</w:t>
+              <w:t xml:space="preserve">    qos: at-least-once</w:t>
             </w:r>
           </w:p>
         </w:tc>
@@ -4367,21 +3432,8 @@
       <w:pPr>
         <w:spacing w:after="160"/>
       </w:pPr>
-      <w:proofErr w:type="spellStart"/>
-      <w:r>
-        <w:t>Debezium</w:t>
-      </w:r>
-      <w:proofErr w:type="spellEnd"/>
-      <w:r>
-        <w:t xml:space="preserve"> authenticates the agent token, confirms read permissions on the relevant tables, maps business object names to underlying PostgreSQL tables, configures the logical replication slot and publication filter, and begins emitting </w:t>
-      </w:r>
-      <w:proofErr w:type="spellStart"/>
-      <w:r>
-        <w:t>OpenCDC</w:t>
-      </w:r>
-      <w:proofErr w:type="spellEnd"/>
-      <w:r>
-        <w:t xml:space="preserve"> events to the specified Kafka topic. No DBA intervention required.</w:t>
+      <w:r>
+        <w:t>Debezium authenticates the agent token, confirms read permissions on the relevant tables, maps business object names to underlying PostgreSQL tables, configures the logical replication slot and publication filter, and begins emitting OpenCDC events to the specified Kafka topic. No DBA intervention required.</w:t>
       </w:r>
     </w:p>
     <w:p>
@@ -4394,15 +3446,7 @@
         <w:pStyle w:val="Heading2"/>
       </w:pPr>
       <w:r>
-        <w:t xml:space="preserve">What an </w:t>
-      </w:r>
-      <w:proofErr w:type="spellStart"/>
-      <w:r>
-        <w:t>OpenCDC</w:t>
-      </w:r>
-      <w:proofErr w:type="spellEnd"/>
-      <w:r>
-        <w:t xml:space="preserve"> Event Looks Like to the Agent</w:t>
+        <w:t>What an OpenCDC Event Looks Like to the Agent</w:t>
       </w:r>
     </w:p>
     <w:p>
@@ -4410,49 +3454,7 @@
         <w:spacing w:after="160"/>
       </w:pPr>
       <w:r>
-        <w:t xml:space="preserve">Regardless of whether the event came from </w:t>
-      </w:r>
-      <w:proofErr w:type="spellStart"/>
-      <w:r>
-        <w:t>Debezium</w:t>
-      </w:r>
-      <w:proofErr w:type="spellEnd"/>
-      <w:r>
-        <w:t xml:space="preserve"> on Postgres or GoldenGate on Oracle, the agent receives the same </w:t>
-      </w:r>
-      <w:proofErr w:type="spellStart"/>
-      <w:r>
-        <w:t>CloudEvents</w:t>
-      </w:r>
-      <w:proofErr w:type="spellEnd"/>
-      <w:r>
-        <w:t xml:space="preserve">-compatible envelope structure. The agent reads </w:t>
-      </w:r>
-      <w:proofErr w:type="spellStart"/>
-      <w:proofErr w:type="gramStart"/>
-      <w:r>
-        <w:t>data.op</w:t>
-      </w:r>
-      <w:proofErr w:type="spellEnd"/>
-      <w:proofErr w:type="gramEnd"/>
-      <w:r>
-        <w:t xml:space="preserve">, </w:t>
-      </w:r>
-      <w:proofErr w:type="spellStart"/>
-      <w:r>
-        <w:t>data.before</w:t>
-      </w:r>
-      <w:proofErr w:type="spellEnd"/>
-      <w:r>
-        <w:t xml:space="preserve">, and </w:t>
-      </w:r>
-      <w:proofErr w:type="spellStart"/>
-      <w:r>
-        <w:t>data.after</w:t>
-      </w:r>
-      <w:proofErr w:type="spellEnd"/>
-      <w:r>
-        <w:t xml:space="preserve"> from consistent field paths regardless of source system. A desk assignment event from Facilities and a laptop shipment event from IT are processed by the same event handler — no per-system parsing, no format translation, no bespoke integration code.</w:t>
+        <w:t>Regardless of whether the event came from Debezium on Postgres or GoldenGate on Oracle, the agent receives the same CloudEvents-compatible envelope structure. The agent reads data.op, data.before, and data.after from consistent field paths regardless of source system. A desk assignment event from Facilities and a laptop shipment event from IT are processed by the same event handler — no per-system parsing, no format translation, no bespoke integration code.</w:t>
       </w:r>
     </w:p>
     <w:p>
@@ -5068,15 +4070,7 @@
       </w:pPr>
       <w:r>
         <w:lastRenderedPageBreak/>
-        <w:t xml:space="preserve">5. Database Fire-and-Forget to </w:t>
-      </w:r>
-      <w:proofErr w:type="gramStart"/>
-      <w:r>
-        <w:t>Streaming</w:t>
-      </w:r>
-      <w:proofErr w:type="gramEnd"/>
-      <w:r>
-        <w:t xml:space="preserve"> Pipeline</w:t>
+        <w:t>5. Database Fire-and-Forget to Streaming Pipeline</w:t>
       </w:r>
       <w:bookmarkEnd w:id="2"/>
     </w:p>
@@ -5092,18 +4086,7 @@
           <w:sz w:val="20"/>
           <w:szCs w:val="20"/>
         </w:rPr>
-        <w:t xml:space="preserve">○ Stretch </w:t>
-      </w:r>
-      <w:proofErr w:type="gramStart"/>
-      <w:r>
-        <w:rPr>
-          <w:b/>
-          <w:bCs/>
-          <w:color w:val="8B6914"/>
-          <w:sz w:val="20"/>
-          <w:szCs w:val="20"/>
-        </w:rPr>
-        <w:t>Story</w:t>
+        <w:t>○ Stretch Story</w:t>
       </w:r>
       <w:r>
         <w:rPr>
@@ -5111,16 +4094,7 @@
           <w:sz w:val="20"/>
           <w:szCs w:val="20"/>
         </w:rPr>
-        <w:t xml:space="preserve">  —</w:t>
-      </w:r>
-      <w:proofErr w:type="gramEnd"/>
-      <w:r>
-        <w:rPr>
-          <w:color w:val="595959"/>
-          <w:sz w:val="20"/>
-          <w:szCs w:val="20"/>
-        </w:rPr>
-        <w:t xml:space="preserve">  No CDC tools deployed</w:t>
+        <w:t xml:space="preserve">  —  No CDC tools deployed</w:t>
       </w:r>
     </w:p>
     <w:p>
@@ -5135,43 +4109,7 @@
           <w:iCs/>
           <w:color w:val="333333"/>
         </w:rPr>
-        <w:t xml:space="preserve">As a Stream Processing Data Engineer building real-time logistics pipelines, I want on-premises PostgreSQL databases at regional shipping hubs to continuously emit change events in </w:t>
-      </w:r>
-      <w:proofErr w:type="spellStart"/>
-      <w:r>
-        <w:rPr>
-          <w:i/>
-          <w:iCs/>
-          <w:color w:val="333333"/>
-        </w:rPr>
-        <w:t>OpenCDC</w:t>
-      </w:r>
-      <w:proofErr w:type="spellEnd"/>
-      <w:r>
-        <w:rPr>
-          <w:i/>
-          <w:iCs/>
-          <w:color w:val="333333"/>
-        </w:rPr>
-        <w:t xml:space="preserve"> format over Arrow Flight, so that my </w:t>
-      </w:r>
-      <w:proofErr w:type="spellStart"/>
-      <w:r>
-        <w:rPr>
-          <w:i/>
-          <w:iCs/>
-          <w:color w:val="333333"/>
-        </w:rPr>
-        <w:t>Flink</w:t>
-      </w:r>
-      <w:proofErr w:type="spellEnd"/>
-      <w:r>
-        <w:rPr>
-          <w:i/>
-          <w:iCs/>
-          <w:color w:val="333333"/>
-        </w:rPr>
-        <w:t xml:space="preserve"> pipelines can react to inventory and shipment changes as they happen — without polling, without deploying a full CDC tool stack, and without adding operational complexity to hub systems my team does not own.</w:t>
+        <w:t>As a Stream Processing Data Engineer building real-time logistics pipelines, I want on-premises PostgreSQL databases at regional shipping hubs to continuously emit change events in OpenCDC format over Arrow Flight, so that my Flink pipelines can react to inventory and shipment changes as they happen — without polling, without deploying a full CDC tool stack, and without adding operational complexity to hub systems my team does not own.</w:t>
       </w:r>
     </w:p>
     <w:p>
@@ -5256,15 +4194,7 @@
         <w:spacing w:after="160"/>
       </w:pPr>
       <w:r>
-        <w:t xml:space="preserve">My team owns the stream processing layer. We run </w:t>
-      </w:r>
-      <w:proofErr w:type="spellStart"/>
-      <w:r>
-        <w:t>Flink</w:t>
-      </w:r>
-      <w:proofErr w:type="spellEnd"/>
-      <w:r>
-        <w:t xml:space="preserve"> pipelines that aggregate, correlate, and route logistics events from dozens of sources. Management has asked us to integrate live inventory change feeds from 10 regional shipping hub databases. As shipments pass through each hub, the hub’s PostgreSQL inventory system records arrival, departure, status updates, and exceptions — most critically in the bill of lading table, which is the canonical record of what is on each truck or container and where it is going.</w:t>
+        <w:t>My team owns the stream processing layer. We run Flink pipelines that aggregate, correlate, and route logistics events from dozens of sources. Management has asked us to integrate live inventory change feeds from 10 regional shipping hub databases. As shipments pass through each hub, the hub’s PostgreSQL inventory system records arrival, departure, status updates, and exceptions — most critically in the bill of lading table, which is the canonical record of what is on each truck or container and where it is going.</w:t>
       </w:r>
     </w:p>
     <w:p>
@@ -5316,25 +4246,12 @@
         </w:rPr>
         <w:t xml:space="preserve">Full CDC tool deployment. </w:t>
       </w:r>
-      <w:proofErr w:type="spellStart"/>
-      <w:r>
-        <w:t>Debezium</w:t>
-      </w:r>
-      <w:proofErr w:type="spellEnd"/>
-      <w:r>
-        <w:t xml:space="preserve">, GoldenGate, and similar tools provide exactly-once guarantees, schema history, and durable replay — all genuinely valuable. But they also require agent installation on systems owned by regional IT teams, broker infrastructure to manage, security reviews per site, and ongoing operational ownership </w:t>
+      <w:r>
+        <w:t xml:space="preserve">Debezium, GoldenGate, and similar tools provide exactly-once guarantees, schema history, and durable replay — all genuinely valuable. But they also require agent installation on systems owned by regional IT teams, broker infrastructure to manage, security reviews per site, and ongoing operational ownership </w:t>
       </w:r>
       <w:r>
         <w:lastRenderedPageBreak/>
-        <w:t xml:space="preserve">across 10 geographically distributed locations. For the data quality guarantees we </w:t>
-      </w:r>
-      <w:proofErr w:type="gramStart"/>
-      <w:r>
-        <w:t>actually need</w:t>
-      </w:r>
-      <w:proofErr w:type="gramEnd"/>
-      <w:r>
-        <w:t>, this is more infrastructure than the use case warrants.</w:t>
+        <w:t>across 10 geographically distributed locations. For the data quality guarantees we actually need, this is more infrastructure than the use case warrants.</w:t>
       </w:r>
     </w:p>
     <w:p>
@@ -5347,15 +4264,7 @@
         <w:pStyle w:val="Heading2"/>
       </w:pPr>
       <w:r>
-        <w:t xml:space="preserve">The </w:t>
-      </w:r>
-      <w:proofErr w:type="spellStart"/>
-      <w:r>
-        <w:t>OpenCDC</w:t>
-      </w:r>
-      <w:proofErr w:type="spellEnd"/>
-      <w:r>
-        <w:t xml:space="preserve"> Arrow Flight Approach</w:t>
+        <w:t>The OpenCDC Arrow Flight Approach</w:t>
       </w:r>
     </w:p>
     <w:p>
@@ -5363,23 +4272,7 @@
         <w:spacing w:after="160"/>
       </w:pPr>
       <w:r>
-        <w:t xml:space="preserve">A PostgreSQL extension enables the database to emit a continuous stream of </w:t>
-      </w:r>
-      <w:proofErr w:type="spellStart"/>
-      <w:r>
-        <w:t>OpenCDC</w:t>
-      </w:r>
-      <w:proofErr w:type="spellEnd"/>
-      <w:r>
-        <w:t>-formatted change events directly over Arrow Flight (</w:t>
-      </w:r>
-      <w:proofErr w:type="spellStart"/>
-      <w:r>
-        <w:t>gRPC</w:t>
-      </w:r>
-      <w:proofErr w:type="spellEnd"/>
-      <w:r>
-        <w:t>/TLS) — no additional middleware, no broker, no agent beyond enabling the extension.</w:t>
+        <w:t>A PostgreSQL extension enables the database to emit a continuous stream of OpenCDC-formatted change events directly over Arrow Flight (gRPC/TLS) — no additional middleware, no broker, no agent beyond enabling the extension.</w:t>
       </w:r>
     </w:p>
     <w:p>
@@ -5450,9 +4343,13 @@
                 <w:sz w:val="18"/>
                 <w:szCs w:val="18"/>
               </w:rPr>
-              <w:t>(</w:t>
-            </w:r>
-            <w:proofErr w:type="spellStart"/>
+              <w:t>(OpenCDC Arrow Flight extension)</w:t>
+            </w:r>
+          </w:p>
+          <w:p>
+            <w:pPr>
+              <w:spacing w:before="20" w:after="20"/>
+            </w:pPr>
             <w:r>
               <w:rPr>
                 <w:rFonts w:ascii="Courier New" w:eastAsia="Courier New" w:hAnsi="Courier New" w:cs="Courier New"/>
@@ -5460,9 +4357,13 @@
                 <w:sz w:val="18"/>
                 <w:szCs w:val="18"/>
               </w:rPr>
-              <w:t>OpenCDC</w:t>
-            </w:r>
-            <w:proofErr w:type="spellEnd"/>
+              <w:t xml:space="preserve">          │</w:t>
+            </w:r>
+          </w:p>
+          <w:p>
+            <w:pPr>
+              <w:spacing w:before="20" w:after="20"/>
+            </w:pPr>
             <w:r>
               <w:rPr>
                 <w:rFonts w:ascii="Courier New" w:eastAsia="Courier New" w:hAnsi="Courier New" w:cs="Courier New"/>
@@ -5470,7 +4371,7 @@
                 <w:sz w:val="18"/>
                 <w:szCs w:val="18"/>
               </w:rPr>
-              <w:t xml:space="preserve"> Arrow Flight extension)</w:t>
+              <w:t xml:space="preserve">     gRPC / TLS</w:t>
             </w:r>
           </w:p>
           <w:p>
@@ -5498,9 +4399,13 @@
                 <w:sz w:val="18"/>
                 <w:szCs w:val="18"/>
               </w:rPr>
-              <w:t xml:space="preserve">     </w:t>
-            </w:r>
-            <w:proofErr w:type="spellStart"/>
+              <w:t xml:space="preserve">    Flink Source (Arrow Flight consumer)</w:t>
+            </w:r>
+          </w:p>
+          <w:p>
+            <w:pPr>
+              <w:spacing w:before="20" w:after="20"/>
+            </w:pPr>
             <w:r>
               <w:rPr>
                 <w:rFonts w:ascii="Courier New" w:eastAsia="Courier New" w:hAnsi="Courier New" w:cs="Courier New"/>
@@ -5508,9 +4413,13 @@
                 <w:sz w:val="18"/>
                 <w:szCs w:val="18"/>
               </w:rPr>
-              <w:t>gRPC</w:t>
-            </w:r>
-            <w:proofErr w:type="spellEnd"/>
+              <w:t xml:space="preserve">          │</w:t>
+            </w:r>
+          </w:p>
+          <w:p>
+            <w:pPr>
+              <w:spacing w:before="20" w:after="20"/>
+            </w:pPr>
             <w:r>
               <w:rPr>
                 <w:rFonts w:ascii="Courier New" w:eastAsia="Courier New" w:hAnsi="Courier New" w:cs="Courier New"/>
@@ -5518,7 +4427,7 @@
                 <w:sz w:val="18"/>
                 <w:szCs w:val="18"/>
               </w:rPr>
-              <w:t xml:space="preserve"> / TLS</w:t>
+              <w:t xml:space="preserve">   Flink Pipeline</w:t>
             </w:r>
           </w:p>
           <w:p>
@@ -5532,123 +4441,7 @@
                 <w:sz w:val="18"/>
                 <w:szCs w:val="18"/>
               </w:rPr>
-              <w:t xml:space="preserve">          │</w:t>
-            </w:r>
-          </w:p>
-          <w:p>
-            <w:pPr>
-              <w:spacing w:before="20" w:after="20"/>
-            </w:pPr>
-            <w:r>
-              <w:rPr>
-                <w:rFonts w:ascii="Courier New" w:eastAsia="Courier New" w:hAnsi="Courier New" w:cs="Courier New"/>
-                <w:color w:val="222222"/>
-                <w:sz w:val="18"/>
-                <w:szCs w:val="18"/>
-              </w:rPr>
-              <w:t xml:space="preserve">    </w:t>
-            </w:r>
-            <w:proofErr w:type="spellStart"/>
-            <w:r>
-              <w:rPr>
-                <w:rFonts w:ascii="Courier New" w:eastAsia="Courier New" w:hAnsi="Courier New" w:cs="Courier New"/>
-                <w:color w:val="222222"/>
-                <w:sz w:val="18"/>
-                <w:szCs w:val="18"/>
-              </w:rPr>
-              <w:t>Flink</w:t>
-            </w:r>
-            <w:proofErr w:type="spellEnd"/>
-            <w:r>
-              <w:rPr>
-                <w:rFonts w:ascii="Courier New" w:eastAsia="Courier New" w:hAnsi="Courier New" w:cs="Courier New"/>
-                <w:color w:val="222222"/>
-                <w:sz w:val="18"/>
-                <w:szCs w:val="18"/>
-              </w:rPr>
-              <w:t xml:space="preserve"> Source (Arrow Flight consumer)</w:t>
-            </w:r>
-          </w:p>
-          <w:p>
-            <w:pPr>
-              <w:spacing w:before="20" w:after="20"/>
-            </w:pPr>
-            <w:r>
-              <w:rPr>
-                <w:rFonts w:ascii="Courier New" w:eastAsia="Courier New" w:hAnsi="Courier New" w:cs="Courier New"/>
-                <w:color w:val="222222"/>
-                <w:sz w:val="18"/>
-                <w:szCs w:val="18"/>
-              </w:rPr>
-              <w:t xml:space="preserve">          │</w:t>
-            </w:r>
-          </w:p>
-          <w:p>
-            <w:pPr>
-              <w:spacing w:before="20" w:after="20"/>
-            </w:pPr>
-            <w:r>
-              <w:rPr>
-                <w:rFonts w:ascii="Courier New" w:eastAsia="Courier New" w:hAnsi="Courier New" w:cs="Courier New"/>
-                <w:color w:val="222222"/>
-                <w:sz w:val="18"/>
-                <w:szCs w:val="18"/>
-              </w:rPr>
-              <w:t xml:space="preserve">   </w:t>
-            </w:r>
-            <w:proofErr w:type="spellStart"/>
-            <w:r>
-              <w:rPr>
-                <w:rFonts w:ascii="Courier New" w:eastAsia="Courier New" w:hAnsi="Courier New" w:cs="Courier New"/>
-                <w:color w:val="222222"/>
-                <w:sz w:val="18"/>
-                <w:szCs w:val="18"/>
-              </w:rPr>
-              <w:t>Flink</w:t>
-            </w:r>
-            <w:proofErr w:type="spellEnd"/>
-            <w:r>
-              <w:rPr>
-                <w:rFonts w:ascii="Courier New" w:eastAsia="Courier New" w:hAnsi="Courier New" w:cs="Courier New"/>
-                <w:color w:val="222222"/>
-                <w:sz w:val="18"/>
-                <w:szCs w:val="18"/>
-              </w:rPr>
-              <w:t xml:space="preserve"> Pipeline</w:t>
-            </w:r>
-          </w:p>
-          <w:p>
-            <w:pPr>
-              <w:spacing w:before="20" w:after="20"/>
-            </w:pPr>
-            <w:r>
-              <w:rPr>
-                <w:rFonts w:ascii="Courier New" w:eastAsia="Courier New" w:hAnsi="Courier New" w:cs="Courier New"/>
-                <w:color w:val="222222"/>
-                <w:sz w:val="18"/>
-                <w:szCs w:val="18"/>
-              </w:rPr>
-              <w:t xml:space="preserve"> (</w:t>
-            </w:r>
-            <w:proofErr w:type="gramStart"/>
-            <w:r>
-              <w:rPr>
-                <w:rFonts w:ascii="Courier New" w:eastAsia="Courier New" w:hAnsi="Courier New" w:cs="Courier New"/>
-                <w:color w:val="222222"/>
-                <w:sz w:val="18"/>
-                <w:szCs w:val="18"/>
-              </w:rPr>
-              <w:t>aggregation</w:t>
-            </w:r>
-            <w:proofErr w:type="gramEnd"/>
-            <w:r>
-              <w:rPr>
-                <w:rFonts w:ascii="Courier New" w:eastAsia="Courier New" w:hAnsi="Courier New" w:cs="Courier New"/>
-                <w:color w:val="222222"/>
-                <w:sz w:val="18"/>
-                <w:szCs w:val="18"/>
-              </w:rPr>
-              <w:t>, alerting, routing)</w:t>
+              <w:t xml:space="preserve"> (aggregation, alerting, routing)</w:t>
             </w:r>
           </w:p>
         </w:tc>
@@ -5664,31 +4457,7 @@
         <w:spacing w:after="160"/>
       </w:pPr>
       <w:r>
-        <w:t xml:space="preserve">Each hub database streams change events for subscribed tables continuously. </w:t>
-      </w:r>
-      <w:proofErr w:type="spellStart"/>
-      <w:r>
-        <w:t>Flink</w:t>
-      </w:r>
-      <w:proofErr w:type="spellEnd"/>
-      <w:r>
-        <w:t xml:space="preserve"> connects as a </w:t>
-      </w:r>
-      <w:proofErr w:type="spellStart"/>
-      <w:r>
-        <w:t>gRPC</w:t>
-      </w:r>
-      <w:proofErr w:type="spellEnd"/>
-      <w:r>
-        <w:t xml:space="preserve"> client, receives Arrow record batches containing </w:t>
-      </w:r>
-      <w:proofErr w:type="spellStart"/>
-      <w:r>
-        <w:t>OpenCDC</w:t>
-      </w:r>
-      <w:proofErr w:type="spellEnd"/>
-      <w:r>
-        <w:t xml:space="preserve"> envelopes, and processes them in the pipeline. Each event carries the full before/after image of the changed row, the operation type, a timestamp, and source metadata identifying the hub and table.</w:t>
+        <w:t>Each hub database streams change events for subscribed tables continuously. Flink connects as a gRPC client, receives Arrow record batches containing OpenCDC envelopes, and processes them in the pipeline. Each event carries the full before/after image of the changed row, the operation type, a timestamp, and source metadata identifying the hub and table.</w:t>
       </w:r>
     </w:p>
     <w:p>
@@ -5722,13 +4491,8 @@
         <w:spacing w:before="40" w:after="40"/>
       </w:pPr>
       <w:r>
-        <w:t xml:space="preserve">We are reacting to events, not reconciling </w:t>
-      </w:r>
-      <w:proofErr w:type="gramStart"/>
-      <w:r>
-        <w:t>datasets</w:t>
-      </w:r>
-      <w:proofErr w:type="gramEnd"/>
+        <w:t>We are reacting to events, not reconciling datasets</w:t>
+      </w:r>
     </w:p>
     <w:p>
       <w:pPr>
@@ -5740,13 +4504,8 @@
         <w:spacing w:before="40" w:after="40"/>
       </w:pPr>
       <w:r>
-        <w:t xml:space="preserve">Brief stream gaps during outages are acceptable — we had a gap in real-time awareness, not a data integrity </w:t>
-      </w:r>
-      <w:proofErr w:type="gramStart"/>
-      <w:r>
-        <w:t>failure</w:t>
-      </w:r>
-      <w:proofErr w:type="gramEnd"/>
+        <w:t>Brief stream gaps during outages are acceptable — we had a gap in real-time awareness, not a data integrity failure</w:t>
+      </w:r>
     </w:p>
     <w:p>
       <w:pPr>
@@ -5758,13 +4517,8 @@
         <w:spacing w:before="40" w:after="40"/>
       </w:pPr>
       <w:r>
-        <w:t xml:space="preserve">At-least-once delivery with idempotent downstream handling is sufficient; exactly-once is not </w:t>
-      </w:r>
-      <w:proofErr w:type="gramStart"/>
-      <w:r>
-        <w:t>required</w:t>
-      </w:r>
-      <w:proofErr w:type="gramEnd"/>
+        <w:t>At-least-once delivery with idempotent downstream handling is sufficient; exactly-once is not required</w:t>
+      </w:r>
     </w:p>
     <w:p>
       <w:pPr>
@@ -5776,13 +4530,8 @@
         <w:spacing w:before="40" w:after="40"/>
       </w:pPr>
       <w:r>
-        <w:t xml:space="preserve">We do not need durable replay — on reconnect, we pick up from the current stream </w:t>
-      </w:r>
-      <w:proofErr w:type="gramStart"/>
-      <w:r>
-        <w:t>position</w:t>
-      </w:r>
-      <w:proofErr w:type="gramEnd"/>
+        <w:t>We do not need durable replay — on reconnect, we pick up from the current stream position</w:t>
+      </w:r>
     </w:p>
     <w:p>
       <w:pPr>
@@ -5793,29 +4542,8 @@
       <w:pPr>
         <w:spacing w:after="160"/>
       </w:pPr>
-      <w:proofErr w:type="spellStart"/>
-      <w:r>
-        <w:t>OpenCDC</w:t>
-      </w:r>
-      <w:proofErr w:type="spellEnd"/>
-      <w:r>
-        <w:t xml:space="preserve"> provides the normalization layer across all 10 hubs: every hub emits the same event envelope regardless of local schema variations, Postgres version differences, or regional IT customizations. The </w:t>
-      </w:r>
-      <w:proofErr w:type="spellStart"/>
-      <w:r>
-        <w:t>Flink</w:t>
-      </w:r>
-      <w:proofErr w:type="spellEnd"/>
-      <w:r>
-        <w:t xml:space="preserve"> source connector sees a uniform stream — one pipeline handles all 10 sources. Arrow Flight fits naturally into our existing </w:t>
-      </w:r>
-      <w:proofErr w:type="spellStart"/>
-      <w:r>
-        <w:t>gRPC</w:t>
-      </w:r>
-      <w:proofErr w:type="spellEnd"/>
-      <w:r>
-        <w:t xml:space="preserve"> infrastructure, is secured with TLS, and requires no broker at hub sites.</w:t>
+      <w:r>
+        <w:t>OpenCDC provides the normalization layer across all 10 hubs: every hub emits the same event envelope regardless of local schema variations, Postgres version differences, or regional IT customizations. The Flink source connector sees a uniform stream — one pipeline handles all 10 sources. Arrow Flight fits naturally into our existing gRPC infrastructure, is secured with TLS, and requires no broker at hub sites.</w:t>
       </w:r>
     </w:p>
     <w:p>
@@ -5849,18 +4577,7 @@
           <w:sz w:val="20"/>
           <w:szCs w:val="20"/>
         </w:rPr>
-        <w:t xml:space="preserve">○ Stretch </w:t>
-      </w:r>
-      <w:proofErr w:type="gramStart"/>
-      <w:r>
-        <w:rPr>
-          <w:b/>
-          <w:bCs/>
-          <w:color w:val="8B6914"/>
-          <w:sz w:val="20"/>
-          <w:szCs w:val="20"/>
-        </w:rPr>
-        <w:t>Story</w:t>
+        <w:t>○ Stretch Story</w:t>
       </w:r>
       <w:r>
         <w:rPr>
@@ -5868,16 +4585,7 @@
           <w:sz w:val="20"/>
           <w:szCs w:val="20"/>
         </w:rPr>
-        <w:t xml:space="preserve">  —</w:t>
-      </w:r>
-      <w:proofErr w:type="gramEnd"/>
-      <w:r>
-        <w:rPr>
-          <w:color w:val="595959"/>
-          <w:sz w:val="20"/>
-          <w:szCs w:val="20"/>
-        </w:rPr>
-        <w:t xml:space="preserve">  No CDC tools, no Kafka</w:t>
+        <w:t xml:space="preserve">  —  No CDC tools, no Kafka</w:t>
       </w:r>
     </w:p>
     <w:p>
@@ -5892,25 +4600,7 @@
           <w:iCs/>
           <w:color w:val="333333"/>
         </w:rPr>
-        <w:t xml:space="preserve">As a DBA keeping a few tables in sync between AWS Aurora PostgreSQL and an on-premises SQL Server database, I want the simplest possible setup — ideally without installing or managing separate tools. I want both databases to directly emit and consume </w:t>
-      </w:r>
-      <w:proofErr w:type="spellStart"/>
-      <w:r>
-        <w:rPr>
-          <w:i/>
-          <w:iCs/>
-          <w:color w:val="333333"/>
-        </w:rPr>
-        <w:t>OpenCDC</w:t>
-      </w:r>
-      <w:proofErr w:type="spellEnd"/>
-      <w:r>
-        <w:rPr>
-          <w:i/>
-          <w:iCs/>
-          <w:color w:val="333333"/>
-        </w:rPr>
-        <w:t xml:space="preserve"> change events over a managed messaging service, so that I can maintain near-real-time data consistency without deploying or operating dedicated CDC or streaming infrastructure.</w:t>
+        <w:t>As a DBA keeping a few tables in sync between AWS Aurora PostgreSQL and an on-premises SQL Server database, I want the simplest possible setup — ideally without installing or managing separate tools. I want both databases to directly emit and consume OpenCDC change events over a managed messaging service, so that I can maintain near-real-time data consistency without deploying or operating dedicated CDC or streaming infrastructure.</w:t>
       </w:r>
     </w:p>
     <w:p>
@@ -6047,21 +4737,8 @@
         <w:spacing w:before="40" w:after="40"/>
       </w:pPr>
       <w:r>
-        <w:t>Full CDC tools (</w:t>
-      </w:r>
-      <w:proofErr w:type="spellStart"/>
-      <w:r>
-        <w:t>Debezium</w:t>
-      </w:r>
-      <w:proofErr w:type="spellEnd"/>
-      <w:r>
-        <w:t xml:space="preserve">, GoldenGate) introduce infrastructure, operational overhead, and security review processes the team cannot </w:t>
-      </w:r>
-      <w:proofErr w:type="gramStart"/>
-      <w:r>
-        <w:t>absorb</w:t>
-      </w:r>
-      <w:proofErr w:type="gramEnd"/>
+        <w:t>Full CDC tools (Debezium, GoldenGate) introduce infrastructure, operational overhead, and security review processes the team cannot absorb</w:t>
+      </w:r>
     </w:p>
     <w:p>
       <w:pPr>
@@ -6073,13 +4750,8 @@
         <w:spacing w:before="40" w:after="40"/>
       </w:pPr>
       <w:r>
-        <w:t xml:space="preserve">Kafka or similar platforms are considered too heavyweight for this limited </w:t>
-      </w:r>
-      <w:proofErr w:type="gramStart"/>
-      <w:r>
-        <w:t>scope</w:t>
-      </w:r>
-      <w:proofErr w:type="gramEnd"/>
+        <w:t>Kafka or similar platforms are considered too heavyweight for this limited scope</w:t>
+      </w:r>
     </w:p>
     <w:p>
       <w:pPr>
@@ -6091,13 +4763,8 @@
         <w:spacing w:before="40" w:after="40"/>
       </w:pPr>
       <w:r>
-        <w:t xml:space="preserve">Native database replication is not viable due to cross-vendor incompatibilities and network </w:t>
-      </w:r>
-      <w:proofErr w:type="gramStart"/>
-      <w:r>
-        <w:t>constraints</w:t>
-      </w:r>
-      <w:proofErr w:type="gramEnd"/>
+        <w:t>Native database replication is not viable due to cross-vendor incompatibilities and network constraints</w:t>
+      </w:r>
     </w:p>
     <w:p>
       <w:pPr>
@@ -6109,13 +4776,8 @@
         <w:spacing w:before="40" w:after="40"/>
       </w:pPr>
       <w:r>
-        <w:t xml:space="preserve">The team is willing to use a managed messaging service (AWS SQS/SNS, Azure Service Bus, or an MQ-compatible system), but does not want to build custom event formats or transformation </w:t>
-      </w:r>
-      <w:proofErr w:type="gramStart"/>
-      <w:r>
-        <w:t>logic</w:t>
-      </w:r>
-      <w:proofErr w:type="gramEnd"/>
+        <w:t>The team is willing to use a managed messaging service (AWS SQS/SNS, Azure Service Bus, or an MQ-compatible system), but does not want to build custom event formats or transformation logic</w:t>
+      </w:r>
     </w:p>
     <w:p>
       <w:pPr>
@@ -6127,15 +4789,7 @@
         <w:pStyle w:val="Heading2"/>
       </w:pPr>
       <w:r>
-        <w:t xml:space="preserve">The </w:t>
-      </w:r>
-      <w:proofErr w:type="spellStart"/>
-      <w:r>
-        <w:t>OpenCDC</w:t>
-      </w:r>
-      <w:proofErr w:type="spellEnd"/>
-      <w:r>
-        <w:t xml:space="preserve"> Approach</w:t>
+        <w:t>The OpenCDC Approach</w:t>
       </w:r>
     </w:p>
     <w:p>
@@ -6156,21 +4810,8 @@
         <w:spacing w:before="40" w:after="40"/>
       </w:pPr>
       <w:r>
-        <w:t xml:space="preserve">Emit change events in </w:t>
-      </w:r>
-      <w:proofErr w:type="spellStart"/>
-      <w:r>
-        <w:t>OpenCDC</w:t>
-      </w:r>
-      <w:proofErr w:type="spellEnd"/>
-      <w:r>
-        <w:t xml:space="preserve"> format directly from transaction logs or </w:t>
-      </w:r>
-      <w:proofErr w:type="gramStart"/>
-      <w:r>
-        <w:t>triggers</w:t>
-      </w:r>
-      <w:proofErr w:type="gramEnd"/>
+        <w:t>Emit change events in OpenCDC format directly from transaction logs or triggers</w:t>
+      </w:r>
     </w:p>
     <w:p>
       <w:pPr>
@@ -6182,13 +4823,8 @@
         <w:spacing w:before="40" w:after="40"/>
       </w:pPr>
       <w:r>
-        <w:t xml:space="preserve">Publish those events to a managed messaging </w:t>
-      </w:r>
-      <w:proofErr w:type="gramStart"/>
-      <w:r>
-        <w:t>service</w:t>
-      </w:r>
-      <w:proofErr w:type="gramEnd"/>
+        <w:t>Publish those events to a managed messaging service</w:t>
+      </w:r>
     </w:p>
     <w:p>
       <w:pPr>
@@ -6201,21 +4837,8 @@
       </w:pPr>
       <w:r>
         <w:lastRenderedPageBreak/>
-        <w:t xml:space="preserve">Subscribe to the same channel and apply incoming </w:t>
-      </w:r>
-      <w:proofErr w:type="spellStart"/>
-      <w:r>
-        <w:t>OpenCDC</w:t>
-      </w:r>
-      <w:proofErr w:type="spellEnd"/>
-      <w:r>
-        <w:t xml:space="preserve"> events to local </w:t>
-      </w:r>
-      <w:proofErr w:type="gramStart"/>
-      <w:r>
-        <w:t>tables</w:t>
-      </w:r>
-      <w:proofErr w:type="gramEnd"/>
+        <w:t>Subscribe to the same channel and apply incoming OpenCDC events to local tables</w:t>
+      </w:r>
     </w:p>
     <w:p>
       <w:pPr>
@@ -6240,15 +4863,7 @@
         <w:pStyle w:val="Heading2"/>
       </w:pPr>
       <w:r>
-        <w:t xml:space="preserve">Why </w:t>
-      </w:r>
-      <w:proofErr w:type="spellStart"/>
-      <w:r>
-        <w:t>OpenCDC</w:t>
-      </w:r>
-      <w:proofErr w:type="spellEnd"/>
-      <w:r>
-        <w:t xml:space="preserve"> Is the Critical Enabler</w:t>
+        <w:t>Why OpenCDC Is the Critical Enabler</w:t>
       </w:r>
     </w:p>
     <w:p>
@@ -6268,13 +4883,8 @@
       <w:pPr>
         <w:spacing w:after="160"/>
       </w:pPr>
-      <w:proofErr w:type="spellStart"/>
-      <w:r>
-        <w:t>OpenCDC</w:t>
-      </w:r>
-      <w:proofErr w:type="spellEnd"/>
-      <w:r>
-        <w:t xml:space="preserve"> eliminates these challenges through:</w:t>
+      <w:r>
+        <w:t>OpenCDC eliminates these challenges through:</w:t>
       </w:r>
     </w:p>
     <w:p>
@@ -6314,15 +4924,7 @@
         <w:t xml:space="preserve">Consistent operation semantics. </w:t>
       </w:r>
       <w:r>
-        <w:t xml:space="preserve">INSERT, UPDATE, DELETE </w:t>
-      </w:r>
-      <w:proofErr w:type="gramStart"/>
-      <w:r>
-        <w:t>are</w:t>
-      </w:r>
-      <w:proofErr w:type="gramEnd"/>
-      <w:r>
-        <w:t xml:space="preserve"> represented identically across both engines.</w:t>
+        <w:t>INSERT, UPDATE, DELETE are represented identically across both engines.</w:t>
       </w:r>
     </w:p>
     <w:p>
@@ -6375,15 +4977,7 @@
         <w:spacing w:after="160"/>
       </w:pPr>
       <w:r>
-        <w:t xml:space="preserve">Because </w:t>
-      </w:r>
-      <w:proofErr w:type="spellStart"/>
-      <w:r>
-        <w:t>OpenCDC</w:t>
-      </w:r>
-      <w:proofErr w:type="spellEnd"/>
-      <w:r>
-        <w:t xml:space="preserve"> is transport-agnostic, the DBA team can use whatever managed messaging service fits their environment without affecting payload compatibility.</w:t>
+        <w:t>Because OpenCDC is transport-agnostic, the DBA team can use whatever managed messaging service fits their environment without affecting payload compatibility.</w:t>
       </w:r>
     </w:p>
     <w:p>
@@ -6423,21 +5017,8 @@
       <w:pPr>
         <w:spacing w:after="160"/>
       </w:pPr>
-      <w:proofErr w:type="spellStart"/>
-      <w:r>
-        <w:t>OpenCDC’s</w:t>
-      </w:r>
-      <w:proofErr w:type="spellEnd"/>
-      <w:r>
-        <w:t xml:space="preserve"> source metadata — specifically the originating system identifier in the event envelope — provides the mechanism for loop detection. Each database’s consumer must be configured to suppress re-emission of events whose source identifier matches its own. The exact implementation of this filter is expected to be addressed in the </w:t>
-      </w:r>
-      <w:proofErr w:type="spellStart"/>
-      <w:r>
-        <w:t>OpenCDC</w:t>
-      </w:r>
-      <w:proofErr w:type="spellEnd"/>
-      <w:r>
-        <w:t xml:space="preserve"> specification.</w:t>
+      <w:r>
+        <w:t>OpenCDC’s source metadata — specifically the originating system identifier in the event envelope — provides the mechanism for loop detection. Each database’s consumer must be configured to suppress re-emission of events whose source identifier matches its own. The exact implementation of this filter is expected to be addressed in the OpenCDC specification.</w:t>
       </w:r>
     </w:p>
     <w:p>
@@ -6861,95 +5442,9 @@
     </w:lvl>
   </w:abstractNum>
   <w:abstractNum w:abstractNumId="2" w15:restartNumberingAfterBreak="0">
-    <w:nsid w:val="4C052247"/>
+    <w:nsid w:val="0FFD1F7A"/>
     <w:multiLevelType w:val="hybridMultilevel"/>
-    <w:tmpl w:val="75EE8EF4"/>
-    <w:lvl w:ilvl="0" w:tplc="B4C8D3EC">
-      <w:start w:val="1"/>
-      <w:numFmt w:val="bullet"/>
-      <w:lvlText w:val="●"/>
-      <w:lvlJc w:val="left"/>
-      <w:pPr>
-        <w:ind w:left="720" w:hanging="360"/>
-      </w:pPr>
-    </w:lvl>
-    <w:lvl w:ilvl="1" w:tplc="C3702380">
-      <w:start w:val="1"/>
-      <w:numFmt w:val="bullet"/>
-      <w:lvlText w:val="○"/>
-      <w:lvlJc w:val="left"/>
-      <w:pPr>
-        <w:ind w:left="1440" w:hanging="360"/>
-      </w:pPr>
-    </w:lvl>
-    <w:lvl w:ilvl="2" w:tplc="3F02B984">
-      <w:start w:val="1"/>
-      <w:numFmt w:val="bullet"/>
-      <w:lvlText w:val="■"/>
-      <w:lvlJc w:val="left"/>
-      <w:pPr>
-        <w:ind w:left="2160" w:hanging="360"/>
-      </w:pPr>
-    </w:lvl>
-    <w:lvl w:ilvl="3" w:tplc="77AC6DDA">
-      <w:start w:val="1"/>
-      <w:numFmt w:val="bullet"/>
-      <w:lvlText w:val="●"/>
-      <w:lvlJc w:val="left"/>
-      <w:pPr>
-        <w:ind w:left="2880" w:hanging="360"/>
-      </w:pPr>
-    </w:lvl>
-    <w:lvl w:ilvl="4" w:tplc="CEB214E2">
-      <w:start w:val="1"/>
-      <w:numFmt w:val="bullet"/>
-      <w:lvlText w:val="○"/>
-      <w:lvlJc w:val="left"/>
-      <w:pPr>
-        <w:ind w:left="3600" w:hanging="360"/>
-      </w:pPr>
-    </w:lvl>
-    <w:lvl w:ilvl="5" w:tplc="7DA8F70C">
-      <w:start w:val="1"/>
-      <w:numFmt w:val="bullet"/>
-      <w:lvlText w:val="■"/>
-      <w:lvlJc w:val="left"/>
-      <w:pPr>
-        <w:ind w:left="4320" w:hanging="360"/>
-      </w:pPr>
-    </w:lvl>
-    <w:lvl w:ilvl="6" w:tplc="4B72EC70">
-      <w:start w:val="1"/>
-      <w:numFmt w:val="bullet"/>
-      <w:lvlText w:val="●"/>
-      <w:lvlJc w:val="left"/>
-      <w:pPr>
-        <w:ind w:left="5040" w:hanging="360"/>
-      </w:pPr>
-    </w:lvl>
-    <w:lvl w:ilvl="7" w:tplc="31668B02">
-      <w:start w:val="1"/>
-      <w:numFmt w:val="bullet"/>
-      <w:lvlText w:val="●"/>
-      <w:lvlJc w:val="left"/>
-      <w:pPr>
-        <w:ind w:left="5760" w:hanging="360"/>
-      </w:pPr>
-    </w:lvl>
-    <w:lvl w:ilvl="8" w:tplc="62C46CAA">
-      <w:start w:val="1"/>
-      <w:numFmt w:val="bullet"/>
-      <w:lvlText w:val="●"/>
-      <w:lvlJc w:val="left"/>
-      <w:pPr>
-        <w:ind w:left="6480" w:hanging="360"/>
-      </w:pPr>
-    </w:lvl>
-  </w:abstractNum>
-  <w:abstractNum w:abstractNumId="3" w15:restartNumberingAfterBreak="0">
-    <w:nsid w:val="5F3F3BDF"/>
-    <w:multiLevelType w:val="hybridMultilevel"/>
-    <w:tmpl w:val="3F7A8D0C"/>
+    <w:tmpl w:val="A2DEB528"/>
     <w:lvl w:ilvl="0" w:tplc="04090001">
       <w:start w:val="1"/>
       <w:numFmt w:val="bullet"/>
@@ -7059,7 +5554,206 @@
       </w:rPr>
     </w:lvl>
   </w:abstractNum>
+  <w:abstractNum w:abstractNumId="3" w15:restartNumberingAfterBreak="0">
+    <w:nsid w:val="4C052247"/>
+    <w:multiLevelType w:val="hybridMultilevel"/>
+    <w:tmpl w:val="75EE8EF4"/>
+    <w:lvl w:ilvl="0" w:tplc="B4C8D3EC">
+      <w:start w:val="1"/>
+      <w:numFmt w:val="bullet"/>
+      <w:lvlText w:val="●"/>
+      <w:lvlJc w:val="left"/>
+      <w:pPr>
+        <w:ind w:left="720" w:hanging="360"/>
+      </w:pPr>
+    </w:lvl>
+    <w:lvl w:ilvl="1" w:tplc="C3702380">
+      <w:start w:val="1"/>
+      <w:numFmt w:val="bullet"/>
+      <w:lvlText w:val="○"/>
+      <w:lvlJc w:val="left"/>
+      <w:pPr>
+        <w:ind w:left="1440" w:hanging="360"/>
+      </w:pPr>
+    </w:lvl>
+    <w:lvl w:ilvl="2" w:tplc="3F02B984">
+      <w:start w:val="1"/>
+      <w:numFmt w:val="bullet"/>
+      <w:lvlText w:val="■"/>
+      <w:lvlJc w:val="left"/>
+      <w:pPr>
+        <w:ind w:left="2160" w:hanging="360"/>
+      </w:pPr>
+    </w:lvl>
+    <w:lvl w:ilvl="3" w:tplc="77AC6DDA">
+      <w:start w:val="1"/>
+      <w:numFmt w:val="bullet"/>
+      <w:lvlText w:val="●"/>
+      <w:lvlJc w:val="left"/>
+      <w:pPr>
+        <w:ind w:left="2880" w:hanging="360"/>
+      </w:pPr>
+    </w:lvl>
+    <w:lvl w:ilvl="4" w:tplc="CEB214E2">
+      <w:start w:val="1"/>
+      <w:numFmt w:val="bullet"/>
+      <w:lvlText w:val="○"/>
+      <w:lvlJc w:val="left"/>
+      <w:pPr>
+        <w:ind w:left="3600" w:hanging="360"/>
+      </w:pPr>
+    </w:lvl>
+    <w:lvl w:ilvl="5" w:tplc="7DA8F70C">
+      <w:start w:val="1"/>
+      <w:numFmt w:val="bullet"/>
+      <w:lvlText w:val="■"/>
+      <w:lvlJc w:val="left"/>
+      <w:pPr>
+        <w:ind w:left="4320" w:hanging="360"/>
+      </w:pPr>
+    </w:lvl>
+    <w:lvl w:ilvl="6" w:tplc="4B72EC70">
+      <w:start w:val="1"/>
+      <w:numFmt w:val="bullet"/>
+      <w:lvlText w:val="●"/>
+      <w:lvlJc w:val="left"/>
+      <w:pPr>
+        <w:ind w:left="5040" w:hanging="360"/>
+      </w:pPr>
+    </w:lvl>
+    <w:lvl w:ilvl="7" w:tplc="31668B02">
+      <w:start w:val="1"/>
+      <w:numFmt w:val="bullet"/>
+      <w:lvlText w:val="●"/>
+      <w:lvlJc w:val="left"/>
+      <w:pPr>
+        <w:ind w:left="5760" w:hanging="360"/>
+      </w:pPr>
+    </w:lvl>
+    <w:lvl w:ilvl="8" w:tplc="62C46CAA">
+      <w:start w:val="1"/>
+      <w:numFmt w:val="bullet"/>
+      <w:lvlText w:val="●"/>
+      <w:lvlJc w:val="left"/>
+      <w:pPr>
+        <w:ind w:left="6480" w:hanging="360"/>
+      </w:pPr>
+    </w:lvl>
+  </w:abstractNum>
   <w:abstractNum w:abstractNumId="4" w15:restartNumberingAfterBreak="0">
+    <w:nsid w:val="5F3F3BDF"/>
+    <w:multiLevelType w:val="hybridMultilevel"/>
+    <w:tmpl w:val="3F7A8D0C"/>
+    <w:lvl w:ilvl="0" w:tplc="04090001">
+      <w:start w:val="1"/>
+      <w:numFmt w:val="bullet"/>
+      <w:lvlText w:val=""/>
+      <w:lvlJc w:val="left"/>
+      <w:pPr>
+        <w:ind w:left="720" w:hanging="360"/>
+      </w:pPr>
+      <w:rPr>
+        <w:rFonts w:ascii="Symbol" w:hAnsi="Symbol" w:hint="default"/>
+      </w:rPr>
+    </w:lvl>
+    <w:lvl w:ilvl="1" w:tplc="04090003" w:tentative="1">
+      <w:start w:val="1"/>
+      <w:numFmt w:val="bullet"/>
+      <w:lvlText w:val="o"/>
+      <w:lvlJc w:val="left"/>
+      <w:pPr>
+        <w:ind w:left="1440" w:hanging="360"/>
+      </w:pPr>
+      <w:rPr>
+        <w:rFonts w:ascii="Courier New" w:hAnsi="Courier New" w:cs="Courier New" w:hint="default"/>
+      </w:rPr>
+    </w:lvl>
+    <w:lvl w:ilvl="2" w:tplc="04090005" w:tentative="1">
+      <w:start w:val="1"/>
+      <w:numFmt w:val="bullet"/>
+      <w:lvlText w:val=""/>
+      <w:lvlJc w:val="left"/>
+      <w:pPr>
+        <w:ind w:left="2160" w:hanging="360"/>
+      </w:pPr>
+      <w:rPr>
+        <w:rFonts w:ascii="Wingdings" w:hAnsi="Wingdings" w:hint="default"/>
+      </w:rPr>
+    </w:lvl>
+    <w:lvl w:ilvl="3" w:tplc="04090001" w:tentative="1">
+      <w:start w:val="1"/>
+      <w:numFmt w:val="bullet"/>
+      <w:lvlText w:val=""/>
+      <w:lvlJc w:val="left"/>
+      <w:pPr>
+        <w:ind w:left="2880" w:hanging="360"/>
+      </w:pPr>
+      <w:rPr>
+        <w:rFonts w:ascii="Symbol" w:hAnsi="Symbol" w:hint="default"/>
+      </w:rPr>
+    </w:lvl>
+    <w:lvl w:ilvl="4" w:tplc="04090003" w:tentative="1">
+      <w:start w:val="1"/>
+      <w:numFmt w:val="bullet"/>
+      <w:lvlText w:val="o"/>
+      <w:lvlJc w:val="left"/>
+      <w:pPr>
+        <w:ind w:left="3600" w:hanging="360"/>
+      </w:pPr>
+      <w:rPr>
+        <w:rFonts w:ascii="Courier New" w:hAnsi="Courier New" w:cs="Courier New" w:hint="default"/>
+      </w:rPr>
+    </w:lvl>
+    <w:lvl w:ilvl="5" w:tplc="04090005" w:tentative="1">
+      <w:start w:val="1"/>
+      <w:numFmt w:val="bullet"/>
+      <w:lvlText w:val=""/>
+      <w:lvlJc w:val="left"/>
+      <w:pPr>
+        <w:ind w:left="4320" w:hanging="360"/>
+      </w:pPr>
+      <w:rPr>
+        <w:rFonts w:ascii="Wingdings" w:hAnsi="Wingdings" w:hint="default"/>
+      </w:rPr>
+    </w:lvl>
+    <w:lvl w:ilvl="6" w:tplc="04090001" w:tentative="1">
+      <w:start w:val="1"/>
+      <w:numFmt w:val="bullet"/>
+      <w:lvlText w:val=""/>
+      <w:lvlJc w:val="left"/>
+      <w:pPr>
+        <w:ind w:left="5040" w:hanging="360"/>
+      </w:pPr>
+      <w:rPr>
+        <w:rFonts w:ascii="Symbol" w:hAnsi="Symbol" w:hint="default"/>
+      </w:rPr>
+    </w:lvl>
+    <w:lvl w:ilvl="7" w:tplc="04090003" w:tentative="1">
+      <w:start w:val="1"/>
+      <w:numFmt w:val="bullet"/>
+      <w:lvlText w:val="o"/>
+      <w:lvlJc w:val="left"/>
+      <w:pPr>
+        <w:ind w:left="5760" w:hanging="360"/>
+      </w:pPr>
+      <w:rPr>
+        <w:rFonts w:ascii="Courier New" w:hAnsi="Courier New" w:cs="Courier New" w:hint="default"/>
+      </w:rPr>
+    </w:lvl>
+    <w:lvl w:ilvl="8" w:tplc="04090005" w:tentative="1">
+      <w:start w:val="1"/>
+      <w:numFmt w:val="bullet"/>
+      <w:lvlText w:val=""/>
+      <w:lvlJc w:val="left"/>
+      <w:pPr>
+        <w:ind w:left="6480" w:hanging="360"/>
+      </w:pPr>
+      <w:rPr>
+        <w:rFonts w:ascii="Wingdings" w:hAnsi="Wingdings" w:hint="default"/>
+      </w:rPr>
+    </w:lvl>
+  </w:abstractNum>
+  <w:abstractNum w:abstractNumId="5" w15:restartNumberingAfterBreak="0">
     <w:nsid w:val="76382723"/>
     <w:multiLevelType w:val="hybridMultilevel"/>
     <w:tmpl w:val="4B882634"/>
@@ -7117,7 +5811,7 @@
       <w:lvlJc w:val="left"/>
     </w:lvl>
   </w:abstractNum>
-  <w:abstractNum w:abstractNumId="5" w15:restartNumberingAfterBreak="0">
+  <w:abstractNum w:abstractNumId="6" w15:restartNumberingAfterBreak="0">
     <w:nsid w:val="7AF14E41"/>
     <w:multiLevelType w:val="hybridMultilevel"/>
     <w:tmpl w:val="B8682482"/>
@@ -7231,28 +5925,31 @@
     </w:lvl>
   </w:abstractNum>
   <w:num w:numId="1" w16cid:durableId="1870529823">
-    <w:abstractNumId w:val="2"/>
+    <w:abstractNumId w:val="3"/>
     <w:lvlOverride w:ilvl="0">
       <w:startOverride w:val="1"/>
     </w:lvlOverride>
   </w:num>
   <w:num w:numId="2" w16cid:durableId="1528717735">
-    <w:abstractNumId w:val="4"/>
+    <w:abstractNumId w:val="5"/>
     <w:lvlOverride w:ilvl="0">
       <w:startOverride w:val="1"/>
     </w:lvlOverride>
   </w:num>
   <w:num w:numId="3" w16cid:durableId="2040233514">
-    <w:abstractNumId w:val="3"/>
+    <w:abstractNumId w:val="4"/>
   </w:num>
   <w:num w:numId="4" w16cid:durableId="510527798">
     <w:abstractNumId w:val="0"/>
   </w:num>
   <w:num w:numId="5" w16cid:durableId="1822577819">
-    <w:abstractNumId w:val="5"/>
+    <w:abstractNumId w:val="6"/>
   </w:num>
   <w:num w:numId="6" w16cid:durableId="252323955">
     <w:abstractNumId w:val="1"/>
+  </w:num>
+  <w:num w:numId="7" w16cid:durableId="1596599005">
+    <w:abstractNumId w:val="2"/>
   </w:num>
 </w:numbering>
 </file>

</xml_diff>